<commit_message>
edit: cleaned up the repository and made the .py and .R scripts automatically callable following the README.md.
</commit_message>
<xml_diff>
--- a/report/report_current.docx
+++ b/report/report_current.docx
@@ -350,7 +350,21 @@
           <w:sz w:val="20"/>
           <w:szCs w:val="20"/>
         </w:rPr>
-        <w:t xml:space="preserve">Hence, in current setting DP and RL have not improved the </w:t>
+        <w:t xml:space="preserve">Hence, in current setting DP and </w:t>
+      </w:r>
+      <w:r>
+        <w:rPr>
+          <w:sz w:val="20"/>
+          <w:szCs w:val="20"/>
+        </w:rPr>
+        <w:t>TD</w:t>
+      </w:r>
+      <w:r>
+        <w:rPr>
+          <w:sz w:val="20"/>
+          <w:szCs w:val="20"/>
+        </w:rPr>
+        <w:t xml:space="preserve"> have not improved the </w:t>
       </w:r>
       <w:r>
         <w:rPr>
@@ -406,14 +420,27 @@
     </w:p>
     <w:p>
       <w:pPr>
-        <w:pStyle w:val="Heading1"/>
-      </w:pPr>
-      <w:r>
-        <w:t>Introduction</w:t>
+        <w:rPr>
+          <w:rFonts w:asciiTheme="majorHAnsi" w:eastAsiaTheme="majorEastAsia" w:hAnsiTheme="majorHAnsi" w:cstheme="majorBidi"/>
+          <w:color w:val="0F4761" w:themeColor="accent1" w:themeShade="BF"/>
+          <w:sz w:val="40"/>
+          <w:szCs w:val="40"/>
+        </w:rPr>
+      </w:pPr>
+      <w:r>
+        <w:br w:type="page"/>
       </w:r>
     </w:p>
     <w:p>
       <w:pPr>
+        <w:pStyle w:val="Heading1"/>
+      </w:pPr>
+      <w:r>
+        <w:t>Introduction</w:t>
+      </w:r>
+    </w:p>
+    <w:p>
+      <w:pPr>
         <w:spacing w:after="0"/>
         <w:jc w:val="both"/>
         <w:rPr>
@@ -433,7 +460,21 @@
           <w:sz w:val="20"/>
           <w:szCs w:val="20"/>
         </w:rPr>
-        <w:t>units. This preference is called Least Expiratory First Out (</w:t>
+        <w:t xml:space="preserve">units. This preference is called </w:t>
+      </w:r>
+      <w:r>
+        <w:rPr>
+          <w:sz w:val="20"/>
+          <w:szCs w:val="20"/>
+        </w:rPr>
+        <w:t>Last</w:t>
+      </w:r>
+      <w:r>
+        <w:rPr>
+          <w:sz w:val="20"/>
+          <w:szCs w:val="20"/>
+        </w:rPr>
+        <w:t xml:space="preserve"> Expiratory First Out (</w:t>
       </w:r>
       <w:r>
         <w:rPr>
@@ -815,72 +856,186 @@
           <w:sz w:val="20"/>
           <w:szCs w:val="20"/>
         </w:rPr>
-        <w:t xml:space="preserve">The main question </w:t>
-      </w:r>
-      <w:r>
-        <w:rPr>
-          <w:sz w:val="20"/>
-          <w:szCs w:val="20"/>
-        </w:rPr>
-        <w:t xml:space="preserve">remains </w:t>
-      </w:r>
-      <w:r>
-        <w:rPr>
-          <w:sz w:val="20"/>
-          <w:szCs w:val="20"/>
-        </w:rPr>
-        <w:t>whether dynamically pricing the products or choosing a fixed discount is the better option.</w:t>
-      </w:r>
-      <w:r>
-        <w:rPr>
-          <w:sz w:val="20"/>
-          <w:szCs w:val="20"/>
-        </w:rPr>
-        <w:t xml:space="preserve"> </w:t>
-      </w:r>
-      <w:r>
-        <w:rPr>
-          <w:sz w:val="20"/>
-          <w:szCs w:val="20"/>
-        </w:rPr>
-        <w:t xml:space="preserve">In order to find that answer, the deficits if each model will be mapped out as well. Hence, each model is </w:t>
-      </w:r>
-      <w:r>
-        <w:rPr>
-          <w:sz w:val="20"/>
-          <w:szCs w:val="20"/>
-        </w:rPr>
-        <w:t xml:space="preserve">evaluated individually to determine which is best. </w:t>
-      </w:r>
-      <w:r>
-        <w:rPr>
-          <w:sz w:val="20"/>
-          <w:szCs w:val="20"/>
-        </w:rPr>
-        <w:t xml:space="preserve">Besides waste reduction and profit improvement, computational time is an important factor here. </w:t>
-      </w:r>
-      <w:r>
-        <w:rPr>
-          <w:sz w:val="20"/>
-          <w:szCs w:val="20"/>
-        </w:rPr>
-        <w:t xml:space="preserve">Ultimately, this research could improve the </w:t>
-      </w:r>
+        <w:t>The main research question of this study is:</w:t>
+      </w:r>
+    </w:p>
+    <w:p>
+      <w:pPr>
+        <w:jc w:val="both"/>
+        <w:rPr>
+          <w:i/>
+          <w:sz w:val="20"/>
+          <w:szCs w:val="20"/>
+          <w:lang w:val="en-US"/>
+        </w:rPr>
+      </w:pPr>
       <w:r>
         <w:rPr>
           <w:i/>
           <w:iCs/>
           <w:sz w:val="20"/>
           <w:szCs w:val="20"/>
-        </w:rPr>
-        <w:t>status quo</w:t>
-      </w:r>
-      <w:r>
-        <w:rPr>
-          <w:sz w:val="20"/>
-          <w:szCs w:val="20"/>
-        </w:rPr>
-        <w:t xml:space="preserve"> that is either not setting a discount, or using a fixed discount for the oldest products in the assortment. </w:t>
+          <w:lang w:val="en-US"/>
+        </w:rPr>
+        <w:t>What are the profit and waste benefits if expiratory products are dynamically priced, compared to a fixed discount?</w:t>
+      </w:r>
+    </w:p>
+    <w:p>
+      <w:pPr>
+        <w:jc w:val="both"/>
+        <w:rPr>
+          <w:sz w:val="20"/>
+          <w:szCs w:val="20"/>
+          <w:lang w:val="en-US"/>
+        </w:rPr>
+      </w:pPr>
+      <w:r>
+        <w:rPr>
+          <w:sz w:val="20"/>
+          <w:szCs w:val="20"/>
+          <w:lang w:val="en-US"/>
+        </w:rPr>
+        <w:tab/>
+        <w:t>To answer this question</w:t>
+      </w:r>
+      <w:r>
+        <w:rPr>
+          <w:sz w:val="20"/>
+          <w:szCs w:val="20"/>
+          <w:lang w:val="en-US"/>
+        </w:rPr>
+        <w:t xml:space="preserve"> </w:t>
+      </w:r>
+      <w:r>
+        <w:rPr>
+          <w:sz w:val="20"/>
+          <w:szCs w:val="20"/>
+          <w:lang w:val="en-US"/>
+        </w:rPr>
+        <w:t>three</w:t>
+      </w:r>
+      <w:r>
+        <w:rPr>
+          <w:sz w:val="20"/>
+          <w:szCs w:val="20"/>
+          <w:lang w:val="en-US"/>
+        </w:rPr>
+        <w:t xml:space="preserve"> approaches </w:t>
+      </w:r>
+      <w:r>
+        <w:rPr>
+          <w:sz w:val="20"/>
+          <w:szCs w:val="20"/>
+          <w:lang w:val="en-US"/>
+        </w:rPr>
+        <w:t>are evaluated and directly compared</w:t>
+      </w:r>
+      <w:r>
+        <w:rPr>
+          <w:sz w:val="20"/>
+          <w:szCs w:val="20"/>
+          <w:lang w:val="en-US"/>
+        </w:rPr>
+        <w:t>: FDC, DP and TD. This comparison raises two sub-questions</w:t>
+      </w:r>
+      <w:r>
+        <w:rPr>
+          <w:sz w:val="20"/>
+          <w:szCs w:val="20"/>
+          <w:lang w:val="en-US"/>
+        </w:rPr>
+        <w:t>:</w:t>
+      </w:r>
+    </w:p>
+    <w:p>
+      <w:pPr>
+        <w:pStyle w:val="ListParagraph"/>
+        <w:numPr>
+          <w:ilvl w:val="0"/>
+          <w:numId w:val="1"/>
+        </w:numPr>
+        <w:jc w:val="both"/>
+        <w:rPr>
+          <w:i/>
+          <w:iCs/>
+          <w:sz w:val="20"/>
+          <w:szCs w:val="20"/>
+        </w:rPr>
+      </w:pPr>
+      <w:r>
+        <w:rPr>
+          <w:i/>
+          <w:iCs/>
+          <w:sz w:val="20"/>
+          <w:szCs w:val="20"/>
+        </w:rPr>
+        <w:t>D</w:t>
+      </w:r>
+      <w:r>
+        <w:rPr>
+          <w:i/>
+          <w:iCs/>
+          <w:sz w:val="20"/>
+          <w:szCs w:val="20"/>
+        </w:rPr>
+        <w:t>oes any model produce a statistically and practically meaningful improvement in profit and waste reduction over FDC</w:t>
+      </w:r>
+      <w:r>
+        <w:rPr>
+          <w:i/>
+          <w:iCs/>
+          <w:sz w:val="20"/>
+          <w:szCs w:val="20"/>
+        </w:rPr>
+        <w:t>?</w:t>
+      </w:r>
+    </w:p>
+    <w:p>
+      <w:pPr>
+        <w:pStyle w:val="ListParagraph"/>
+        <w:numPr>
+          <w:ilvl w:val="0"/>
+          <w:numId w:val="1"/>
+        </w:numPr>
+        <w:jc w:val="both"/>
+        <w:rPr>
+          <w:i/>
+          <w:iCs/>
+          <w:sz w:val="20"/>
+          <w:szCs w:val="20"/>
+          <w:lang w:val="en-US"/>
+        </w:rPr>
+      </w:pPr>
+      <w:r>
+        <w:rPr>
+          <w:i/>
+          <w:iCs/>
+          <w:sz w:val="20"/>
+          <w:szCs w:val="20"/>
+        </w:rPr>
+        <w:t>Among m</w:t>
+      </w:r>
+      <w:r>
+        <w:rPr>
+          <w:i/>
+          <w:iCs/>
+          <w:sz w:val="20"/>
+          <w:szCs w:val="20"/>
+        </w:rPr>
+        <w:t>odels that derive comparable policies, which is preferable once computational time is taken into account?</w:t>
+      </w:r>
+    </w:p>
+    <w:p>
+      <w:pPr>
+        <w:rPr>
+          <w:rFonts w:asciiTheme="majorHAnsi" w:eastAsiaTheme="majorEastAsia" w:hAnsiTheme="majorHAnsi" w:cstheme="majorBidi"/>
+          <w:color w:val="0F4761" w:themeColor="accent1" w:themeShade="BF"/>
+          <w:sz w:val="40"/>
+          <w:szCs w:val="40"/>
+        </w:rPr>
+      </w:pPr>
+      <w:r>
+        <w:br w:type="page"/>
       </w:r>
     </w:p>
     <w:p>
@@ -2701,15 +2856,15 @@
           <w:sz w:val="20"/>
           <w:szCs w:val="20"/>
         </w:rPr>
-        <w:t xml:space="preserve">algorithms </w:t>
-      </w:r>
-      <w:r>
-        <w:rPr>
-          <w:rFonts w:ascii="Aptos" w:eastAsia="Aptos" w:hAnsi="Aptos" w:cs="Aptos"/>
-          <w:sz w:val="20"/>
-          <w:szCs w:val="20"/>
-        </w:rPr>
-        <w:t xml:space="preserve">learns a </w:t>
+        <w:t>algorithms</w:t>
+      </w:r>
+      <w:r>
+        <w:rPr>
+          <w:rFonts w:ascii="Aptos" w:eastAsia="Aptos" w:hAnsi="Aptos" w:cs="Aptos"/>
+          <w:sz w:val="20"/>
+          <w:szCs w:val="20"/>
+        </w:rPr>
+        <w:t xml:space="preserve"> learns a </w:t>
       </w:r>
       <w:r>
         <w:rPr>
@@ -2741,15 +2896,15 @@
           <w:sz w:val="20"/>
           <w:szCs w:val="20"/>
         </w:rPr>
-        <w:t xml:space="preserve"> As a </w:t>
-      </w:r>
-      <w:r>
-        <w:rPr>
-          <w:rFonts w:ascii="Aptos" w:eastAsia="Aptos" w:hAnsi="Aptos" w:cs="Aptos"/>
-          <w:sz w:val="20"/>
-          <w:szCs w:val="20"/>
-        </w:rPr>
-        <w:t>consequence,</w:t>
+        <w:t xml:space="preserve"> As a consequence</w:t>
+      </w:r>
+      <w:r>
+        <w:rPr>
+          <w:rFonts w:ascii="Aptos" w:eastAsia="Aptos" w:hAnsi="Aptos" w:cs="Aptos"/>
+          <w:sz w:val="20"/>
+          <w:szCs w:val="20"/>
+        </w:rPr>
+        <w:t>,</w:t>
       </w:r>
       <w:r>
         <w:rPr>
@@ -2773,25 +2928,49 @@
           <w:sz w:val="20"/>
           <w:szCs w:val="20"/>
         </w:rPr>
-        <w:t xml:space="preserve"> does not guarantee convergence to the optimal policy the way that DP does, but it scales better as the number of inventory states (</w:t>
-      </w:r>
-      <w:proofErr w:type="spellStart"/>
-      <w:r>
-        <w:rPr>
-          <w:rFonts w:ascii="Aptos" w:eastAsia="Aptos" w:hAnsi="Aptos" w:cs="Aptos"/>
-          <w:sz w:val="20"/>
-          <w:szCs w:val="20"/>
-        </w:rPr>
-        <w:t>M^BSPlvl</w:t>
-      </w:r>
-      <w:proofErr w:type="spellEnd"/>
-      <w:r>
-        <w:rPr>
-          <w:rFonts w:ascii="Aptos" w:eastAsia="Aptos" w:hAnsi="Aptos" w:cs="Aptos"/>
-          <w:sz w:val="20"/>
-          <w:szCs w:val="20"/>
-        </w:rPr>
-        <w:t>) grows.</w:t>
+        <w:t xml:space="preserve"> does not guarantee convergence to the optimal policy the way that DP does, but it scales better as the number of inventory states </w:t>
+      </w:r>
+      <m:oMath>
+        <m:sSup>
+          <m:sSupPr>
+            <m:ctrlPr>
+              <w:rPr>
+                <w:rFonts w:ascii="Cambria Math" w:eastAsia="Aptos" w:hAnsi="Cambria Math" w:cs="Aptos"/>
+                <w:i/>
+                <w:sz w:val="20"/>
+                <w:szCs w:val="20"/>
+              </w:rPr>
+            </m:ctrlPr>
+          </m:sSupPr>
+          <m:e>
+            <m:r>
+              <w:rPr>
+                <w:rFonts w:ascii="Cambria Math" w:eastAsia="Aptos" w:hAnsi="Cambria Math" w:cs="Aptos"/>
+                <w:sz w:val="20"/>
+                <w:szCs w:val="20"/>
+              </w:rPr>
+              <m:t>M</m:t>
+            </m:r>
+          </m:e>
+          <m:sup>
+            <m:r>
+              <w:rPr>
+                <w:rFonts w:ascii="Cambria Math" w:eastAsia="Aptos" w:hAnsi="Cambria Math" w:cs="Aptos"/>
+                <w:sz w:val="20"/>
+                <w:szCs w:val="20"/>
+              </w:rPr>
+              <m:t>BSPlvl</m:t>
+            </m:r>
+          </m:sup>
+        </m:sSup>
+      </m:oMath>
+      <w:r>
+        <w:rPr>
+          <w:rFonts w:ascii="Aptos" w:eastAsia="Aptos" w:hAnsi="Aptos" w:cs="Aptos"/>
+          <w:sz w:val="20"/>
+          <w:szCs w:val="20"/>
+        </w:rPr>
+        <w:t xml:space="preserve"> grows.</w:t>
       </w:r>
       <w:r>
         <w:rPr>
@@ -2922,23 +3101,31 @@
           <w:sz w:val="20"/>
           <w:szCs w:val="20"/>
         </w:rPr>
-        <w:t xml:space="preserve">a more computationally </w:t>
-      </w:r>
-      <w:r>
-        <w:rPr>
-          <w:rFonts w:ascii="Aptos" w:eastAsia="Aptos" w:hAnsi="Aptos" w:cs="Aptos"/>
-          <w:sz w:val="20"/>
-          <w:szCs w:val="20"/>
-        </w:rPr>
-        <w:t>efficient alternative</w:t>
-      </w:r>
-      <w:r>
-        <w:rPr>
-          <w:rFonts w:ascii="Aptos" w:eastAsia="Aptos" w:hAnsi="Aptos" w:cs="Aptos"/>
-          <w:sz w:val="20"/>
-          <w:szCs w:val="20"/>
-        </w:rPr>
-        <w:t xml:space="preserve"> as the inventory </w:t>
+        <w:t>a more computationally</w:t>
+      </w:r>
+      <w:r>
+        <w:rPr>
+          <w:rFonts w:ascii="Aptos" w:eastAsia="Aptos" w:hAnsi="Aptos" w:cs="Aptos"/>
+          <w:sz w:val="20"/>
+          <w:szCs w:val="20"/>
+        </w:rPr>
+        <w:t xml:space="preserve"> </w:t>
+      </w:r>
+      <w:r>
+        <w:rPr>
+          <w:rFonts w:ascii="Aptos" w:eastAsia="Aptos" w:hAnsi="Aptos" w:cs="Aptos"/>
+          <w:sz w:val="20"/>
+          <w:szCs w:val="20"/>
+        </w:rPr>
+        <w:t xml:space="preserve">efficient alternative </w:t>
+      </w:r>
+      <w:r>
+        <w:rPr>
+          <w:rFonts w:ascii="Aptos" w:eastAsia="Aptos" w:hAnsi="Aptos" w:cs="Aptos"/>
+          <w:sz w:val="20"/>
+          <w:szCs w:val="20"/>
+        </w:rPr>
+        <w:t xml:space="preserve">as the inventory </w:t>
       </w:r>
       <w:r>
         <w:rPr>
@@ -3020,25 +3207,7 @@
           <w:sz w:val="20"/>
           <w:szCs w:val="20"/>
         </w:rPr>
-        <w:t>Q(</w:t>
-      </w:r>
-      <w:proofErr w:type="spellStart"/>
-      <w:r>
-        <w:rPr>
-          <w:rFonts w:ascii="Aptos" w:eastAsia="Aptos" w:hAnsi="Aptos" w:cs="Aptos"/>
-          <w:sz w:val="20"/>
-          <w:szCs w:val="20"/>
-        </w:rPr>
-        <w:t>s,a</w:t>
-      </w:r>
-      <w:proofErr w:type="spellEnd"/>
-      <w:r>
-        <w:rPr>
-          <w:rFonts w:ascii="Aptos" w:eastAsia="Aptos" w:hAnsi="Aptos" w:cs="Aptos"/>
-          <w:sz w:val="20"/>
-          <w:szCs w:val="20"/>
-        </w:rPr>
-        <w:t>)</w:t>
+        <w:t>Q(s,a)</w:t>
       </w:r>
       <w:r>
         <w:rPr>
@@ -3566,7 +3735,6 @@
         </w:rPr>
         <w:t>+1)^</w:t>
       </w:r>
-      <w:proofErr w:type="spellStart"/>
       <w:r>
         <w:rPr>
           <w:rFonts w:ascii="Aptos" w:eastAsia="Aptos" w:hAnsi="Aptos" w:cs="Aptos"/>
@@ -3575,7 +3743,6 @@
         </w:rPr>
         <w:t>BSPlvl</w:t>
       </w:r>
-      <w:proofErr w:type="spellEnd"/>
       <w:r>
         <w:rPr>
           <w:rFonts w:ascii="Aptos" w:eastAsia="Aptos" w:hAnsi="Aptos" w:cs="Aptos"/>
@@ -3657,15 +3824,15 @@
           <w:sz w:val="20"/>
           <w:szCs w:val="20"/>
         </w:rPr>
-        <w:t>, repeated across three random seeds</w:t>
-      </w:r>
-      <w:r>
-        <w:rPr>
-          <w:rFonts w:ascii="Aptos" w:eastAsia="Aptos" w:hAnsi="Aptos" w:cs="Aptos"/>
-          <w:sz w:val="20"/>
-          <w:szCs w:val="20"/>
-        </w:rPr>
-        <w:t xml:space="preserve"> (0, 1 and 2)</w:t>
+        <w:t xml:space="preserve">, repeated across three random seeds </w:t>
+      </w:r>
+      <w:r>
+        <w:rPr>
+          <w:rFonts w:ascii="Aptos" w:eastAsia="Aptos" w:hAnsi="Aptos" w:cs="Aptos"/>
+          <w:sz w:val="20"/>
+          <w:szCs w:val="20"/>
+        </w:rPr>
+        <w:t>(0, 1 and 2)</w:t>
       </w:r>
       <w:r>
         <w:rPr>
@@ -3704,19 +3871,33 @@
     </w:p>
     <w:p>
       <w:pPr>
-        <w:pStyle w:val="Heading1"/>
-      </w:pPr>
-      <w:r>
-        <w:t>Results</w:t>
+        <w:rPr>
+          <w:rFonts w:asciiTheme="majorHAnsi" w:eastAsiaTheme="majorEastAsia" w:hAnsiTheme="majorHAnsi" w:cstheme="majorBidi"/>
+          <w:color w:val="0F4761" w:themeColor="accent1" w:themeShade="BF"/>
+          <w:sz w:val="40"/>
+          <w:szCs w:val="40"/>
+        </w:rPr>
+      </w:pPr>
+      <w:r>
+        <w:br w:type="page"/>
       </w:r>
     </w:p>
     <w:p>
       <w:pPr>
-        <w:rPr>
-          <w:sz w:val="20"/>
-          <w:szCs w:val="20"/>
-        </w:rPr>
-      </w:pPr>
+        <w:pStyle w:val="Heading1"/>
+      </w:pPr>
+      <w:r>
+        <w:t>Results</w:t>
+      </w:r>
+    </w:p>
+    <w:p>
+      <w:pPr>
+        <w:rPr>
+          <w:sz w:val="20"/>
+          <w:szCs w:val="20"/>
+        </w:rPr>
+      </w:pPr>
+      <w:commentRangeStart w:id="0"/>
       <w:r>
         <w:rPr>
           <w:sz w:val="20"/>
@@ -3736,14 +3917,7 @@
           <w:sz w:val="20"/>
           <w:szCs w:val="20"/>
         </w:rPr>
-        <w:t>an</w:t>
-      </w:r>
-      <w:r>
-        <w:rPr>
-          <w:sz w:val="20"/>
-          <w:szCs w:val="20"/>
-        </w:rPr>
-        <w:t xml:space="preserve"> </w:t>
+        <w:t xml:space="preserve">an </w:t>
       </w:r>
       <w:r>
         <w:rPr>
@@ -3759,15 +3933,56 @@
           <w:sz w:val="20"/>
           <w:szCs w:val="20"/>
         </w:rPr>
-        <w:t>0.1 and a γ of 0.95 as the best overall result</w:t>
-      </w:r>
-      <w:r>
-        <w:rPr>
-          <w:rFonts w:ascii="Aptos" w:eastAsia="Aptos" w:hAnsi="Aptos" w:cs="Aptos"/>
-          <w:sz w:val="20"/>
-          <w:szCs w:val="20"/>
-        </w:rPr>
-        <w:t>. Therefore these settings were applied for the TD approaches.</w:t>
+        <w:t xml:space="preserve">0.1 and a </w:t>
+      </w:r>
+      <w:r>
+        <w:rPr>
+          <w:rFonts w:ascii="Aptos" w:eastAsia="Aptos" w:hAnsi="Aptos" w:cs="Aptos"/>
+          <w:sz w:val="20"/>
+          <w:szCs w:val="20"/>
+        </w:rPr>
+        <w:t>γ</w:t>
+      </w:r>
+      <w:r>
+        <w:rPr>
+          <w:rFonts w:ascii="Aptos" w:eastAsia="Aptos" w:hAnsi="Aptos" w:cs="Aptos"/>
+          <w:sz w:val="20"/>
+          <w:szCs w:val="20"/>
+        </w:rPr>
+        <w:t xml:space="preserve"> of 0.95 as the best overall result</w:t>
+      </w:r>
+      <w:r>
+        <w:rPr>
+          <w:rFonts w:ascii="Aptos" w:eastAsia="Aptos" w:hAnsi="Aptos" w:cs="Aptos"/>
+          <w:sz w:val="20"/>
+          <w:szCs w:val="20"/>
+        </w:rPr>
+        <w:t>. Therefore</w:t>
+      </w:r>
+      <w:r>
+        <w:rPr>
+          <w:rFonts w:ascii="Aptos" w:eastAsia="Aptos" w:hAnsi="Aptos" w:cs="Aptos"/>
+          <w:sz w:val="20"/>
+          <w:szCs w:val="20"/>
+        </w:rPr>
+        <w:t>,</w:t>
+      </w:r>
+      <w:r>
+        <w:rPr>
+          <w:rFonts w:ascii="Aptos" w:eastAsia="Aptos" w:hAnsi="Aptos" w:cs="Aptos"/>
+          <w:sz w:val="20"/>
+          <w:szCs w:val="20"/>
+        </w:rPr>
+        <w:t xml:space="preserve"> these settings were applied for the TD approaches.</w:t>
+      </w:r>
+      <w:commentRangeEnd w:id="0"/>
+      <w:r>
+        <w:rPr>
+          <w:rStyle w:val="CommentReference"/>
+          <w:sz w:val="20"/>
+          <w:szCs w:val="20"/>
+        </w:rPr>
+        <w:commentReference w:id="0"/>
       </w:r>
     </w:p>
     <w:p>
@@ -3803,7 +4018,6 @@
         <m:r>
           <w:rPr>
             <w:rFonts w:ascii="Cambria Math" w:hAnsi="Cambria Math"/>
-            <w:noProof/>
             <w:sz w:val="20"/>
             <w:szCs w:val="20"/>
           </w:rPr>
@@ -3822,7 +4036,6 @@
         <w:rPr>
           <w:rFonts w:eastAsiaTheme="minorEastAsia"/>
           <w:b/>
-          <w:bCs/>
           <w:sz w:val="20"/>
           <w:szCs w:val="20"/>
         </w:rPr>
@@ -4092,7 +4305,7 @@
                           <pic:cNvPicPr/>
                         </pic:nvPicPr>
                         <pic:blipFill>
-                          <a:blip r:embed="rId7" cstate="print">
+                          <a:blip r:embed="rId11" cstate="print">
                             <a:extLst>
                               <a:ext uri="{28A0092B-C50C-407E-A947-70E740481C1C}">
                                 <a14:useLocalDpi xmlns:a14="http://schemas.microsoft.com/office/drawing/2010/main" val="0"/>
@@ -4150,7 +4363,7 @@
                           <pic:cNvPicPr/>
                         </pic:nvPicPr>
                         <pic:blipFill>
-                          <a:blip r:embed="rId8" cstate="print">
+                          <a:blip r:embed="rId12" cstate="print">
                             <a:extLst>
                               <a:ext uri="{28A0092B-C50C-407E-A947-70E740481C1C}">
                                 <a14:useLocalDpi xmlns:a14="http://schemas.microsoft.com/office/drawing/2010/main" val="0"/>
@@ -4192,7 +4405,6 @@
         <w:jc w:val="both"/>
         <w:rPr>
           <w:rFonts w:eastAsiaTheme="minorEastAsia"/>
-          <w:noProof/>
           <w:sz w:val="20"/>
           <w:szCs w:val="20"/>
         </w:rPr>
@@ -4200,8 +4412,6 @@
       <w:r>
         <w:rPr>
           <w:b/>
-          <w:bCs/>
-          <w:noProof/>
           <w:sz w:val="20"/>
           <w:szCs w:val="20"/>
         </w:rPr>
@@ -4210,8 +4420,6 @@
       <w:r>
         <w:rPr>
           <w:b/>
-          <w:bCs/>
-          <w:noProof/>
           <w:sz w:val="20"/>
           <w:szCs w:val="20"/>
         </w:rPr>
@@ -4219,7 +4427,6 @@
       </w:r>
       <w:r>
         <w:rPr>
-          <w:noProof/>
           <w:sz w:val="20"/>
           <w:szCs w:val="20"/>
         </w:rPr>
@@ -4227,7 +4434,6 @@
       </w:r>
       <w:r>
         <w:rPr>
-          <w:noProof/>
           <w:sz w:val="20"/>
           <w:szCs w:val="20"/>
         </w:rPr>
@@ -4235,7 +4441,6 @@
       </w:r>
       <w:r>
         <w:rPr>
-          <w:noProof/>
           <w:sz w:val="20"/>
           <w:szCs w:val="20"/>
         </w:rPr>
@@ -4243,7 +4448,6 @@
       </w:r>
       <w:r>
         <w:rPr>
-          <w:noProof/>
           <w:sz w:val="20"/>
           <w:szCs w:val="20"/>
         </w:rPr>
@@ -4251,7 +4455,6 @@
       </w:r>
       <w:r>
         <w:rPr>
-          <w:noProof/>
           <w:color w:val="215E99" w:themeColor="text2" w:themeTint="BF"/>
           <w:sz w:val="20"/>
           <w:szCs w:val="20"/>
@@ -4260,7 +4463,6 @@
       </w:r>
       <w:r>
         <w:rPr>
-          <w:noProof/>
           <w:sz w:val="20"/>
           <w:szCs w:val="20"/>
         </w:rPr>
@@ -4268,7 +4470,6 @@
       </w:r>
       <w:r>
         <w:rPr>
-          <w:noProof/>
           <w:sz w:val="20"/>
           <w:szCs w:val="20"/>
         </w:rPr>
@@ -4276,7 +4477,6 @@
       </w:r>
       <w:r>
         <w:rPr>
-          <w:noProof/>
           <w:sz w:val="20"/>
           <w:szCs w:val="20"/>
         </w:rPr>
@@ -4284,7 +4484,6 @@
       </w:r>
       <w:r>
         <w:rPr>
-          <w:noProof/>
           <w:sz w:val="20"/>
           <w:szCs w:val="20"/>
         </w:rPr>
@@ -4292,7 +4491,6 @@
       </w:r>
       <w:r>
         <w:rPr>
-          <w:noProof/>
           <w:sz w:val="20"/>
           <w:szCs w:val="20"/>
         </w:rPr>
@@ -4301,7 +4499,6 @@
       <w:r>
         <w:rPr>
           <w:rFonts w:eastAsiaTheme="minorEastAsia"/>
-          <w:noProof/>
           <w:sz w:val="20"/>
           <w:szCs w:val="20"/>
         </w:rPr>
@@ -4311,7 +4508,6 @@
         <m:r>
           <w:rPr>
             <w:rFonts w:ascii="Cambria Math" w:eastAsiaTheme="minorEastAsia" w:hAnsi="Cambria Math"/>
-            <w:noProof/>
             <w:sz w:val="20"/>
             <w:szCs w:val="20"/>
           </w:rPr>
@@ -4321,7 +4517,6 @@
       <w:r>
         <w:rPr>
           <w:rFonts w:eastAsiaTheme="minorEastAsia"/>
-          <w:noProof/>
           <w:sz w:val="20"/>
           <w:szCs w:val="20"/>
         </w:rPr>
@@ -4331,7 +4526,6 @@
         <m:r>
           <w:rPr>
             <w:rFonts w:ascii="Cambria Math" w:hAnsi="Cambria Math"/>
-            <w:noProof/>
             <w:sz w:val="20"/>
             <w:szCs w:val="20"/>
           </w:rPr>
@@ -4340,7 +4534,6 @@
         <m:r>
           <w:rPr>
             <w:rFonts w:ascii="Cambria Math" w:eastAsiaTheme="minorEastAsia" w:hAnsi="Cambria Math"/>
-            <w:noProof/>
             <w:sz w:val="20"/>
             <w:szCs w:val="20"/>
           </w:rPr>
@@ -5038,7 +5231,6 @@
         <w:rPr>
           <w:rFonts w:eastAsiaTheme="minorEastAsia"/>
           <w:b/>
-          <w:bCs/>
           <w:sz w:val="20"/>
           <w:szCs w:val="20"/>
         </w:rPr>
@@ -5048,7 +5240,6 @@
         <w:rPr>
           <w:rFonts w:eastAsiaTheme="minorEastAsia"/>
           <w:b/>
-          <w:bCs/>
           <w:sz w:val="20"/>
           <w:szCs w:val="20"/>
         </w:rPr>
@@ -5058,7 +5249,6 @@
         <w:rPr>
           <w:rFonts w:eastAsiaTheme="minorEastAsia"/>
           <w:b/>
-          <w:bCs/>
           <w:sz w:val="20"/>
           <w:szCs w:val="20"/>
         </w:rPr>
@@ -5190,7 +5380,6 @@
         <w:rPr>
           <w:rFonts w:eastAsiaTheme="minorEastAsia"/>
           <w:b/>
-          <w:bCs/>
           <w:sz w:val="20"/>
           <w:szCs w:val="20"/>
         </w:rPr>
@@ -5208,7 +5397,6 @@
         <w:rPr>
           <w:rFonts w:eastAsiaTheme="minorEastAsia"/>
           <w:b/>
-          <w:bCs/>
           <w:sz w:val="20"/>
           <w:szCs w:val="20"/>
         </w:rPr>
@@ -5287,9 +5475,9 @@
         <w:tblLook w:val="04A0" w:firstRow="1" w:lastRow="0" w:firstColumn="1" w:lastColumn="0" w:noHBand="0" w:noVBand="1"/>
       </w:tblPr>
       <w:tblGrid>
-        <w:gridCol w:w="2782"/>
-        <w:gridCol w:w="2779"/>
-        <w:gridCol w:w="3465"/>
+        <w:gridCol w:w="2764"/>
+        <w:gridCol w:w="2761"/>
+        <w:gridCol w:w="3501"/>
       </w:tblGrid>
       <w:tr>
         <w:tc>
@@ -5382,7 +5570,7 @@
                           <pic:cNvPicPr/>
                         </pic:nvPicPr>
                         <pic:blipFill rotWithShape="1">
-                          <a:blip r:embed="rId9" cstate="print">
+                          <a:blip r:embed="rId13" cstate="print">
                             <a:extLst>
                               <a:ext uri="{28A0092B-C50C-407E-A947-70E740481C1C}">
                                 <a14:useLocalDpi xmlns:a14="http://schemas.microsoft.com/office/drawing/2010/main" val="0"/>
@@ -5450,7 +5638,7 @@
                           <pic:cNvPicPr/>
                         </pic:nvPicPr>
                         <pic:blipFill rotWithShape="1">
-                          <a:blip r:embed="rId10" cstate="print">
+                          <a:blip r:embed="rId14" cstate="print">
                             <a:extLst>
                               <a:ext uri="{28A0092B-C50C-407E-A947-70E740481C1C}">
                                 <a14:useLocalDpi xmlns:a14="http://schemas.microsoft.com/office/drawing/2010/main" val="0"/>
@@ -5500,13 +5688,14 @@
             </w:pPr>
             <w:r>
               <w:rPr>
+                <w:rFonts w:eastAsiaTheme="minorEastAsia"/>
                 <w:noProof/>
               </w:rPr>
               <w:drawing>
-                <wp:inline distT="0" distB="0" distL="0" distR="0" wp14:anchorId="744E7DD1" wp14:editId="3212587F">
-                  <wp:extent cx="2073859" cy="2159635"/>
-                  <wp:effectExtent l="0" t="0" r="3175" b="0"/>
-                  <wp:docPr id="1894645154" name="Picture 6"/>
+                <wp:inline distT="0" distB="0" distL="0" distR="0" wp14:anchorId="712A0785" wp14:editId="1FFEC25A">
+                  <wp:extent cx="2106358" cy="2160000"/>
+                  <wp:effectExtent l="0" t="0" r="8255" b="0"/>
+                  <wp:docPr id="951556962" name="Picture 3"/>
                   <wp:cNvGraphicFramePr>
                     <a:graphicFrameLocks xmlns:a="http://schemas.openxmlformats.org/drawingml/2006/main" noChangeAspect="1"/>
                   </wp:cNvGraphicFramePr>
@@ -5514,38 +5703,29 @@
                     <a:graphicData uri="http://schemas.openxmlformats.org/drawingml/2006/picture">
                       <pic:pic xmlns:pic="http://schemas.openxmlformats.org/drawingml/2006/picture">
                         <pic:nvPicPr>
-                          <pic:cNvPr id="1894645154" name="Picture 1894645154"/>
+                          <pic:cNvPr id="951556962" name="Picture 951556962"/>
                           <pic:cNvPicPr/>
                         </pic:nvPicPr>
-                        <pic:blipFill rotWithShape="1">
-                          <a:blip r:embed="rId11" cstate="print">
+                        <pic:blipFill>
+                          <a:blip r:embed="rId15" cstate="print">
                             <a:extLst>
                               <a:ext uri="{28A0092B-C50C-407E-A947-70E740481C1C}">
                                 <a14:useLocalDpi xmlns:a14="http://schemas.microsoft.com/office/drawing/2010/main" val="0"/>
                               </a:ext>
                             </a:extLst>
                           </a:blip>
-                          <a:srcRect r="1526"/>
                           <a:stretch>
                             <a:fillRect/>
                           </a:stretch>
                         </pic:blipFill>
-                        <pic:spPr bwMode="auto">
+                        <pic:spPr>
                           <a:xfrm>
                             <a:off x="0" y="0"/>
-                            <a:ext cx="2074210" cy="2160000"/>
+                            <a:ext cx="2106358" cy="2160000"/>
                           </a:xfrm>
                           <a:prstGeom prst="rect">
                             <a:avLst/>
                           </a:prstGeom>
-                          <a:ln>
-                            <a:noFill/>
-                          </a:ln>
-                          <a:extLst>
-                            <a:ext uri="{53640926-AAD7-44D8-BBD7-CCE9431645EC}">
-                              <a14:shadowObscured xmlns:a14="http://schemas.microsoft.com/office/drawing/2010/main"/>
-                            </a:ext>
-                          </a:extLst>
                         </pic:spPr>
                       </pic:pic>
                     </a:graphicData>
@@ -5570,7 +5750,6 @@
         <w:rPr>
           <w:rFonts w:eastAsiaTheme="minorEastAsia"/>
           <w:b/>
-          <w:bCs/>
           <w:sz w:val="20"/>
           <w:szCs w:val="20"/>
         </w:rPr>
@@ -5580,7 +5759,6 @@
         <w:rPr>
           <w:rFonts w:eastAsiaTheme="minorEastAsia"/>
           <w:b/>
-          <w:bCs/>
           <w:sz w:val="20"/>
           <w:szCs w:val="20"/>
         </w:rPr>
@@ -5852,7 +6030,6 @@
         <w:rPr>
           <w:rFonts w:eastAsiaTheme="minorEastAsia"/>
           <w:b/>
-          <w:bCs/>
           <w:sz w:val="20"/>
           <w:szCs w:val="20"/>
         </w:rPr>
@@ -6003,7 +6180,6 @@
         <w:rPr>
           <w:rFonts w:eastAsiaTheme="minorEastAsia"/>
           <w:b/>
-          <w:bCs/>
           <w:sz w:val="20"/>
           <w:szCs w:val="20"/>
         </w:rPr>
@@ -6102,7 +6278,7 @@
                     <pic:cNvPicPr/>
                   </pic:nvPicPr>
                   <pic:blipFill>
-                    <a:blip r:embed="rId12" cstate="print">
+                    <a:blip r:embed="rId16" cstate="print">
                       <a:extLst>
                         <a:ext uri="{28A0092B-C50C-407E-A947-70E740481C1C}">
                           <a14:useLocalDpi xmlns:a14="http://schemas.microsoft.com/office/drawing/2010/main" val="0"/>
@@ -6143,7 +6319,6 @@
         <w:rPr>
           <w:rFonts w:eastAsiaTheme="minorEastAsia"/>
           <w:b/>
-          <w:bCs/>
           <w:sz w:val="20"/>
           <w:szCs w:val="20"/>
         </w:rPr>
@@ -6153,7 +6328,6 @@
         <w:rPr>
           <w:rFonts w:eastAsiaTheme="minorEastAsia"/>
           <w:b/>
-          <w:bCs/>
           <w:sz w:val="20"/>
           <w:szCs w:val="20"/>
         </w:rPr>
@@ -6246,7 +6420,7 @@
                     <pic:cNvPicPr/>
                   </pic:nvPicPr>
                   <pic:blipFill>
-                    <a:blip r:embed="rId13" cstate="print">
+                    <a:blip r:embed="rId17" cstate="print">
                       <a:extLst>
                         <a:ext uri="{28A0092B-C50C-407E-A947-70E740481C1C}">
                           <a14:useLocalDpi xmlns:a14="http://schemas.microsoft.com/office/drawing/2010/main" val="0"/>
@@ -6287,7 +6461,6 @@
         <w:rPr>
           <w:rFonts w:eastAsiaTheme="minorEastAsia"/>
           <w:b/>
-          <w:bCs/>
           <w:sz w:val="20"/>
           <w:szCs w:val="20"/>
         </w:rPr>
@@ -6297,7 +6470,6 @@
         <w:rPr>
           <w:rFonts w:eastAsiaTheme="minorEastAsia"/>
           <w:b/>
-          <w:bCs/>
           <w:sz w:val="20"/>
           <w:szCs w:val="20"/>
         </w:rPr>
@@ -6341,7 +6513,7 @@
                     <pic:cNvPicPr/>
                   </pic:nvPicPr>
                   <pic:blipFill>
-                    <a:blip r:embed="rId14" cstate="print">
+                    <a:blip r:embed="rId18" cstate="print">
                       <a:extLst>
                         <a:ext uri="{28A0092B-C50C-407E-A947-70E740481C1C}">
                           <a14:useLocalDpi xmlns:a14="http://schemas.microsoft.com/office/drawing/2010/main" val="0"/>
@@ -6382,7 +6554,6 @@
         <w:rPr>
           <w:rFonts w:eastAsiaTheme="minorEastAsia"/>
           <w:b/>
-          <w:bCs/>
           <w:sz w:val="20"/>
           <w:szCs w:val="20"/>
         </w:rPr>
@@ -6392,7 +6563,6 @@
         <w:rPr>
           <w:rFonts w:eastAsiaTheme="minorEastAsia"/>
           <w:b/>
-          <w:bCs/>
           <w:sz w:val="20"/>
           <w:szCs w:val="20"/>
         </w:rPr>
@@ -6464,221 +6634,28 @@
     </w:p>
     <w:p>
       <w:pPr>
-        <w:pStyle w:val="Heading1"/>
-      </w:pPr>
-      <w:r>
-        <w:t>Discussion</w:t>
+        <w:rPr>
+          <w:rFonts w:asciiTheme="majorHAnsi" w:eastAsiaTheme="majorEastAsia" w:hAnsiTheme="majorHAnsi" w:cstheme="majorBidi"/>
+          <w:color w:val="0F4761" w:themeColor="accent1" w:themeShade="BF"/>
+          <w:sz w:val="40"/>
+          <w:szCs w:val="40"/>
+        </w:rPr>
+      </w:pPr>
+      <w:r>
+        <w:br w:type="page"/>
       </w:r>
     </w:p>
     <w:p>
       <w:pPr>
-        <w:jc w:val="both"/>
-        <w:rPr>
-          <w:sz w:val="20"/>
-          <w:szCs w:val="20"/>
-        </w:rPr>
-      </w:pPr>
-      <w:r>
-        <w:rPr>
-          <w:sz w:val="20"/>
-          <w:szCs w:val="20"/>
-        </w:rPr>
-        <w:t xml:space="preserve">Across the parameter range tested, none of the </w:t>
-      </w:r>
-      <w:r>
-        <w:rPr>
-          <w:sz w:val="20"/>
-          <w:szCs w:val="20"/>
-        </w:rPr>
-        <w:t xml:space="preserve">modelled approaches produced a statistically or </w:t>
-      </w:r>
-      <w:r>
-        <w:rPr>
-          <w:sz w:val="20"/>
-          <w:szCs w:val="20"/>
-        </w:rPr>
-        <w:t>practically</w:t>
-      </w:r>
-      <w:r>
-        <w:rPr>
-          <w:sz w:val="20"/>
-          <w:szCs w:val="20"/>
-        </w:rPr>
-        <w:t xml:space="preserve"> meaningful improvement over the fixed discount approach. </w:t>
-      </w:r>
-      <w:r>
-        <w:rPr>
-          <w:sz w:val="20"/>
-          <w:szCs w:val="20"/>
-        </w:rPr>
-        <w:t>Dynamic Programming (</w:t>
-      </w:r>
-      <w:r>
-        <w:rPr>
-          <w:sz w:val="20"/>
-          <w:szCs w:val="20"/>
-        </w:rPr>
-        <w:t>DP</w:t>
-      </w:r>
-      <w:r>
-        <w:rPr>
-          <w:sz w:val="20"/>
-          <w:szCs w:val="20"/>
-        </w:rPr>
-        <w:t>)</w:t>
-      </w:r>
-      <w:r>
-        <w:rPr>
-          <w:sz w:val="20"/>
-          <w:szCs w:val="20"/>
-        </w:rPr>
-        <w:t xml:space="preserve"> </w:t>
-      </w:r>
-      <w:r>
-        <w:rPr>
-          <w:sz w:val="20"/>
-          <w:szCs w:val="20"/>
-        </w:rPr>
-        <w:t>has</w:t>
-      </w:r>
-      <w:r>
-        <w:rPr>
-          <w:sz w:val="20"/>
-          <w:szCs w:val="20"/>
-        </w:rPr>
-        <w:t xml:space="preserve"> </w:t>
-      </w:r>
-      <w:r>
-        <w:rPr>
-          <w:sz w:val="20"/>
-          <w:szCs w:val="20"/>
-        </w:rPr>
-        <w:t xml:space="preserve">no </w:t>
-      </w:r>
-      <w:r>
-        <w:rPr>
-          <w:sz w:val="20"/>
-          <w:szCs w:val="20"/>
-        </w:rPr>
-        <w:t>statistical</w:t>
-      </w:r>
-      <w:r>
-        <w:rPr>
-          <w:sz w:val="20"/>
-          <w:szCs w:val="20"/>
-        </w:rPr>
-        <w:t xml:space="preserve"> improvement over </w:t>
-      </w:r>
-      <w:r>
-        <w:rPr>
-          <w:sz w:val="20"/>
-          <w:szCs w:val="20"/>
-        </w:rPr>
-        <w:t>Fixed Discount Control (</w:t>
-      </w:r>
-      <w:r>
-        <w:rPr>
-          <w:sz w:val="20"/>
-          <w:szCs w:val="20"/>
-        </w:rPr>
-        <w:t>FDC</w:t>
-      </w:r>
-      <w:r>
-        <w:rPr>
-          <w:sz w:val="20"/>
-          <w:szCs w:val="20"/>
-        </w:rPr>
-        <w:t>)</w:t>
-      </w:r>
-      <w:r>
-        <w:rPr>
-          <w:sz w:val="20"/>
-          <w:szCs w:val="20"/>
-        </w:rPr>
-        <w:t xml:space="preserve"> on both profit and waste</w:t>
-      </w:r>
-      <w:r>
-        <w:rPr>
-          <w:sz w:val="20"/>
-          <w:szCs w:val="20"/>
-        </w:rPr>
-        <w:t>.</w:t>
-      </w:r>
-      <w:r>
-        <w:rPr>
-          <w:sz w:val="20"/>
-          <w:szCs w:val="20"/>
-        </w:rPr>
-        <w:t xml:space="preserve"> </w:t>
-      </w:r>
-      <w:r>
-        <w:rPr>
-          <w:sz w:val="20"/>
-          <w:szCs w:val="20"/>
-        </w:rPr>
-        <w:t>Reinforcement learning (</w:t>
-      </w:r>
-      <w:r>
-        <w:rPr>
-          <w:sz w:val="20"/>
-          <w:szCs w:val="20"/>
-        </w:rPr>
-        <w:t>RL</w:t>
-      </w:r>
-      <w:r>
-        <w:rPr>
-          <w:sz w:val="20"/>
-          <w:szCs w:val="20"/>
-        </w:rPr>
-        <w:t>)</w:t>
-      </w:r>
-      <w:r>
-        <w:rPr>
-          <w:sz w:val="20"/>
-          <w:szCs w:val="20"/>
-        </w:rPr>
-        <w:t xml:space="preserve"> achieved a significantly lower profit than FDC while only matching waste reduction at small inventory states.</w:t>
-      </w:r>
-      <w:r>
-        <w:rPr>
-          <w:sz w:val="20"/>
-          <w:szCs w:val="20"/>
-        </w:rPr>
-        <w:t xml:space="preserve"> These findings are </w:t>
-      </w:r>
-      <w:r>
-        <w:rPr>
-          <w:sz w:val="20"/>
-          <w:szCs w:val="20"/>
-        </w:rPr>
-        <w:t xml:space="preserve">a contradiction to the findings in the paper that motivated this study </w:t>
-      </w:r>
-      <w:r>
-        <w:rPr>
-          <w:sz w:val="20"/>
-          <w:szCs w:val="20"/>
-        </w:rPr>
-        <w:t xml:space="preserve">of </w:t>
-      </w:r>
-      <w:proofErr w:type="spellStart"/>
-      <w:r>
-        <w:rPr>
-          <w:sz w:val="20"/>
-          <w:szCs w:val="20"/>
-        </w:rPr>
-        <w:t>Haijema</w:t>
-      </w:r>
-      <w:proofErr w:type="spellEnd"/>
-      <w:r>
-        <w:rPr>
-          <w:sz w:val="20"/>
-          <w:szCs w:val="20"/>
-        </w:rPr>
-        <w:t xml:space="preserve"> et al.</w:t>
+        <w:pStyle w:val="Heading1"/>
+      </w:pPr>
+      <w:r>
+        <w:t>Discussion</w:t>
       </w:r>
     </w:p>
     <w:p>
       <w:pPr>
+        <w:spacing w:after="0"/>
         <w:jc w:val="both"/>
         <w:rPr>
           <w:sz w:val="20"/>
@@ -6690,73 +6667,188 @@
           <w:sz w:val="20"/>
           <w:szCs w:val="20"/>
         </w:rPr>
-        <w:t xml:space="preserve">The paper of </w:t>
-      </w:r>
-      <w:proofErr w:type="spellStart"/>
-      <w:r>
-        <w:rPr>
-          <w:sz w:val="20"/>
-          <w:szCs w:val="20"/>
-        </w:rPr>
-        <w:t>Haijema</w:t>
-      </w:r>
-      <w:proofErr w:type="spellEnd"/>
-      <w:r>
-        <w:rPr>
-          <w:sz w:val="20"/>
-          <w:szCs w:val="20"/>
-        </w:rPr>
-        <w:t xml:space="preserve"> et al.</w:t>
-      </w:r>
-      <w:r>
-        <w:rPr>
-          <w:sz w:val="20"/>
-          <w:szCs w:val="20"/>
-        </w:rPr>
-        <w:t xml:space="preserve"> formulated the discounting decision around two discount rates x1 and x2, applied to products expiring at the end of the current day and the following day respectively. In contrast, this research applied a single day discount. This restriction </w:t>
-      </w:r>
-      <w:proofErr w:type="spellStart"/>
-      <w:r>
-        <w:rPr>
-          <w:sz w:val="20"/>
-          <w:szCs w:val="20"/>
-        </w:rPr>
-        <w:t>correspondends</w:t>
-      </w:r>
-      <w:proofErr w:type="spellEnd"/>
-      <w:r>
-        <w:rPr>
-          <w:sz w:val="20"/>
-          <w:szCs w:val="20"/>
-        </w:rPr>
-        <w:t xml:space="preserve"> to </w:t>
-      </w:r>
-      <w:proofErr w:type="spellStart"/>
-      <w:r>
-        <w:rPr>
-          <w:sz w:val="20"/>
-          <w:szCs w:val="20"/>
-        </w:rPr>
-        <w:t>Haijema’s</w:t>
-      </w:r>
-      <w:proofErr w:type="spellEnd"/>
-      <w:r>
-        <w:rPr>
-          <w:sz w:val="20"/>
-          <w:szCs w:val="20"/>
-        </w:rPr>
-        <w:t xml:space="preserve"> D1 policy, which consistently yielded smaller </w:t>
-      </w:r>
-      <w:r>
-        <w:rPr>
-          <w:sz w:val="20"/>
-          <w:szCs w:val="20"/>
-        </w:rPr>
-        <w:t>profit gains. The finding that DP could not outperform FDC is therefore consistent with literature.</w:t>
+        <w:t xml:space="preserve">Across the parameter range tested, none of the </w:t>
+      </w:r>
+      <w:r>
+        <w:rPr>
+          <w:sz w:val="20"/>
+          <w:szCs w:val="20"/>
+        </w:rPr>
+        <w:t xml:space="preserve">modelled approaches produced a statistically or </w:t>
+      </w:r>
+      <w:r>
+        <w:rPr>
+          <w:sz w:val="20"/>
+          <w:szCs w:val="20"/>
+        </w:rPr>
+        <w:t>practically</w:t>
+      </w:r>
+      <w:r>
+        <w:rPr>
+          <w:sz w:val="20"/>
+          <w:szCs w:val="20"/>
+        </w:rPr>
+        <w:t xml:space="preserve"> meaningful improvement over the fixed discount approach. </w:t>
+      </w:r>
+      <w:r>
+        <w:rPr>
+          <w:sz w:val="20"/>
+          <w:szCs w:val="20"/>
+        </w:rPr>
+        <w:t>Dynamic Programming (</w:t>
+      </w:r>
+      <w:r>
+        <w:rPr>
+          <w:sz w:val="20"/>
+          <w:szCs w:val="20"/>
+        </w:rPr>
+        <w:t>DP</w:t>
+      </w:r>
+      <w:r>
+        <w:rPr>
+          <w:sz w:val="20"/>
+          <w:szCs w:val="20"/>
+        </w:rPr>
+        <w:t>)</w:t>
+      </w:r>
+      <w:r>
+        <w:rPr>
+          <w:sz w:val="20"/>
+          <w:szCs w:val="20"/>
+        </w:rPr>
+        <w:t xml:space="preserve"> </w:t>
+      </w:r>
+      <w:r>
+        <w:rPr>
+          <w:sz w:val="20"/>
+          <w:szCs w:val="20"/>
+        </w:rPr>
+        <w:t>has</w:t>
+      </w:r>
+      <w:r>
+        <w:rPr>
+          <w:sz w:val="20"/>
+          <w:szCs w:val="20"/>
+        </w:rPr>
+        <w:t xml:space="preserve"> </w:t>
+      </w:r>
+      <w:r>
+        <w:rPr>
+          <w:sz w:val="20"/>
+          <w:szCs w:val="20"/>
+        </w:rPr>
+        <w:t xml:space="preserve">no </w:t>
+      </w:r>
+      <w:r>
+        <w:rPr>
+          <w:sz w:val="20"/>
+          <w:szCs w:val="20"/>
+        </w:rPr>
+        <w:t>statistical</w:t>
+      </w:r>
+      <w:r>
+        <w:rPr>
+          <w:sz w:val="20"/>
+          <w:szCs w:val="20"/>
+        </w:rPr>
+        <w:t xml:space="preserve"> improvement over </w:t>
+      </w:r>
+      <w:r>
+        <w:rPr>
+          <w:sz w:val="20"/>
+          <w:szCs w:val="20"/>
+        </w:rPr>
+        <w:t>Fixed Discount Control (</w:t>
+      </w:r>
+      <w:r>
+        <w:rPr>
+          <w:sz w:val="20"/>
+          <w:szCs w:val="20"/>
+        </w:rPr>
+        <w:t>FDC</w:t>
+      </w:r>
+      <w:r>
+        <w:rPr>
+          <w:sz w:val="20"/>
+          <w:szCs w:val="20"/>
+        </w:rPr>
+        <w:t>)</w:t>
+      </w:r>
+      <w:r>
+        <w:rPr>
+          <w:sz w:val="20"/>
+          <w:szCs w:val="20"/>
+        </w:rPr>
+        <w:t xml:space="preserve"> on both profit and waste</w:t>
+      </w:r>
+      <w:r>
+        <w:rPr>
+          <w:sz w:val="20"/>
+          <w:szCs w:val="20"/>
+        </w:rPr>
+        <w:t>.</w:t>
+      </w:r>
+      <w:r>
+        <w:rPr>
+          <w:sz w:val="20"/>
+          <w:szCs w:val="20"/>
+        </w:rPr>
+        <w:t xml:space="preserve"> </w:t>
+      </w:r>
+      <w:r>
+        <w:rPr>
+          <w:sz w:val="20"/>
+          <w:szCs w:val="20"/>
+        </w:rPr>
+        <w:t>Reinforcement learning (</w:t>
+      </w:r>
+      <w:r>
+        <w:rPr>
+          <w:sz w:val="20"/>
+          <w:szCs w:val="20"/>
+        </w:rPr>
+        <w:t>RL</w:t>
+      </w:r>
+      <w:r>
+        <w:rPr>
+          <w:sz w:val="20"/>
+          <w:szCs w:val="20"/>
+        </w:rPr>
+        <w:t>)</w:t>
+      </w:r>
+      <w:r>
+        <w:rPr>
+          <w:sz w:val="20"/>
+          <w:szCs w:val="20"/>
+        </w:rPr>
+        <w:t xml:space="preserve"> achieved a significantly lower profit than FDC while only matching waste reduction at small inventory states.</w:t>
+      </w:r>
+      <w:r>
+        <w:rPr>
+          <w:sz w:val="20"/>
+          <w:szCs w:val="20"/>
+        </w:rPr>
+        <w:t xml:space="preserve"> These findings are </w:t>
+      </w:r>
+      <w:r>
+        <w:rPr>
+          <w:sz w:val="20"/>
+          <w:szCs w:val="20"/>
+        </w:rPr>
+        <w:t xml:space="preserve">a contradiction to the findings in the paper that motivated this study </w:t>
+      </w:r>
+      <w:r>
+        <w:rPr>
+          <w:sz w:val="20"/>
+          <w:szCs w:val="20"/>
+        </w:rPr>
+        <w:t>of Haijema et al.</w:t>
       </w:r>
     </w:p>
     <w:p>
       <w:pPr>
+        <w:spacing w:after="0"/>
+        <w:ind w:firstLine="720"/>
         <w:jc w:val="both"/>
         <w:rPr>
           <w:sz w:val="20"/>
@@ -6768,62 +6860,41 @@
           <w:sz w:val="20"/>
           <w:szCs w:val="20"/>
         </w:rPr>
-        <w:t xml:space="preserve">The consumer behaviour model </w:t>
-      </w:r>
-      <w:r>
-        <w:rPr>
-          <w:sz w:val="20"/>
-          <w:szCs w:val="20"/>
-        </w:rPr>
-        <w:t>oversimplifies</w:t>
-      </w:r>
-      <w:r>
-        <w:rPr>
-          <w:sz w:val="20"/>
-          <w:szCs w:val="20"/>
-        </w:rPr>
-        <w:t xml:space="preserve"> how customers respond to </w:t>
-      </w:r>
-      <w:r>
-        <w:rPr>
-          <w:sz w:val="20"/>
-          <w:szCs w:val="20"/>
-        </w:rPr>
-        <w:t>discounts</w:t>
-      </w:r>
-      <w:r>
-        <w:rPr>
-          <w:sz w:val="20"/>
-          <w:szCs w:val="20"/>
-        </w:rPr>
-        <w:t>. The environment treats every customer a LEFO buyer. Once a discount is applied</w:t>
-      </w:r>
-      <w:r>
-        <w:rPr>
-          <w:sz w:val="20"/>
-          <w:szCs w:val="20"/>
-        </w:rPr>
-        <w:t xml:space="preserve">, the amount FEFO buyers is proportional to the amount of discount given. In the paper of </w:t>
-      </w:r>
-      <w:proofErr w:type="spellStart"/>
-      <w:r>
-        <w:rPr>
-          <w:sz w:val="20"/>
-          <w:szCs w:val="20"/>
-        </w:rPr>
-        <w:t>Haijema</w:t>
-      </w:r>
-      <w:proofErr w:type="spellEnd"/>
-      <w:r>
-        <w:rPr>
-          <w:sz w:val="20"/>
-          <w:szCs w:val="20"/>
-        </w:rPr>
-        <w:t xml:space="preserve"> et al. the model instead introduces a sensitivity parameter, governing what fraction of LEFO customers respond to a given discount level. The absence of such parameter in the model provided in the paper, means that discount responsiveness is uniform across all LEFO customers, which is unlikely to hold in practice.</w:t>
+        <w:t>The paper of Haijema et al.</w:t>
+      </w:r>
+      <w:r>
+        <w:rPr>
+          <w:sz w:val="20"/>
+          <w:szCs w:val="20"/>
+        </w:rPr>
+        <w:t xml:space="preserve"> formulated the discounting decision around two discount rates x1 and x2, applied to products expiring at the end of the current day and the following day respectively. In contrast, this research applied a single day discount. This restriction </w:t>
+      </w:r>
+      <w:r>
+        <w:rPr>
+          <w:sz w:val="20"/>
+          <w:szCs w:val="20"/>
+        </w:rPr>
+        <w:t>correspondents</w:t>
+      </w:r>
+      <w:r>
+        <w:rPr>
+          <w:sz w:val="20"/>
+          <w:szCs w:val="20"/>
+        </w:rPr>
+        <w:t xml:space="preserve"> to Haijema’s D1 policy, which consistently yielded smaller </w:t>
+      </w:r>
+      <w:r>
+        <w:rPr>
+          <w:sz w:val="20"/>
+          <w:szCs w:val="20"/>
+        </w:rPr>
+        <w:t>profit gains. The finding that DP could not outperform FDC is therefore consistent with literature.</w:t>
       </w:r>
     </w:p>
     <w:p>
       <w:pPr>
+        <w:spacing w:after="0"/>
+        <w:ind w:firstLine="720"/>
         <w:jc w:val="both"/>
         <w:rPr>
           <w:sz w:val="20"/>
@@ -6835,192 +6906,48 @@
           <w:sz w:val="20"/>
           <w:szCs w:val="20"/>
         </w:rPr>
-        <w:t>Discount</w:t>
-      </w:r>
-      <w:r>
-        <w:rPr>
-          <w:sz w:val="20"/>
-          <w:szCs w:val="20"/>
-        </w:rPr>
-        <w:t xml:space="preserve">-induced demand is capped at the regular demand level, excluding new customers that are only attracted to discounted </w:t>
-      </w:r>
-      <w:r>
-        <w:rPr>
-          <w:sz w:val="20"/>
-          <w:szCs w:val="20"/>
-        </w:rPr>
-        <w:t>products.</w:t>
-      </w:r>
-      <w:r>
-        <w:rPr>
-          <w:sz w:val="20"/>
-          <w:szCs w:val="20"/>
-        </w:rPr>
-        <w:t xml:space="preserve"> In this model </w:t>
-      </w:r>
-      <w:r>
-        <w:rPr>
-          <w:sz w:val="20"/>
-          <w:szCs w:val="20"/>
-        </w:rPr>
-        <w:t>demand attracted by a discount can never exceed the regular daily demand for a product, since the discount can only reallocate the existing demand towards FEFO stock. However, in real</w:t>
-      </w:r>
-      <w:r>
-        <w:rPr>
-          <w:sz w:val="20"/>
-          <w:szCs w:val="20"/>
-        </w:rPr>
-        <w:t xml:space="preserve"> world </w:t>
-      </w:r>
-      <w:r>
-        <w:rPr>
-          <w:sz w:val="20"/>
-          <w:szCs w:val="20"/>
-        </w:rPr>
-        <w:t xml:space="preserve">markets a </w:t>
-      </w:r>
-      <w:proofErr w:type="spellStart"/>
-      <w:r>
-        <w:rPr>
-          <w:sz w:val="20"/>
-          <w:szCs w:val="20"/>
-        </w:rPr>
-        <w:t>sufficientlyt</w:t>
-      </w:r>
-      <w:proofErr w:type="spellEnd"/>
-      <w:r>
-        <w:rPr>
-          <w:sz w:val="20"/>
-          <w:szCs w:val="20"/>
-        </w:rPr>
-        <w:t xml:space="preserve"> high discount could </w:t>
-      </w:r>
-      <w:proofErr w:type="spellStart"/>
-      <w:r>
-        <w:rPr>
-          <w:sz w:val="20"/>
-          <w:szCs w:val="20"/>
-        </w:rPr>
-        <w:t>attracyt</w:t>
-      </w:r>
-      <w:proofErr w:type="spellEnd"/>
-      <w:r>
-        <w:rPr>
-          <w:sz w:val="20"/>
-          <w:szCs w:val="20"/>
-        </w:rPr>
-        <w:t xml:space="preserve"> </w:t>
-      </w:r>
-      <w:r>
-        <w:rPr>
-          <w:sz w:val="20"/>
-          <w:szCs w:val="20"/>
-        </w:rPr>
-        <w:t>customers that would otherwise have no</w:t>
-      </w:r>
-      <w:r>
-        <w:rPr>
-          <w:sz w:val="20"/>
-          <w:szCs w:val="20"/>
-        </w:rPr>
-        <w:t xml:space="preserve">t </w:t>
-      </w:r>
-      <w:r>
-        <w:rPr>
-          <w:sz w:val="20"/>
-          <w:szCs w:val="20"/>
-        </w:rPr>
-        <w:t>bought this product</w:t>
-      </w:r>
-      <w:r>
-        <w:rPr>
-          <w:sz w:val="20"/>
-          <w:szCs w:val="20"/>
-        </w:rPr>
-        <w:t>. The absence of a</w:t>
-      </w:r>
-      <w:r>
-        <w:rPr>
-          <w:sz w:val="20"/>
-          <w:szCs w:val="20"/>
-        </w:rPr>
-        <w:t xml:space="preserve">n price-elasticity parameter </w:t>
-      </w:r>
-      <w:proofErr w:type="spellStart"/>
-      <w:r>
-        <w:rPr>
-          <w:sz w:val="20"/>
-          <w:szCs w:val="20"/>
-        </w:rPr>
-        <w:t>sucg</w:t>
-      </w:r>
-      <w:proofErr w:type="spellEnd"/>
-      <w:r>
-        <w:rPr>
-          <w:sz w:val="20"/>
-          <w:szCs w:val="20"/>
-        </w:rPr>
-        <w:t xml:space="preserve"> as the one in </w:t>
-      </w:r>
-      <w:r>
-        <w:rPr>
-          <w:rFonts w:ascii="Aptos" w:eastAsia="Aptos" w:hAnsi="Aptos" w:cs="Aptos"/>
-          <w:sz w:val="20"/>
-          <w:szCs w:val="20"/>
-        </w:rPr>
-        <w:t>Hajima et al</w:t>
-      </w:r>
-      <w:r>
-        <w:rPr>
-          <w:rFonts w:ascii="Aptos" w:eastAsia="Aptos" w:hAnsi="Aptos" w:cs="Aptos"/>
-          <w:sz w:val="20"/>
-          <w:szCs w:val="20"/>
-        </w:rPr>
-        <w:t xml:space="preserve"> imposes a structural ceiling </w:t>
-      </w:r>
-      <w:r>
-        <w:rPr>
-          <w:rFonts w:ascii="Aptos" w:eastAsia="Aptos" w:hAnsi="Aptos" w:cs="Aptos"/>
-          <w:sz w:val="20"/>
-          <w:szCs w:val="20"/>
-        </w:rPr>
-        <w:t xml:space="preserve">on the profit and </w:t>
-      </w:r>
-      <w:r>
-        <w:rPr>
-          <w:rFonts w:ascii="Aptos" w:eastAsia="Aptos" w:hAnsi="Aptos" w:cs="Aptos"/>
-          <w:sz w:val="20"/>
-          <w:szCs w:val="20"/>
-        </w:rPr>
-        <w:t>waste reduction any</w:t>
-      </w:r>
-      <w:r>
-        <w:rPr>
-          <w:rFonts w:ascii="Aptos" w:eastAsia="Aptos" w:hAnsi="Aptos" w:cs="Aptos"/>
-          <w:sz w:val="20"/>
-          <w:szCs w:val="20"/>
-        </w:rPr>
-        <w:t xml:space="preserve"> discounting policy c</w:t>
-      </w:r>
-      <w:r>
-        <w:rPr>
-          <w:rFonts w:ascii="Aptos" w:eastAsia="Aptos" w:hAnsi="Aptos" w:cs="Aptos"/>
-          <w:sz w:val="20"/>
-          <w:szCs w:val="20"/>
-        </w:rPr>
-        <w:t>an achieve</w:t>
-      </w:r>
-      <w:r>
-        <w:rPr>
-          <w:rFonts w:ascii="Aptos" w:eastAsia="Aptos" w:hAnsi="Aptos" w:cs="Aptos"/>
-          <w:sz w:val="20"/>
-          <w:szCs w:val="20"/>
-        </w:rPr>
-        <w:t>.</w:t>
+        <w:t xml:space="preserve">The consumer behaviour model </w:t>
+      </w:r>
+      <w:r>
+        <w:rPr>
+          <w:sz w:val="20"/>
+          <w:szCs w:val="20"/>
+        </w:rPr>
+        <w:t>oversimplifies</w:t>
+      </w:r>
+      <w:r>
+        <w:rPr>
+          <w:sz w:val="20"/>
+          <w:szCs w:val="20"/>
+        </w:rPr>
+        <w:t xml:space="preserve"> how customers respond to </w:t>
+      </w:r>
+      <w:r>
+        <w:rPr>
+          <w:sz w:val="20"/>
+          <w:szCs w:val="20"/>
+        </w:rPr>
+        <w:t>discounts</w:t>
+      </w:r>
+      <w:r>
+        <w:rPr>
+          <w:sz w:val="20"/>
+          <w:szCs w:val="20"/>
+        </w:rPr>
+        <w:t>. The environment treats every customer a LEFO buyer. Once a discount is applied</w:t>
+      </w:r>
+      <w:r>
+        <w:rPr>
+          <w:sz w:val="20"/>
+          <w:szCs w:val="20"/>
+        </w:rPr>
+        <w:t>, the amount FEFO buyers is proportional to the amount of discount given. In the paper of Haijema et al. the model instead introduces a sensitivity parameter, governing what fraction of LEFO customers respond to a given discount level. The absence of such parameter in the model provided in the paper, means that discount responsiveness is uniform across all LEFO customers, which is unlikely to hold in practice.</w:t>
       </w:r>
     </w:p>
     <w:p>
       <w:pPr>
+        <w:spacing w:after="0"/>
+        <w:ind w:firstLine="720"/>
         <w:jc w:val="both"/>
         <w:rPr>
           <w:sz w:val="20"/>
@@ -7032,179 +6959,187 @@
           <w:sz w:val="20"/>
           <w:szCs w:val="20"/>
         </w:rPr>
-        <w:t xml:space="preserve">TD’s contribution lies in computational efficiency rather than </w:t>
-      </w:r>
-      <w:r>
-        <w:rPr>
-          <w:sz w:val="20"/>
-          <w:szCs w:val="20"/>
-        </w:rPr>
-        <w:t xml:space="preserve">policy quality. </w:t>
-      </w:r>
-      <w:r>
-        <w:rPr>
-          <w:sz w:val="20"/>
-          <w:szCs w:val="20"/>
-        </w:rPr>
-        <w:t>Although</w:t>
-      </w:r>
-      <w:r>
-        <w:rPr>
-          <w:sz w:val="20"/>
-          <w:szCs w:val="20"/>
-        </w:rPr>
-        <w:t xml:space="preserve"> TD did not outperform </w:t>
-      </w:r>
-      <w:r>
-        <w:rPr>
-          <w:sz w:val="20"/>
-          <w:szCs w:val="20"/>
-        </w:rPr>
-        <w:t>FDC</w:t>
-      </w:r>
-      <w:r>
-        <w:rPr>
-          <w:sz w:val="20"/>
-          <w:szCs w:val="20"/>
-        </w:rPr>
-        <w:t xml:space="preserve">, </w:t>
-      </w:r>
-      <w:r>
-        <w:rPr>
-          <w:sz w:val="20"/>
-          <w:szCs w:val="20"/>
-        </w:rPr>
-        <w:t>it appro</w:t>
-      </w:r>
-      <w:r>
-        <w:rPr>
-          <w:sz w:val="20"/>
-          <w:szCs w:val="20"/>
-        </w:rPr>
-        <w:t xml:space="preserve">ached the values closely and could possibly proof </w:t>
-      </w:r>
-      <w:r>
-        <w:rPr>
-          <w:sz w:val="20"/>
-          <w:szCs w:val="20"/>
-        </w:rPr>
-        <w:t>its</w:t>
-      </w:r>
-      <w:r>
-        <w:rPr>
-          <w:sz w:val="20"/>
-          <w:szCs w:val="20"/>
-        </w:rPr>
-        <w:t xml:space="preserve"> usefulness in more challenging environments where DP </w:t>
-      </w:r>
-      <w:r>
-        <w:rPr>
-          <w:sz w:val="20"/>
-          <w:szCs w:val="20"/>
-        </w:rPr>
-        <w:t xml:space="preserve">run times would </w:t>
-      </w:r>
-      <w:r>
-        <w:rPr>
-          <w:sz w:val="20"/>
-          <w:szCs w:val="20"/>
-        </w:rPr>
-        <w:t xml:space="preserve">grow </w:t>
-      </w:r>
-      <w:r>
-        <w:rPr>
-          <w:sz w:val="20"/>
-          <w:szCs w:val="20"/>
-        </w:rPr>
-        <w:t>exponentially</w:t>
-      </w:r>
-      <w:r>
-        <w:rPr>
-          <w:sz w:val="20"/>
-          <w:szCs w:val="20"/>
-        </w:rPr>
-        <w:t xml:space="preserve"> and FDC approaches could potentially be outperformed. These findings are </w:t>
-      </w:r>
-      <w:r>
-        <w:rPr>
-          <w:sz w:val="20"/>
-          <w:szCs w:val="20"/>
-        </w:rPr>
-        <w:t xml:space="preserve">consistent with </w:t>
-      </w:r>
-      <w:r>
-        <w:rPr>
-          <w:sz w:val="20"/>
-          <w:szCs w:val="20"/>
-        </w:rPr>
-        <w:t>Yavuz and Kaya (2024), who reported that Deep Q-learning and Sof</w:t>
-      </w:r>
-      <w:r>
-        <w:rPr>
-          <w:sz w:val="20"/>
-          <w:szCs w:val="20"/>
-        </w:rPr>
-        <w:t xml:space="preserve">t Actor Critic approaches </w:t>
-      </w:r>
-      <w:r>
-        <w:rPr>
-          <w:sz w:val="20"/>
-          <w:szCs w:val="20"/>
-        </w:rPr>
-        <w:t xml:space="preserve">reached </w:t>
-      </w:r>
-      <w:r>
-        <w:rPr>
-          <w:sz w:val="20"/>
-          <w:szCs w:val="20"/>
-        </w:rPr>
-        <w:t xml:space="preserve">~95-97% of DP’s reward while requiring substantially less computation as the state space grows. This </w:t>
-      </w:r>
-      <w:r>
-        <w:rPr>
-          <w:sz w:val="20"/>
-          <w:szCs w:val="20"/>
-        </w:rPr>
-        <w:t xml:space="preserve">indicates that TD is the more practical choice </w:t>
-      </w:r>
-      <w:r>
-        <w:rPr>
-          <w:sz w:val="20"/>
-          <w:szCs w:val="20"/>
-        </w:rPr>
-        <w:t>wit</w:t>
-      </w:r>
-      <w:r>
-        <w:rPr>
-          <w:sz w:val="20"/>
-          <w:szCs w:val="20"/>
-        </w:rPr>
-        <w:t>h a policy that wa</w:t>
-      </w:r>
-      <w:r>
-        <w:rPr>
-          <w:sz w:val="20"/>
-          <w:szCs w:val="20"/>
-        </w:rPr>
-        <w:t xml:space="preserve">s almost as good as DP, but </w:t>
-      </w:r>
-      <w:r>
-        <w:rPr>
-          <w:sz w:val="20"/>
-          <w:szCs w:val="20"/>
-        </w:rPr>
-        <w:t xml:space="preserve">much </w:t>
-      </w:r>
-      <w:r>
-        <w:rPr>
-          <w:sz w:val="20"/>
-          <w:szCs w:val="20"/>
-        </w:rPr>
-        <w:t>faster.</w:t>
+        <w:t>Discount</w:t>
+      </w:r>
+      <w:r>
+        <w:rPr>
+          <w:sz w:val="20"/>
+          <w:szCs w:val="20"/>
+        </w:rPr>
+        <w:t xml:space="preserve">-induced demand is capped at the regular demand level, excluding new customers that are only attracted to discounted </w:t>
+      </w:r>
+      <w:r>
+        <w:rPr>
+          <w:sz w:val="20"/>
+          <w:szCs w:val="20"/>
+        </w:rPr>
+        <w:t xml:space="preserve">products. </w:t>
+      </w:r>
+      <w:r>
+        <w:rPr>
+          <w:sz w:val="20"/>
+          <w:szCs w:val="20"/>
+        </w:rPr>
+        <w:t xml:space="preserve">In this model </w:t>
+      </w:r>
+      <w:r>
+        <w:rPr>
+          <w:sz w:val="20"/>
+          <w:szCs w:val="20"/>
+        </w:rPr>
+        <w:t>demand attracted by a discount can never exceed the regular daily demand for a product, since the discount can only reallocate the existing demand towards FEFO stock. However, in real</w:t>
+      </w:r>
+      <w:r>
+        <w:rPr>
+          <w:sz w:val="20"/>
+          <w:szCs w:val="20"/>
+        </w:rPr>
+        <w:t xml:space="preserve"> world </w:t>
+      </w:r>
+      <w:r>
+        <w:rPr>
+          <w:sz w:val="20"/>
+          <w:szCs w:val="20"/>
+        </w:rPr>
+        <w:t xml:space="preserve">markets a </w:t>
+      </w:r>
+      <w:r>
+        <w:rPr>
+          <w:sz w:val="20"/>
+          <w:szCs w:val="20"/>
+        </w:rPr>
+        <w:t>sufficiently</w:t>
+      </w:r>
+      <w:r>
+        <w:rPr>
+          <w:sz w:val="20"/>
+          <w:szCs w:val="20"/>
+        </w:rPr>
+        <w:t xml:space="preserve"> high discount could </w:t>
+      </w:r>
+      <w:r>
+        <w:rPr>
+          <w:sz w:val="20"/>
+          <w:szCs w:val="20"/>
+        </w:rPr>
+        <w:t>attract</w:t>
+      </w:r>
+      <w:r>
+        <w:rPr>
+          <w:sz w:val="20"/>
+          <w:szCs w:val="20"/>
+        </w:rPr>
+        <w:t xml:space="preserve"> </w:t>
+      </w:r>
+      <w:r>
+        <w:rPr>
+          <w:sz w:val="20"/>
+          <w:szCs w:val="20"/>
+        </w:rPr>
+        <w:t>customers that would otherwise have no</w:t>
+      </w:r>
+      <w:r>
+        <w:rPr>
+          <w:sz w:val="20"/>
+          <w:szCs w:val="20"/>
+        </w:rPr>
+        <w:t xml:space="preserve">t </w:t>
+      </w:r>
+      <w:r>
+        <w:rPr>
+          <w:sz w:val="20"/>
+          <w:szCs w:val="20"/>
+        </w:rPr>
+        <w:t>bought this product</w:t>
+      </w:r>
+      <w:r>
+        <w:rPr>
+          <w:sz w:val="20"/>
+          <w:szCs w:val="20"/>
+        </w:rPr>
+        <w:t>. The absence of a</w:t>
+      </w:r>
+      <w:r>
+        <w:rPr>
+          <w:sz w:val="20"/>
+          <w:szCs w:val="20"/>
+        </w:rPr>
+        <w:t xml:space="preserve">n price-elasticity parameter </w:t>
+      </w:r>
+      <w:r>
+        <w:rPr>
+          <w:sz w:val="20"/>
+          <w:szCs w:val="20"/>
+        </w:rPr>
+        <w:t>such</w:t>
+      </w:r>
+      <w:r>
+        <w:rPr>
+          <w:sz w:val="20"/>
+          <w:szCs w:val="20"/>
+        </w:rPr>
+        <w:t xml:space="preserve"> as the one in </w:t>
+      </w:r>
+      <w:r>
+        <w:rPr>
+          <w:rFonts w:ascii="Aptos" w:eastAsia="Aptos" w:hAnsi="Aptos" w:cs="Aptos"/>
+          <w:sz w:val="20"/>
+          <w:szCs w:val="20"/>
+        </w:rPr>
+        <w:t>Hajima et al</w:t>
+      </w:r>
+      <w:r>
+        <w:rPr>
+          <w:rFonts w:ascii="Aptos" w:eastAsia="Aptos" w:hAnsi="Aptos" w:cs="Aptos"/>
+          <w:sz w:val="20"/>
+          <w:szCs w:val="20"/>
+        </w:rPr>
+        <w:t xml:space="preserve"> imposes a structural ceiling </w:t>
+      </w:r>
+      <w:r>
+        <w:rPr>
+          <w:rFonts w:ascii="Aptos" w:eastAsia="Aptos" w:hAnsi="Aptos" w:cs="Aptos"/>
+          <w:sz w:val="20"/>
+          <w:szCs w:val="20"/>
+        </w:rPr>
+        <w:t xml:space="preserve">on the profit and </w:t>
+      </w:r>
+      <w:r>
+        <w:rPr>
+          <w:rFonts w:ascii="Aptos" w:eastAsia="Aptos" w:hAnsi="Aptos" w:cs="Aptos"/>
+          <w:sz w:val="20"/>
+          <w:szCs w:val="20"/>
+        </w:rPr>
+        <w:t>waste reduction any</w:t>
+      </w:r>
+      <w:r>
+        <w:rPr>
+          <w:rFonts w:ascii="Aptos" w:eastAsia="Aptos" w:hAnsi="Aptos" w:cs="Aptos"/>
+          <w:sz w:val="20"/>
+          <w:szCs w:val="20"/>
+        </w:rPr>
+        <w:t xml:space="preserve"> discounting policy c</w:t>
+      </w:r>
+      <w:r>
+        <w:rPr>
+          <w:rFonts w:ascii="Aptos" w:eastAsia="Aptos" w:hAnsi="Aptos" w:cs="Aptos"/>
+          <w:sz w:val="20"/>
+          <w:szCs w:val="20"/>
+        </w:rPr>
+        <w:t>an achieve</w:t>
+      </w:r>
+      <w:r>
+        <w:rPr>
+          <w:rFonts w:ascii="Aptos" w:eastAsia="Aptos" w:hAnsi="Aptos" w:cs="Aptos"/>
+          <w:sz w:val="20"/>
+          <w:szCs w:val="20"/>
+        </w:rPr>
+        <w:t>.</w:t>
       </w:r>
     </w:p>
     <w:p>
       <w:pPr>
+        <w:spacing w:after="0"/>
         <w:jc w:val="both"/>
         <w:rPr>
           <w:sz w:val="20"/>
@@ -7216,11 +7151,188 @@
           <w:sz w:val="20"/>
           <w:szCs w:val="20"/>
         </w:rPr>
-        <w:t xml:space="preserve">The strength of this study was </w:t>
+        <w:t xml:space="preserve">TD’s contribution lies in computational efficiency rather than policy </w:t>
+      </w:r>
+      <w:r>
+        <w:rPr>
+          <w:sz w:val="20"/>
+          <w:szCs w:val="20"/>
+        </w:rPr>
+        <w:t xml:space="preserve">quality. </w:t>
+      </w:r>
+      <w:r>
+        <w:rPr>
+          <w:sz w:val="20"/>
+          <w:szCs w:val="20"/>
+        </w:rPr>
+        <w:t>Although</w:t>
+      </w:r>
+      <w:r>
+        <w:rPr>
+          <w:sz w:val="20"/>
+          <w:szCs w:val="20"/>
+        </w:rPr>
+        <w:t xml:space="preserve"> TD did not outperform </w:t>
+      </w:r>
+      <w:r>
+        <w:rPr>
+          <w:sz w:val="20"/>
+          <w:szCs w:val="20"/>
+        </w:rPr>
+        <w:t>FDC</w:t>
+      </w:r>
+      <w:r>
+        <w:rPr>
+          <w:sz w:val="20"/>
+          <w:szCs w:val="20"/>
+        </w:rPr>
+        <w:t xml:space="preserve">, </w:t>
+      </w:r>
+      <w:r>
+        <w:rPr>
+          <w:sz w:val="20"/>
+          <w:szCs w:val="20"/>
+        </w:rPr>
+        <w:t>it appro</w:t>
+      </w:r>
+      <w:r>
+        <w:rPr>
+          <w:sz w:val="20"/>
+          <w:szCs w:val="20"/>
+        </w:rPr>
+        <w:t xml:space="preserve">ached the values closely and could possibly proof </w:t>
+      </w:r>
+      <w:r>
+        <w:rPr>
+          <w:sz w:val="20"/>
+          <w:szCs w:val="20"/>
+        </w:rPr>
+        <w:t>its</w:t>
+      </w:r>
+      <w:r>
+        <w:rPr>
+          <w:sz w:val="20"/>
+          <w:szCs w:val="20"/>
+        </w:rPr>
+        <w:t xml:space="preserve"> usefulness in more challenging environments where DP </w:t>
+      </w:r>
+      <w:r>
+        <w:rPr>
+          <w:sz w:val="20"/>
+          <w:szCs w:val="20"/>
+        </w:rPr>
+        <w:t xml:space="preserve">run times would </w:t>
+      </w:r>
+      <w:r>
+        <w:rPr>
+          <w:sz w:val="20"/>
+          <w:szCs w:val="20"/>
+        </w:rPr>
+        <w:t xml:space="preserve">grow </w:t>
+      </w:r>
+      <w:r>
+        <w:rPr>
+          <w:sz w:val="20"/>
+          <w:szCs w:val="20"/>
+        </w:rPr>
+        <w:t>exponentially</w:t>
+      </w:r>
+      <w:r>
+        <w:rPr>
+          <w:sz w:val="20"/>
+          <w:szCs w:val="20"/>
+        </w:rPr>
+        <w:t xml:space="preserve"> and FDC approaches could potentially be outperformed. These findings are </w:t>
+      </w:r>
+      <w:r>
+        <w:rPr>
+          <w:sz w:val="20"/>
+          <w:szCs w:val="20"/>
+        </w:rPr>
+        <w:t xml:space="preserve">consistent with </w:t>
+      </w:r>
+      <w:r>
+        <w:rPr>
+          <w:sz w:val="20"/>
+          <w:szCs w:val="20"/>
+        </w:rPr>
+        <w:t>Yavuz and Kaya (2024), who reported that Deep Q-learning and Sof</w:t>
+      </w:r>
+      <w:r>
+        <w:rPr>
+          <w:sz w:val="20"/>
+          <w:szCs w:val="20"/>
+        </w:rPr>
+        <w:t xml:space="preserve">t Actor Critic approaches </w:t>
+      </w:r>
+      <w:r>
+        <w:rPr>
+          <w:sz w:val="20"/>
+          <w:szCs w:val="20"/>
+        </w:rPr>
+        <w:t xml:space="preserve">reached </w:t>
+      </w:r>
+      <w:r>
+        <w:rPr>
+          <w:sz w:val="20"/>
+          <w:szCs w:val="20"/>
+        </w:rPr>
+        <w:t xml:space="preserve">~95-97% of DP’s reward while requiring substantially less computation as the state space grows. This </w:t>
+      </w:r>
+      <w:r>
+        <w:rPr>
+          <w:sz w:val="20"/>
+          <w:szCs w:val="20"/>
+        </w:rPr>
+        <w:t xml:space="preserve">indicates that TD is the more practical choice </w:t>
+      </w:r>
+      <w:r>
+        <w:rPr>
+          <w:sz w:val="20"/>
+          <w:szCs w:val="20"/>
+        </w:rPr>
+        <w:t>wit</w:t>
+      </w:r>
+      <w:r>
+        <w:rPr>
+          <w:sz w:val="20"/>
+          <w:szCs w:val="20"/>
+        </w:rPr>
+        <w:t xml:space="preserve">h a policy that was </w:t>
+      </w:r>
+      <w:r>
+        <w:rPr>
+          <w:sz w:val="20"/>
+          <w:szCs w:val="20"/>
+        </w:rPr>
+        <w:t xml:space="preserve">almost as good as DP, but </w:t>
+      </w:r>
+      <w:r>
+        <w:rPr>
+          <w:sz w:val="20"/>
+          <w:szCs w:val="20"/>
+        </w:rPr>
+        <w:t xml:space="preserve">much </w:t>
+      </w:r>
+      <w:r>
+        <w:rPr>
+          <w:sz w:val="20"/>
+          <w:szCs w:val="20"/>
+        </w:rPr>
+        <w:t>faster.</w:t>
+      </w:r>
+      <w:r>
+        <w:rPr>
+          <w:sz w:val="20"/>
+          <w:szCs w:val="20"/>
+        </w:rPr>
+        <w:t xml:space="preserve"> </w:t>
       </w:r>
     </w:p>
     <w:p>
       <w:pPr>
+        <w:spacing w:after="0"/>
+        <w:ind w:firstLine="720"/>
         <w:jc w:val="both"/>
         <w:rPr>
           <w:sz w:val="20"/>
@@ -7232,15 +7344,351 @@
           <w:sz w:val="20"/>
           <w:szCs w:val="20"/>
         </w:rPr>
-        <w:t>EXTENSIONS</w:t>
+        <w:t>The strength of this study is the direct comparison method of an exact DP approach against model free approximated approaches, SARSA and Q-learning, while comparing this to a practical baseline (FDC) under identical environment assumptions, which isolated computation time as the deciding factor between DP and TD once their policy quality is shown to be statistically equivalent. The biggest weakness of this study was the single day discount restriction, the uniform LEFO response assumption and the extra demand mechanism, each of these constrains the profit and waste improvements achievable in any method and could have shown the real strengths of TD performance over the FDC. Another limitation was the manual hyperparameter tuning and the small amounts of seeds that was tested. A more exhaustive or automative search might have narrowed the gap between TD and DP.</w:t>
       </w:r>
     </w:p>
     <w:p>
       <w:pPr>
+        <w:spacing w:after="0"/>
+        <w:ind w:firstLine="720"/>
+        <w:jc w:val="both"/>
+        <w:rPr>
+          <w:sz w:val="20"/>
+          <w:szCs w:val="20"/>
+        </w:rPr>
+      </w:pPr>
+      <w:r>
+        <w:rPr>
+          <w:sz w:val="20"/>
+          <w:szCs w:val="20"/>
+        </w:rPr>
+        <w:t xml:space="preserve">Three extensions follow directly from the limitations above. First, extending the action space to two simultaneous discount levels. Second, introducing a sensitivity parameter governing what fraction </w:t>
+      </w:r>
+      <w:r>
+        <w:rPr>
+          <w:sz w:val="20"/>
+          <w:szCs w:val="20"/>
+        </w:rPr>
+        <w:t>LEFO</w:t>
+      </w:r>
+      <w:r>
+        <w:rPr>
+          <w:sz w:val="20"/>
+          <w:szCs w:val="20"/>
+        </w:rPr>
+        <w:t xml:space="preserve"> customers respond to discount level would test whether the assumption of a uniform discount responsiveness is itself responsible for the limited gains observed here. Third introducing a price-elasticity term that generates demand proportional to the discount level, independent of the regular demand level, would test if absence of new discount-attracted customers is responsible for the limited profit ceiling observed in this study. All three extensions can be implemented in the existing environment without modifying the Environment class, allowing to subsequently study the separate effects.</w:t>
+      </w:r>
+    </w:p>
+    <w:p>
+      <w:pPr>
+        <w:spacing w:after="0"/>
+        <w:ind w:firstLine="720"/>
+        <w:jc w:val="both"/>
+        <w:rPr>
+          <w:sz w:val="20"/>
+          <w:szCs w:val="20"/>
+        </w:rPr>
+      </w:pPr>
+    </w:p>
+    <w:p>
+      <w:pPr>
+        <w:ind w:firstLine="720"/>
+        <w:jc w:val="both"/>
+        <w:rPr>
+          <w:sz w:val="20"/>
+          <w:szCs w:val="20"/>
+        </w:rPr>
+      </w:pPr>
+    </w:p>
+    <w:p>
+      <w:pPr>
         <w:pStyle w:val="Heading1"/>
       </w:pPr>
       <w:r>
         <w:t>Conclusion</w:t>
+      </w:r>
+    </w:p>
+    <w:p>
+      <w:pPr>
+        <w:rPr>
+          <w:sz w:val="20"/>
+          <w:szCs w:val="20"/>
+        </w:rPr>
+      </w:pPr>
+      <w:r>
+        <w:rPr>
+          <w:sz w:val="20"/>
+          <w:szCs w:val="20"/>
+        </w:rPr>
+        <w:t>To</w:t>
+      </w:r>
+      <w:r>
+        <w:rPr>
+          <w:sz w:val="20"/>
+          <w:szCs w:val="20"/>
+        </w:rPr>
+        <w:t xml:space="preserve"> answer the main </w:t>
+      </w:r>
+      <w:r>
+        <w:rPr>
+          <w:sz w:val="20"/>
+          <w:szCs w:val="20"/>
+        </w:rPr>
+        <w:t>research</w:t>
+      </w:r>
+      <w:r>
+        <w:rPr>
+          <w:sz w:val="20"/>
+          <w:szCs w:val="20"/>
+        </w:rPr>
+        <w:t xml:space="preserve"> </w:t>
+      </w:r>
+      <w:r>
+        <w:rPr>
+          <w:sz w:val="20"/>
+          <w:szCs w:val="20"/>
+        </w:rPr>
+        <w:t>question</w:t>
+      </w:r>
+      <w:r>
+        <w:rPr>
+          <w:sz w:val="20"/>
+          <w:szCs w:val="20"/>
+        </w:rPr>
+        <w:t>,</w:t>
+      </w:r>
+      <w:r>
+        <w:rPr>
+          <w:sz w:val="20"/>
+          <w:szCs w:val="20"/>
+        </w:rPr>
+        <w:t xml:space="preserve"> </w:t>
+      </w:r>
+      <w:r>
+        <w:rPr>
+          <w:sz w:val="20"/>
+          <w:szCs w:val="20"/>
+        </w:rPr>
+        <w:t>"What are the profit and waste benefits if expiratory products are dynamically priced, compared to a fixed discount?"</w:t>
+      </w:r>
+      <w:r>
+        <w:rPr>
+          <w:sz w:val="20"/>
+          <w:szCs w:val="20"/>
+        </w:rPr>
+        <w:t>, within the scope of this study, there are</w:t>
+      </w:r>
+      <w:r>
+        <w:rPr>
+          <w:sz w:val="20"/>
+          <w:szCs w:val="20"/>
+        </w:rPr>
+        <w:t xml:space="preserve"> n</w:t>
+      </w:r>
+      <w:r>
+        <w:rPr>
+          <w:sz w:val="20"/>
+          <w:szCs w:val="20"/>
+        </w:rPr>
+        <w:t>o</w:t>
+      </w:r>
+      <w:r>
+        <w:rPr>
+          <w:sz w:val="20"/>
+          <w:szCs w:val="20"/>
+        </w:rPr>
+        <w:t xml:space="preserve"> benefits in dynamically pricing products. Neither DP </w:t>
+      </w:r>
+      <w:r>
+        <w:rPr>
+          <w:sz w:val="20"/>
+          <w:szCs w:val="20"/>
+        </w:rPr>
+        <w:t>or TD produced statically practically meaningful improvements over FDC in profit or waste</w:t>
+      </w:r>
+    </w:p>
+    <w:p>
+      <w:pPr>
+        <w:rPr>
+          <w:sz w:val="20"/>
+          <w:szCs w:val="20"/>
+        </w:rPr>
+      </w:pPr>
+      <w:r>
+        <w:rPr>
+          <w:sz w:val="20"/>
+          <w:szCs w:val="20"/>
+        </w:rPr>
+        <w:t>To answer the first sub question</w:t>
+      </w:r>
+      <w:r>
+        <w:rPr>
+          <w:sz w:val="20"/>
+          <w:szCs w:val="20"/>
+        </w:rPr>
+        <w:t>,</w:t>
+      </w:r>
+      <w:r>
+        <w:rPr>
+          <w:sz w:val="20"/>
+          <w:szCs w:val="20"/>
+        </w:rPr>
+        <w:t xml:space="preserve"> </w:t>
+      </w:r>
+      <w:r>
+        <w:rPr>
+          <w:sz w:val="20"/>
+          <w:szCs w:val="20"/>
+        </w:rPr>
+        <w:t>“</w:t>
+      </w:r>
+      <w:r>
+        <w:rPr>
+          <w:sz w:val="20"/>
+          <w:szCs w:val="20"/>
+        </w:rPr>
+        <w:t>Does any model produce a statistically and practically meaningful improvement in profit and waste reduction over FDC?</w:t>
+      </w:r>
+      <w:r>
+        <w:rPr>
+          <w:sz w:val="20"/>
+          <w:szCs w:val="20"/>
+        </w:rPr>
+        <w:t>”</w:t>
+      </w:r>
+      <w:r>
+        <w:rPr>
+          <w:sz w:val="20"/>
+          <w:szCs w:val="20"/>
+        </w:rPr>
+        <w:t xml:space="preserve"> DP showed no statistically </w:t>
+      </w:r>
+      <w:r>
+        <w:rPr>
+          <w:sz w:val="20"/>
+          <w:szCs w:val="20"/>
+        </w:rPr>
+        <w:t>significant improvement</w:t>
+      </w:r>
+      <w:r>
+        <w:rPr>
+          <w:sz w:val="20"/>
+          <w:szCs w:val="20"/>
+        </w:rPr>
+        <w:t xml:space="preserve"> </w:t>
+      </w:r>
+      <w:r>
+        <w:rPr>
+          <w:sz w:val="20"/>
+          <w:szCs w:val="20"/>
+        </w:rPr>
+        <w:t>over FDC on either matric</w:t>
+      </w:r>
+      <w:r>
+        <w:rPr>
+          <w:sz w:val="20"/>
+          <w:szCs w:val="20"/>
+        </w:rPr>
+        <w:t xml:space="preserve"> and TD performed significantly worse on profit, with its waste advantahe limited to small inventory state spaces</w:t>
+      </w:r>
+      <w:r>
+        <w:rPr>
+          <w:sz w:val="20"/>
+          <w:szCs w:val="20"/>
+        </w:rPr>
+        <w:t>.</w:t>
+      </w:r>
+    </w:p>
+    <w:p>
+      <w:pPr>
+        <w:rPr>
+          <w:sz w:val="20"/>
+          <w:szCs w:val="20"/>
+        </w:rPr>
+      </w:pPr>
+      <w:r>
+        <w:rPr>
+          <w:sz w:val="20"/>
+          <w:szCs w:val="20"/>
+        </w:rPr>
+        <w:t>To answer the second sub-question</w:t>
+      </w:r>
+      <w:r>
+        <w:rPr>
+          <w:sz w:val="20"/>
+          <w:szCs w:val="20"/>
+        </w:rPr>
+        <w:t xml:space="preserve">, </w:t>
+      </w:r>
+      <w:r>
+        <w:rPr>
+          <w:sz w:val="20"/>
+          <w:szCs w:val="20"/>
+        </w:rPr>
+        <w:t>“</w:t>
+      </w:r>
+      <w:r>
+        <w:rPr>
+          <w:sz w:val="20"/>
+          <w:szCs w:val="20"/>
+        </w:rPr>
+        <w:t>Among models that derive comparable policies, which is preferable once computational time is taken into account</w:t>
+      </w:r>
+      <w:r>
+        <w:rPr>
+          <w:sz w:val="20"/>
+          <w:szCs w:val="20"/>
+        </w:rPr>
+        <w:t xml:space="preserve">?” </w:t>
+      </w:r>
+      <w:r>
+        <w:rPr>
+          <w:sz w:val="20"/>
+          <w:szCs w:val="20"/>
+        </w:rPr>
+        <w:t xml:space="preserve">While </w:t>
+      </w:r>
+      <w:r>
+        <w:rPr>
+          <w:sz w:val="20"/>
+          <w:szCs w:val="20"/>
+        </w:rPr>
+        <w:t xml:space="preserve">underperforming a little, TD </w:t>
+      </w:r>
+      <w:r>
+        <w:rPr>
+          <w:sz w:val="20"/>
+          <w:szCs w:val="20"/>
+        </w:rPr>
+        <w:t xml:space="preserve">proved to </w:t>
+      </w:r>
+      <w:r>
+        <w:rPr>
+          <w:sz w:val="20"/>
+          <w:szCs w:val="20"/>
+        </w:rPr>
+        <w:t>be</w:t>
+      </w:r>
+      <w:r>
+        <w:rPr>
+          <w:sz w:val="20"/>
+          <w:szCs w:val="20"/>
+        </w:rPr>
+        <w:t xml:space="preserve"> </w:t>
+      </w:r>
+      <w:r>
+        <w:rPr>
+          <w:sz w:val="20"/>
+          <w:szCs w:val="20"/>
+        </w:rPr>
+        <w:t>computationally more efficient</w:t>
+      </w:r>
+      <w:r>
+        <w:rPr>
+          <w:sz w:val="20"/>
+          <w:szCs w:val="20"/>
+        </w:rPr>
+        <w:t>.</w:t>
       </w:r>
     </w:p>
     <w:p>
@@ -7278,6 +7726,45 @@
 </w:document>
 </file>
 
+<file path=word/comments.xml><?xml version="1.0" encoding="utf-8"?>
+<w:comments xmlns:wpc="http://schemas.microsoft.com/office/word/2010/wordprocessingCanvas" xmlns:cx="http://schemas.microsoft.com/office/drawing/2014/chartex" xmlns:cx1="http://schemas.microsoft.com/office/drawing/2015/9/8/chartex" xmlns:cx2="http://schemas.microsoft.com/office/drawing/2015/10/21/chartex" xmlns:cx3="http://schemas.microsoft.com/office/drawing/2016/5/9/chartex" xmlns:cx4="http://schemas.microsoft.com/office/drawing/2016/5/10/chartex" xmlns:cx5="http://schemas.microsoft.com/office/drawing/2016/5/11/chartex" xmlns:cx6="http://schemas.microsoft.com/office/drawing/2016/5/12/chartex" xmlns:cx7="http://schemas.microsoft.com/office/drawing/2016/5/13/chartex" xmlns:cx8="http://schemas.microsoft.com/office/drawing/2016/5/14/chartex" xmlns:mc="http://schemas.openxmlformats.org/markup-compatibility/2006" xmlns:aink="http://schemas.microsoft.com/office/drawing/2016/ink" xmlns:am3d="http://schemas.microsoft.com/office/drawing/2017/model3d" xmlns:o="urn:schemas-microsoft-com:office:office" xmlns:oel="http://schemas.microsoft.com/office/2019/extlst" xmlns:r="http://schemas.openxmlformats.org/officeDocument/2006/relationships" xmlns:m="http://schemas.openxmlformats.org/officeDocument/2006/math" xmlns:v="urn:schemas-microsoft-com:vml" xmlns:wp14="http://schemas.microsoft.com/office/word/2010/wordprocessingDrawing" xmlns:wp="http://schemas.openxmlformats.org/drawingml/2006/wordprocessingDrawing" xmlns:w10="urn:schemas-microsoft-com:office:word" xmlns:w="http://schemas.openxmlformats.org/wordprocessingml/2006/main" xmlns:w14="http://schemas.microsoft.com/office/word/2010/wordml" xmlns:w15="http://schemas.microsoft.com/office/word/2012/wordml" xmlns:w16cex="http://schemas.microsoft.com/office/word/2018/wordml/cex" xmlns:w16cid="http://schemas.microsoft.com/office/word/2016/wordml/cid" xmlns:w16="http://schemas.microsoft.com/office/word/2018/wordml" xmlns:w16du="http://schemas.microsoft.com/office/word/2023/wordml/word16du" xmlns:w16sdtdh="http://schemas.microsoft.com/office/word/2020/wordml/sdtdatahash" xmlns:w16sdtfl="http://schemas.microsoft.com/office/word/2024/wordml/sdtformatlock" xmlns:w16se="http://schemas.microsoft.com/office/word/2015/wordml/symex" xmlns:wpg="http://schemas.microsoft.com/office/word/2010/wordprocessingGroup" xmlns:wpi="http://schemas.microsoft.com/office/word/2010/wordprocessingInk" xmlns:wne="http://schemas.microsoft.com/office/word/2006/wordml" xmlns:wps="http://schemas.microsoft.com/office/word/2010/wordprocessingShape" mc:Ignorable="w14 w15 w16se w16cid w16 w16cex w16sdtdh w16sdtfl w16du wp14">
+  <w:comment w:id="0" w:author="Widdershoven, Jochem" w:date="2026-06-24T15:33:00Z" w:initials="JW">
+    <w:p>
+      <w:pPr>
+        <w:pStyle w:val="CommentText"/>
+      </w:pPr>
+      <w:r>
+        <w:rPr>
+          <w:rStyle w:val="CommentReference"/>
+        </w:rPr>
+        <w:annotationRef/>
+      </w:r>
+      <w:r>
+        <w:t>Add machine</w:t>
+      </w:r>
+    </w:p>
+  </w:comment>
+</w:comments>
+</file>
+
+<file path=word/commentsExtended.xml><?xml version="1.0" encoding="utf-8"?>
+<w15:commentsEx xmlns:wpc="http://schemas.microsoft.com/office/word/2010/wordprocessingCanvas" xmlns:cx="http://schemas.microsoft.com/office/drawing/2014/chartex" xmlns:cx1="http://schemas.microsoft.com/office/drawing/2015/9/8/chartex" xmlns:cx2="http://schemas.microsoft.com/office/drawing/2015/10/21/chartex" xmlns:cx3="http://schemas.microsoft.com/office/drawing/2016/5/9/chartex" xmlns:cx4="http://schemas.microsoft.com/office/drawing/2016/5/10/chartex" xmlns:cx5="http://schemas.microsoft.com/office/drawing/2016/5/11/chartex" xmlns:cx6="http://schemas.microsoft.com/office/drawing/2016/5/12/chartex" xmlns:cx7="http://schemas.microsoft.com/office/drawing/2016/5/13/chartex" xmlns:cx8="http://schemas.microsoft.com/office/drawing/2016/5/14/chartex" xmlns:mc="http://schemas.openxmlformats.org/markup-compatibility/2006" xmlns:aink="http://schemas.microsoft.com/office/drawing/2016/ink" xmlns:am3d="http://schemas.microsoft.com/office/drawing/2017/model3d" xmlns:o="urn:schemas-microsoft-com:office:office" xmlns:oel="http://schemas.microsoft.com/office/2019/extlst" xmlns:r="http://schemas.openxmlformats.org/officeDocument/2006/relationships" xmlns:m="http://schemas.openxmlformats.org/officeDocument/2006/math" xmlns:v="urn:schemas-microsoft-com:vml" xmlns:wp14="http://schemas.microsoft.com/office/word/2010/wordprocessingDrawing" xmlns:wp="http://schemas.openxmlformats.org/drawingml/2006/wordprocessingDrawing" xmlns:w10="urn:schemas-microsoft-com:office:word" xmlns:w="http://schemas.openxmlformats.org/wordprocessingml/2006/main" xmlns:w14="http://schemas.microsoft.com/office/word/2010/wordml" xmlns:w15="http://schemas.microsoft.com/office/word/2012/wordml" xmlns:w16cex="http://schemas.microsoft.com/office/word/2018/wordml/cex" xmlns:w16cid="http://schemas.microsoft.com/office/word/2016/wordml/cid" xmlns:w16="http://schemas.microsoft.com/office/word/2018/wordml" xmlns:w16du="http://schemas.microsoft.com/office/word/2023/wordml/word16du" xmlns:w16sdtdh="http://schemas.microsoft.com/office/word/2020/wordml/sdtdatahash" xmlns:w16sdtfl="http://schemas.microsoft.com/office/word/2024/wordml/sdtformatlock" xmlns:w16se="http://schemas.microsoft.com/office/word/2015/wordml/symex" xmlns:wpg="http://schemas.microsoft.com/office/word/2010/wordprocessingGroup" xmlns:wpi="http://schemas.microsoft.com/office/word/2010/wordprocessingInk" xmlns:wne="http://schemas.microsoft.com/office/word/2006/wordml" xmlns:wps="http://schemas.microsoft.com/office/word/2010/wordprocessingShape" mc:Ignorable="w14 w15 w16se w16cid w16 w16cex w16sdtdh w16sdtfl w16du wp14">
+  <w15:commentEx w15:paraId="1F736A50" w15:done="0"/>
+</w15:commentsEx>
+</file>
+
+<file path=word/commentsExtensible.xml><?xml version="1.0" encoding="utf-8"?>
+<w16cex:commentsExtensible xmlns:wpc="http://schemas.microsoft.com/office/word/2010/wordprocessingCanvas" xmlns:cx="http://schemas.microsoft.com/office/drawing/2014/chartex" xmlns:cx1="http://schemas.microsoft.com/office/drawing/2015/9/8/chartex" xmlns:cx2="http://schemas.microsoft.com/office/drawing/2015/10/21/chartex" xmlns:cx3="http://schemas.microsoft.com/office/drawing/2016/5/9/chartex" xmlns:cx4="http://schemas.microsoft.com/office/drawing/2016/5/10/chartex" xmlns:cx5="http://schemas.microsoft.com/office/drawing/2016/5/11/chartex" xmlns:cx6="http://schemas.microsoft.com/office/drawing/2016/5/12/chartex" xmlns:cx7="http://schemas.microsoft.com/office/drawing/2016/5/13/chartex" xmlns:cx8="http://schemas.microsoft.com/office/drawing/2016/5/14/chartex" xmlns:cr="http://schemas.microsoft.com/office/comments/2020/reactions" xmlns:mc="http://schemas.openxmlformats.org/markup-compatibility/2006" xmlns:aink="http://schemas.microsoft.com/office/drawing/2016/ink" xmlns:am3d="http://schemas.microsoft.com/office/drawing/2017/model3d" xmlns:o="urn:schemas-microsoft-com:office:office" xmlns:oel="http://schemas.microsoft.com/office/2019/extlst" xmlns:r="http://schemas.openxmlformats.org/officeDocument/2006/relationships" xmlns:m="http://schemas.openxmlformats.org/officeDocument/2006/math" xmlns:v="urn:schemas-microsoft-com:vml" xmlns:wp14="http://schemas.microsoft.com/office/word/2010/wordprocessingDrawing" xmlns:wp="http://schemas.openxmlformats.org/drawingml/2006/wordprocessingDrawing" xmlns:w10="urn:schemas-microsoft-com:office:word" xmlns:w="http://schemas.openxmlformats.org/wordprocessingml/2006/main" xmlns:w14="http://schemas.microsoft.com/office/word/2010/wordml" xmlns:w15="http://schemas.microsoft.com/office/word/2012/wordml" xmlns:w16cex="http://schemas.microsoft.com/office/word/2018/wordml/cex" xmlns:w16cid="http://schemas.microsoft.com/office/word/2016/wordml/cid" xmlns:w16="http://schemas.microsoft.com/office/word/2018/wordml" xmlns:w16du="http://schemas.microsoft.com/office/word/2023/wordml/word16du" xmlns:w16sdtdh="http://schemas.microsoft.com/office/word/2020/wordml/sdtdatahash" xmlns:w16sdtfl="http://schemas.microsoft.com/office/word/2024/wordml/sdtformatlock" xmlns:w16se="http://schemas.microsoft.com/office/word/2015/wordml/symex" xmlns:wpg="http://schemas.microsoft.com/office/word/2010/wordprocessingGroup" xmlns:wpi="http://schemas.microsoft.com/office/word/2010/wordprocessingInk" xmlns:wne="http://schemas.microsoft.com/office/word/2006/wordml" xmlns:wps="http://schemas.microsoft.com/office/word/2010/wordprocessingShape" mc:Ignorable="w14 w15 w16se w16cid w16 w16cex w16sdtdh w16sdtfl cr w16du wp14">
+  <w16cex:commentExtensible w16cex:durableId="6CA7BEDA" w16cex:dateUtc="2026-06-24T13:33:00Z"/>
+</w16cex:commentsExtensible>
+</file>
+
+<file path=word/commentsIds.xml><?xml version="1.0" encoding="utf-8"?>
+<w16cid:commentsIds xmlns:wpc="http://schemas.microsoft.com/office/word/2010/wordprocessingCanvas" xmlns:cx="http://schemas.microsoft.com/office/drawing/2014/chartex" xmlns:cx1="http://schemas.microsoft.com/office/drawing/2015/9/8/chartex" xmlns:cx2="http://schemas.microsoft.com/office/drawing/2015/10/21/chartex" xmlns:cx3="http://schemas.microsoft.com/office/drawing/2016/5/9/chartex" xmlns:cx4="http://schemas.microsoft.com/office/drawing/2016/5/10/chartex" xmlns:cx5="http://schemas.microsoft.com/office/drawing/2016/5/11/chartex" xmlns:cx6="http://schemas.microsoft.com/office/drawing/2016/5/12/chartex" xmlns:cx7="http://schemas.microsoft.com/office/drawing/2016/5/13/chartex" xmlns:cx8="http://schemas.microsoft.com/office/drawing/2016/5/14/chartex" xmlns:mc="http://schemas.openxmlformats.org/markup-compatibility/2006" xmlns:aink="http://schemas.microsoft.com/office/drawing/2016/ink" xmlns:am3d="http://schemas.microsoft.com/office/drawing/2017/model3d" xmlns:o="urn:schemas-microsoft-com:office:office" xmlns:oel="http://schemas.microsoft.com/office/2019/extlst" xmlns:r="http://schemas.openxmlformats.org/officeDocument/2006/relationships" xmlns:m="http://schemas.openxmlformats.org/officeDocument/2006/math" xmlns:v="urn:schemas-microsoft-com:vml" xmlns:wp14="http://schemas.microsoft.com/office/word/2010/wordprocessingDrawing" xmlns:wp="http://schemas.openxmlformats.org/drawingml/2006/wordprocessingDrawing" xmlns:w10="urn:schemas-microsoft-com:office:word" xmlns:w="http://schemas.openxmlformats.org/wordprocessingml/2006/main" xmlns:w14="http://schemas.microsoft.com/office/word/2010/wordml" xmlns:w15="http://schemas.microsoft.com/office/word/2012/wordml" xmlns:w16cex="http://schemas.microsoft.com/office/word/2018/wordml/cex" xmlns:w16cid="http://schemas.microsoft.com/office/word/2016/wordml/cid" xmlns:w16="http://schemas.microsoft.com/office/word/2018/wordml" xmlns:w16du="http://schemas.microsoft.com/office/word/2023/wordml/word16du" xmlns:w16sdtdh="http://schemas.microsoft.com/office/word/2020/wordml/sdtdatahash" xmlns:w16sdtfl="http://schemas.microsoft.com/office/word/2024/wordml/sdtformatlock" xmlns:w16se="http://schemas.microsoft.com/office/word/2015/wordml/symex" xmlns:wpg="http://schemas.microsoft.com/office/word/2010/wordprocessingGroup" xmlns:wpi="http://schemas.microsoft.com/office/word/2010/wordprocessingInk" xmlns:wne="http://schemas.microsoft.com/office/word/2006/wordml" xmlns:wps="http://schemas.microsoft.com/office/word/2010/wordprocessingShape" mc:Ignorable="w14 w15 w16se w16cid w16 w16cex w16sdtdh w16sdtfl w16du wp14">
+  <w16cid:commentId w16cid:paraId="1F736A50" w16cid:durableId="6CA7BEDA"/>
+</w16cid:commentsIds>
+</file>
+
 <file path=word/endnotes.xml><?xml version="1.0" encoding="utf-8"?>
 <w:endnotes xmlns:wpc="http://schemas.microsoft.com/office/word/2010/wordprocessingCanvas" xmlns:cx="http://schemas.microsoft.com/office/drawing/2014/chartex" xmlns:cx1="http://schemas.microsoft.com/office/drawing/2015/9/8/chartex" xmlns:cx2="http://schemas.microsoft.com/office/drawing/2015/10/21/chartex" xmlns:cx3="http://schemas.microsoft.com/office/drawing/2016/5/9/chartex" xmlns:cx4="http://schemas.microsoft.com/office/drawing/2016/5/10/chartex" xmlns:cx5="http://schemas.microsoft.com/office/drawing/2016/5/11/chartex" xmlns:cx6="http://schemas.microsoft.com/office/drawing/2016/5/12/chartex" xmlns:cx7="http://schemas.microsoft.com/office/drawing/2016/5/13/chartex" xmlns:cx8="http://schemas.microsoft.com/office/drawing/2016/5/14/chartex" xmlns:mc="http://schemas.openxmlformats.org/markup-compatibility/2006" xmlns:aink="http://schemas.microsoft.com/office/drawing/2016/ink" xmlns:am3d="http://schemas.microsoft.com/office/drawing/2017/model3d" xmlns:o="urn:schemas-microsoft-com:office:office" xmlns:oel="http://schemas.microsoft.com/office/2019/extlst" xmlns:r="http://schemas.openxmlformats.org/officeDocument/2006/relationships" xmlns:m="http://schemas.openxmlformats.org/officeDocument/2006/math" xmlns:v="urn:schemas-microsoft-com:vml" xmlns:wp14="http://schemas.microsoft.com/office/word/2010/wordprocessingDrawing" xmlns:wp="http://schemas.openxmlformats.org/drawingml/2006/wordprocessingDrawing" xmlns:w10="urn:schemas-microsoft-com:office:word" xmlns:w="http://schemas.openxmlformats.org/wordprocessingml/2006/main" xmlns:w14="http://schemas.microsoft.com/office/word/2010/wordml" xmlns:w15="http://schemas.microsoft.com/office/word/2012/wordml" xmlns:w16cex="http://schemas.microsoft.com/office/word/2018/wordml/cex" xmlns:w16cid="http://schemas.microsoft.com/office/word/2016/wordml/cid" xmlns:w16="http://schemas.microsoft.com/office/word/2018/wordml" xmlns:w16du="http://schemas.microsoft.com/office/word/2023/wordml/word16du" xmlns:w16sdtdh="http://schemas.microsoft.com/office/word/2020/wordml/sdtdatahash" xmlns:w16sdtfl="http://schemas.microsoft.com/office/word/2024/wordml/sdtformatlock" xmlns:w16se="http://schemas.microsoft.com/office/word/2015/wordml/symex" xmlns:wpg="http://schemas.microsoft.com/office/word/2010/wordprocessingGroup" xmlns:wpi="http://schemas.microsoft.com/office/word/2010/wordprocessingInk" xmlns:wne="http://schemas.microsoft.com/office/word/2006/wordml" xmlns:wps="http://schemas.microsoft.com/office/word/2010/wordprocessingShape" mc:Ignorable="w14 w15 w16se w16cid w16 w16cex w16sdtdh w16sdtfl w16du wp14">
   <w:endnote w:type="separator" w:id="-1">
@@ -7329,7 +7816,108 @@
 </file>
 
 <file path=word/numbering.xml><?xml version="1.0" encoding="utf-8"?>
-<w:numbering xmlns:wpc="http://schemas.microsoft.com/office/word/2010/wordprocessingCanvas" xmlns:cx="http://schemas.microsoft.com/office/drawing/2014/chartex" xmlns:cx1="http://schemas.microsoft.com/office/drawing/2015/9/8/chartex" xmlns:cx2="http://schemas.microsoft.com/office/drawing/2015/10/21/chartex" xmlns:cx3="http://schemas.microsoft.com/office/drawing/2016/5/9/chartex" xmlns:cx4="http://schemas.microsoft.com/office/drawing/2016/5/10/chartex" xmlns:cx5="http://schemas.microsoft.com/office/drawing/2016/5/11/chartex" xmlns:cx6="http://schemas.microsoft.com/office/drawing/2016/5/12/chartex" xmlns:cx7="http://schemas.microsoft.com/office/drawing/2016/5/13/chartex" xmlns:cx8="http://schemas.microsoft.com/office/drawing/2016/5/14/chartex" xmlns:mc="http://schemas.openxmlformats.org/markup-compatibility/2006" xmlns:aink="http://schemas.microsoft.com/office/drawing/2016/ink" xmlns:am3d="http://schemas.microsoft.com/office/drawing/2017/model3d" xmlns:o="urn:schemas-microsoft-com:office:office" xmlns:oel="http://schemas.microsoft.com/office/2019/extlst" xmlns:r="http://schemas.openxmlformats.org/officeDocument/2006/relationships" xmlns:m="http://schemas.openxmlformats.org/officeDocument/2006/math" xmlns:v="urn:schemas-microsoft-com:vml" xmlns:wp14="http://schemas.microsoft.com/office/word/2010/wordprocessingDrawing" xmlns:wp="http://schemas.openxmlformats.org/drawingml/2006/wordprocessingDrawing" xmlns:w10="urn:schemas-microsoft-com:office:word" xmlns:w="http://schemas.openxmlformats.org/wordprocessingml/2006/main" xmlns:w14="http://schemas.microsoft.com/office/word/2010/wordml" xmlns:w15="http://schemas.microsoft.com/office/word/2012/wordml" xmlns:w16cex="http://schemas.microsoft.com/office/word/2018/wordml/cex" xmlns:w16cid="http://schemas.microsoft.com/office/word/2016/wordml/cid" xmlns:w16="http://schemas.microsoft.com/office/word/2018/wordml" xmlns:w16du="http://schemas.microsoft.com/office/word/2023/wordml/word16du" xmlns:w16sdtdh="http://schemas.microsoft.com/office/word/2020/wordml/sdtdatahash" xmlns:w16sdtfl="http://schemas.microsoft.com/office/word/2024/wordml/sdtformatlock" xmlns:w16se="http://schemas.microsoft.com/office/word/2015/wordml/symex" xmlns:wpg="http://schemas.microsoft.com/office/word/2010/wordprocessingGroup" xmlns:wpi="http://schemas.microsoft.com/office/word/2010/wordprocessingInk" xmlns:wne="http://schemas.microsoft.com/office/word/2006/wordml" xmlns:wps="http://schemas.microsoft.com/office/word/2010/wordprocessingShape" mc:Ignorable="w14 w15 w16se w16cid w16 w16cex w16sdtdh w16sdtfl w16du wp14"/>
+<w:numbering xmlns:wpc="http://schemas.microsoft.com/office/word/2010/wordprocessingCanvas" xmlns:cx="http://schemas.microsoft.com/office/drawing/2014/chartex" xmlns:cx1="http://schemas.microsoft.com/office/drawing/2015/9/8/chartex" xmlns:cx2="http://schemas.microsoft.com/office/drawing/2015/10/21/chartex" xmlns:cx3="http://schemas.microsoft.com/office/drawing/2016/5/9/chartex" xmlns:cx4="http://schemas.microsoft.com/office/drawing/2016/5/10/chartex" xmlns:cx5="http://schemas.microsoft.com/office/drawing/2016/5/11/chartex" xmlns:cx6="http://schemas.microsoft.com/office/drawing/2016/5/12/chartex" xmlns:cx7="http://schemas.microsoft.com/office/drawing/2016/5/13/chartex" xmlns:cx8="http://schemas.microsoft.com/office/drawing/2016/5/14/chartex" xmlns:mc="http://schemas.openxmlformats.org/markup-compatibility/2006" xmlns:aink="http://schemas.microsoft.com/office/drawing/2016/ink" xmlns:am3d="http://schemas.microsoft.com/office/drawing/2017/model3d" xmlns:o="urn:schemas-microsoft-com:office:office" xmlns:oel="http://schemas.microsoft.com/office/2019/extlst" xmlns:r="http://schemas.openxmlformats.org/officeDocument/2006/relationships" xmlns:m="http://schemas.openxmlformats.org/officeDocument/2006/math" xmlns:v="urn:schemas-microsoft-com:vml" xmlns:wp14="http://schemas.microsoft.com/office/word/2010/wordprocessingDrawing" xmlns:wp="http://schemas.openxmlformats.org/drawingml/2006/wordprocessingDrawing" xmlns:w10="urn:schemas-microsoft-com:office:word" xmlns:w="http://schemas.openxmlformats.org/wordprocessingml/2006/main" xmlns:w14="http://schemas.microsoft.com/office/word/2010/wordml" xmlns:w15="http://schemas.microsoft.com/office/word/2012/wordml" xmlns:w16cex="http://schemas.microsoft.com/office/word/2018/wordml/cex" xmlns:w16cid="http://schemas.microsoft.com/office/word/2016/wordml/cid" xmlns:w16="http://schemas.microsoft.com/office/word/2018/wordml" xmlns:w16du="http://schemas.microsoft.com/office/word/2023/wordml/word16du" xmlns:w16sdtdh="http://schemas.microsoft.com/office/word/2020/wordml/sdtdatahash" xmlns:w16sdtfl="http://schemas.microsoft.com/office/word/2024/wordml/sdtformatlock" xmlns:w16se="http://schemas.microsoft.com/office/word/2015/wordml/symex" xmlns:wpg="http://schemas.microsoft.com/office/word/2010/wordprocessingGroup" xmlns:wpi="http://schemas.microsoft.com/office/word/2010/wordprocessingInk" xmlns:wne="http://schemas.microsoft.com/office/word/2006/wordml" xmlns:wps="http://schemas.microsoft.com/office/word/2010/wordprocessingShape" mc:Ignorable="w14 w15 w16se w16cid w16 w16cex w16sdtdh w16sdtfl w16du wp14">
+  <w:abstractNum w:abstractNumId="0" w15:restartNumberingAfterBreak="0">
+    <w:nsid w:val="5978070C"/>
+    <w:multiLevelType w:val="hybridMultilevel"/>
+    <w:tmpl w:val="EF94C668"/>
+    <w:lvl w:ilvl="0" w:tplc="2000000F">
+      <w:start w:val="1"/>
+      <w:numFmt w:val="decimal"/>
+      <w:lvlText w:val="%1."/>
+      <w:lvlJc w:val="left"/>
+      <w:pPr>
+        <w:ind w:left="720" w:hanging="360"/>
+      </w:pPr>
+      <w:rPr>
+        <w:rFonts w:hint="default"/>
+      </w:rPr>
+    </w:lvl>
+    <w:lvl w:ilvl="1" w:tplc="20000019" w:tentative="1">
+      <w:start w:val="1"/>
+      <w:numFmt w:val="lowerLetter"/>
+      <w:lvlText w:val="%2."/>
+      <w:lvlJc w:val="left"/>
+      <w:pPr>
+        <w:ind w:left="1440" w:hanging="360"/>
+      </w:pPr>
+    </w:lvl>
+    <w:lvl w:ilvl="2" w:tplc="2000001B" w:tentative="1">
+      <w:start w:val="1"/>
+      <w:numFmt w:val="lowerRoman"/>
+      <w:lvlText w:val="%3."/>
+      <w:lvlJc w:val="right"/>
+      <w:pPr>
+        <w:ind w:left="2160" w:hanging="180"/>
+      </w:pPr>
+    </w:lvl>
+    <w:lvl w:ilvl="3" w:tplc="2000000F" w:tentative="1">
+      <w:start w:val="1"/>
+      <w:numFmt w:val="decimal"/>
+      <w:lvlText w:val="%4."/>
+      <w:lvlJc w:val="left"/>
+      <w:pPr>
+        <w:ind w:left="2880" w:hanging="360"/>
+      </w:pPr>
+    </w:lvl>
+    <w:lvl w:ilvl="4" w:tplc="20000019" w:tentative="1">
+      <w:start w:val="1"/>
+      <w:numFmt w:val="lowerLetter"/>
+      <w:lvlText w:val="%5."/>
+      <w:lvlJc w:val="left"/>
+      <w:pPr>
+        <w:ind w:left="3600" w:hanging="360"/>
+      </w:pPr>
+    </w:lvl>
+    <w:lvl w:ilvl="5" w:tplc="2000001B" w:tentative="1">
+      <w:start w:val="1"/>
+      <w:numFmt w:val="lowerRoman"/>
+      <w:lvlText w:val="%6."/>
+      <w:lvlJc w:val="right"/>
+      <w:pPr>
+        <w:ind w:left="4320" w:hanging="180"/>
+      </w:pPr>
+    </w:lvl>
+    <w:lvl w:ilvl="6" w:tplc="2000000F" w:tentative="1">
+      <w:start w:val="1"/>
+      <w:numFmt w:val="decimal"/>
+      <w:lvlText w:val="%7."/>
+      <w:lvlJc w:val="left"/>
+      <w:pPr>
+        <w:ind w:left="5040" w:hanging="360"/>
+      </w:pPr>
+    </w:lvl>
+    <w:lvl w:ilvl="7" w:tplc="20000019" w:tentative="1">
+      <w:start w:val="1"/>
+      <w:numFmt w:val="lowerLetter"/>
+      <w:lvlText w:val="%8."/>
+      <w:lvlJc w:val="left"/>
+      <w:pPr>
+        <w:ind w:left="5760" w:hanging="360"/>
+      </w:pPr>
+    </w:lvl>
+    <w:lvl w:ilvl="8" w:tplc="2000001B" w:tentative="1">
+      <w:start w:val="1"/>
+      <w:numFmt w:val="lowerRoman"/>
+      <w:lvlText w:val="%9."/>
+      <w:lvlJc w:val="right"/>
+      <w:pPr>
+        <w:ind w:left="6480" w:hanging="180"/>
+      </w:pPr>
+    </w:lvl>
+  </w:abstractNum>
+  <w:num w:numId="1" w16cid:durableId="811562321">
+    <w:abstractNumId w:val="0"/>
+  </w:num>
+</w:numbering>
+</file>
+
+<file path=word/people.xml><?xml version="1.0" encoding="utf-8"?>
+<w15:people xmlns:wpc="http://schemas.microsoft.com/office/word/2010/wordprocessingCanvas" xmlns:cx="http://schemas.microsoft.com/office/drawing/2014/chartex" xmlns:cx1="http://schemas.microsoft.com/office/drawing/2015/9/8/chartex" xmlns:cx2="http://schemas.microsoft.com/office/drawing/2015/10/21/chartex" xmlns:cx3="http://schemas.microsoft.com/office/drawing/2016/5/9/chartex" xmlns:cx4="http://schemas.microsoft.com/office/drawing/2016/5/10/chartex" xmlns:cx5="http://schemas.microsoft.com/office/drawing/2016/5/11/chartex" xmlns:cx6="http://schemas.microsoft.com/office/drawing/2016/5/12/chartex" xmlns:cx7="http://schemas.microsoft.com/office/drawing/2016/5/13/chartex" xmlns:cx8="http://schemas.microsoft.com/office/drawing/2016/5/14/chartex" xmlns:mc="http://schemas.openxmlformats.org/markup-compatibility/2006" xmlns:aink="http://schemas.microsoft.com/office/drawing/2016/ink" xmlns:am3d="http://schemas.microsoft.com/office/drawing/2017/model3d" xmlns:o="urn:schemas-microsoft-com:office:office" xmlns:oel="http://schemas.microsoft.com/office/2019/extlst" xmlns:r="http://schemas.openxmlformats.org/officeDocument/2006/relationships" xmlns:m="http://schemas.openxmlformats.org/officeDocument/2006/math" xmlns:v="urn:schemas-microsoft-com:vml" xmlns:wp14="http://schemas.microsoft.com/office/word/2010/wordprocessingDrawing" xmlns:wp="http://schemas.openxmlformats.org/drawingml/2006/wordprocessingDrawing" xmlns:w10="urn:schemas-microsoft-com:office:word" xmlns:w="http://schemas.openxmlformats.org/wordprocessingml/2006/main" xmlns:w14="http://schemas.microsoft.com/office/word/2010/wordml" xmlns:w15="http://schemas.microsoft.com/office/word/2012/wordml" xmlns:w16cex="http://schemas.microsoft.com/office/word/2018/wordml/cex" xmlns:w16cid="http://schemas.microsoft.com/office/word/2016/wordml/cid" xmlns:w16="http://schemas.microsoft.com/office/word/2018/wordml" xmlns:w16du="http://schemas.microsoft.com/office/word/2023/wordml/word16du" xmlns:w16sdtdh="http://schemas.microsoft.com/office/word/2020/wordml/sdtdatahash" xmlns:w16sdtfl="http://schemas.microsoft.com/office/word/2024/wordml/sdtformatlock" xmlns:w16se="http://schemas.microsoft.com/office/word/2015/wordml/symex" xmlns:wpg="http://schemas.microsoft.com/office/word/2010/wordprocessingGroup" xmlns:wpi="http://schemas.microsoft.com/office/word/2010/wordprocessingInk" xmlns:wne="http://schemas.microsoft.com/office/word/2006/wordml" xmlns:wps="http://schemas.microsoft.com/office/word/2010/wordprocessingShape" mc:Ignorable="w14 w15 w16se w16cid w16 w16cex w16sdtdh w16sdtfl w16du wp14">
+  <w15:person w15:author="Widdershoven, Jochem">
+    <w15:presenceInfo w15:providerId="AD" w15:userId="S::jochem.widdershoven@wur.nl::16ecd2e1-ad59-4dd8-b69b-12abbd35b032"/>
+  </w15:person>
+</w15:people>
 </file>
 
 <file path=word/styles.xml><?xml version="1.0" encoding="utf-8"?>

</xml_diff>

<commit_message>
edit: changed the call for time_measurements.py and the .R file. Also added a back-up for the report.
</commit_message>
<xml_diff>
--- a/report/report_current.docx
+++ b/report/report_current.docx
@@ -5,6 +5,9 @@
     <w:p>
       <w:pPr>
         <w:pStyle w:val="Title"/>
+        <w:rPr>
+          <w:rFonts w:hint="eastAsia"/>
+        </w:rPr>
       </w:pPr>
       <w:r>
         <w:t>Title</w:t>
@@ -66,6 +69,9 @@
     <w:p>
       <w:pPr>
         <w:pStyle w:val="Heading1"/>
+        <w:rPr>
+          <w:rFonts w:hint="eastAsia"/>
+        </w:rPr>
       </w:pPr>
       <w:r>
         <w:t>Abstract</w:t>
@@ -105,7 +111,7 @@
           <w:sz w:val="20"/>
           <w:szCs w:val="20"/>
         </w:rPr>
-        <w:t xml:space="preserve">, and these products are wasted. </w:t>
+        <w:t xml:space="preserve"> and these products are wasted. </w:t>
       </w:r>
       <w:r>
         <w:rPr>
@@ -273,7 +279,21 @@
           <w:sz w:val="20"/>
           <w:szCs w:val="20"/>
         </w:rPr>
-        <w:t xml:space="preserve"> are used, as well as Sarsa and Q-learning. </w:t>
+        <w:t xml:space="preserve"> are used, as well as </w:t>
+      </w:r>
+      <w:r>
+        <w:rPr>
+          <w:sz w:val="20"/>
+          <w:szCs w:val="20"/>
+        </w:rPr>
+        <w:t>SARSA</w:t>
+      </w:r>
+      <w:r>
+        <w:rPr>
+          <w:sz w:val="20"/>
+          <w:szCs w:val="20"/>
+        </w:rPr>
+        <w:t xml:space="preserve"> and Q-learning. </w:t>
       </w:r>
       <w:r>
         <w:rPr>
@@ -421,7 +441,7 @@
     <w:p>
       <w:pPr>
         <w:rPr>
-          <w:rFonts w:asciiTheme="majorHAnsi" w:eastAsiaTheme="majorEastAsia" w:hAnsiTheme="majorHAnsi" w:cstheme="majorBidi"/>
+          <w:rFonts w:asciiTheme="majorHAnsi" w:eastAsiaTheme="majorEastAsia" w:hAnsiTheme="majorHAnsi" w:cstheme="majorBidi" w:hint="eastAsia"/>
           <w:color w:val="0F4761" w:themeColor="accent1" w:themeShade="BF"/>
           <w:sz w:val="40"/>
           <w:szCs w:val="40"/>
@@ -434,8 +454,12 @@
     <w:p>
       <w:pPr>
         <w:pStyle w:val="Heading1"/>
-      </w:pPr>
-      <w:r>
+        <w:rPr>
+          <w:rFonts w:hint="eastAsia"/>
+        </w:rPr>
+      </w:pPr>
+      <w:r>
+        <w:lastRenderedPageBreak/>
         <w:t>Introduction</w:t>
       </w:r>
     </w:p>
@@ -474,7 +498,28 @@
           <w:sz w:val="20"/>
           <w:szCs w:val="20"/>
         </w:rPr>
-        <w:t xml:space="preserve"> Expiratory First Out (</w:t>
+        <w:t xml:space="preserve"> </w:t>
+      </w:r>
+      <w:r>
+        <w:rPr>
+          <w:sz w:val="20"/>
+          <w:szCs w:val="20"/>
+        </w:rPr>
+        <w:t>Expiry</w:t>
+      </w:r>
+      <w:r>
+        <w:rPr>
+          <w:sz w:val="20"/>
+          <w:szCs w:val="20"/>
+        </w:rPr>
+        <w:t xml:space="preserve"> </w:t>
+      </w:r>
+      <w:r>
+        <w:rPr>
+          <w:sz w:val="20"/>
+          <w:szCs w:val="20"/>
+        </w:rPr>
+        <w:t>First Out (</w:t>
       </w:r>
       <w:r>
         <w:rPr>
@@ -586,7 +631,21 @@
           <w:sz w:val="20"/>
           <w:szCs w:val="20"/>
         </w:rPr>
-        <w:t xml:space="preserve"> fulfilled with the discounted products, and in turn less fresh products are sold for the regular price.</w:t>
+        <w:t xml:space="preserve"> fulfilled with the discounted products, and in turn </w:t>
+      </w:r>
+      <w:r>
+        <w:rPr>
+          <w:sz w:val="20"/>
+          <w:szCs w:val="20"/>
+        </w:rPr>
+        <w:t>fewer</w:t>
+      </w:r>
+      <w:r>
+        <w:rPr>
+          <w:sz w:val="20"/>
+          <w:szCs w:val="20"/>
+        </w:rPr>
+        <w:t xml:space="preserve"> fresh products are sold for the regular price.</w:t>
       </w:r>
     </w:p>
     <w:p>
@@ -856,7 +915,21 @@
           <w:sz w:val="20"/>
           <w:szCs w:val="20"/>
         </w:rPr>
-        <w:t>The main research question of this study is:</w:t>
+        <w:t>Th</w:t>
+      </w:r>
+      <w:r>
+        <w:rPr>
+          <w:sz w:val="20"/>
+          <w:szCs w:val="20"/>
+        </w:rPr>
+        <w:t>is leads to the</w:t>
+      </w:r>
+      <w:r>
+        <w:rPr>
+          <w:sz w:val="20"/>
+          <w:szCs w:val="20"/>
+        </w:rPr>
+        <w:t xml:space="preserve"> main research question of this study:</w:t>
       </w:r>
     </w:p>
     <w:p>
@@ -895,7 +968,6 @@
           <w:szCs w:val="20"/>
           <w:lang w:val="en-US"/>
         </w:rPr>
-        <w:tab/>
         <w:t>To answer this question</w:t>
       </w:r>
       <w:r>
@@ -978,7 +1050,34 @@
           <w:sz w:val="20"/>
           <w:szCs w:val="20"/>
         </w:rPr>
-        <w:t>oes any model produce a statistically and practically meaningful improvement in profit and waste reduction over FDC</w:t>
+        <w:t xml:space="preserve">oes any model produce a statistically and practically meaningful improvement in profit and waste </w:t>
+      </w:r>
+      <w:r>
+        <w:rPr>
+          <w:i/>
+          <w:iCs/>
+          <w:sz w:val="20"/>
+          <w:szCs w:val="20"/>
+        </w:rPr>
+        <w:t>reductio</w:t>
+      </w:r>
+      <w:r>
+        <w:rPr>
+          <w:i/>
+          <w:iCs/>
+          <w:sz w:val="20"/>
+          <w:szCs w:val="20"/>
+        </w:rPr>
+        <w:t>n</w:t>
+      </w:r>
+      <w:r>
+        <w:rPr>
+          <w:i/>
+          <w:iCs/>
+          <w:sz w:val="20"/>
+          <w:szCs w:val="20"/>
+        </w:rPr>
+        <w:t xml:space="preserve"> over FDC</w:t>
       </w:r>
       <w:r>
         <w:rPr>
@@ -1028,7 +1127,7 @@
     <w:p>
       <w:pPr>
         <w:rPr>
-          <w:rFonts w:asciiTheme="majorHAnsi" w:eastAsiaTheme="majorEastAsia" w:hAnsiTheme="majorHAnsi" w:cstheme="majorBidi"/>
+          <w:rFonts w:asciiTheme="majorHAnsi" w:eastAsiaTheme="majorEastAsia" w:hAnsiTheme="majorHAnsi" w:cstheme="majorBidi" w:hint="eastAsia"/>
           <w:color w:val="0F4761" w:themeColor="accent1" w:themeShade="BF"/>
           <w:sz w:val="40"/>
           <w:szCs w:val="40"/>
@@ -1041,14 +1140,21 @@
     <w:p>
       <w:pPr>
         <w:pStyle w:val="Heading1"/>
-      </w:pPr>
-      <w:r>
+        <w:rPr>
+          <w:rFonts w:hint="eastAsia"/>
+        </w:rPr>
+      </w:pPr>
+      <w:r>
+        <w:lastRenderedPageBreak/>
         <w:t>Methods</w:t>
       </w:r>
     </w:p>
     <w:p>
       <w:pPr>
         <w:pStyle w:val="Heading2"/>
+        <w:rPr>
+          <w:rFonts w:hint="eastAsia"/>
+        </w:rPr>
       </w:pPr>
       <w:r>
         <w:t>The Environment</w:t>
@@ -1224,7 +1330,23 @@
           <w:sz w:val="20"/>
           <w:szCs w:val="20"/>
         </w:rPr>
-        <w:t xml:space="preserve">. The maximum probability was set to three times </w:t>
+        <w:t xml:space="preserve">. The maximum probability </w:t>
+      </w:r>
+      <w:r>
+        <w:rPr>
+          <w:rFonts w:eastAsiaTheme="minorEastAsia"/>
+          <w:sz w:val="20"/>
+          <w:szCs w:val="20"/>
+        </w:rPr>
+        <w:t>was</w:t>
+      </w:r>
+      <w:r>
+        <w:rPr>
+          <w:rFonts w:eastAsiaTheme="minorEastAsia"/>
+          <w:sz w:val="20"/>
+          <w:szCs w:val="20"/>
+        </w:rPr>
+        <w:t xml:space="preserve"> set to three times </w:t>
       </w:r>
       <m:oMath>
         <m:r>
@@ -1278,7 +1400,39 @@
           <w:sz w:val="20"/>
           <w:szCs w:val="20"/>
         </w:rPr>
-        <w:t xml:space="preserve">For each action state combination, each action was multiplied by the discount increment, and the difference between the base stock level and that particular inventory space was ordered as new stock, or nothing if that value was negative. That way, the number of items to order could never pass the base stock policy. The FEFO demand was calculated by taking the smallest value; either all of the oldest products in the current inventory, or the discount multiplied by the daily demand. Successively, the FEFO demand could never be higher than the number of oldest items. What is more, with an elevated discount, statistically a higher FEFO demand would come about. The LEFO demand is what remains of the original demand when subtracting the FEFO demand. The items with the youngest age are chosen first, and the items of the later age categories are chosen until the full daily demand is met. The metric of customer dissatisfaction when the demand is higher than the summed inventory is ignored in this model. </w:t>
+        <w:t xml:space="preserve">For each action state combination, each action was multiplied by the discount increment, and the difference between the base stock level and that </w:t>
+      </w:r>
+      <w:r>
+        <w:rPr>
+          <w:rFonts w:eastAsiaTheme="minorEastAsia"/>
+          <w:sz w:val="20"/>
+          <w:szCs w:val="20"/>
+        </w:rPr>
+        <w:t>specific</w:t>
+      </w:r>
+      <w:r>
+        <w:rPr>
+          <w:rFonts w:eastAsiaTheme="minorEastAsia"/>
+          <w:sz w:val="20"/>
+          <w:szCs w:val="20"/>
+        </w:rPr>
+        <w:t xml:space="preserve"> inventory space was ordered as new stock, or nothing if that value was negative. That way, the number of items to order could never pass the base stock policy. The FEFO demand was calculated by taking the smallest value; either </w:t>
+      </w:r>
+      <w:r>
+        <w:rPr>
+          <w:rFonts w:eastAsiaTheme="minorEastAsia"/>
+          <w:sz w:val="20"/>
+          <w:szCs w:val="20"/>
+        </w:rPr>
+        <w:t>all</w:t>
+      </w:r>
+      <w:r>
+        <w:rPr>
+          <w:rFonts w:eastAsiaTheme="minorEastAsia"/>
+          <w:sz w:val="20"/>
+          <w:szCs w:val="20"/>
+        </w:rPr>
+        <w:t xml:space="preserve"> the oldest products in the current inventory, or the discount multiplied by the daily demand. Successively, the FEFO demand could never be higher than the number of oldest items. What is more, with an elevated discount, statistically a higher FEFO demand would come about. The LEFO demand is what remains of the original demand when subtracting the FEFO demand. The items with the youngest age are chosen first, and the items of the later age categories are chosen until the full daily demand is met. The metric of customer dissatisfaction when the demand is higher than the summed inventory is ignored in this model. </w:t>
       </w:r>
     </w:p>
     <w:p>
@@ -1923,6 +2077,9 @@
     <w:p>
       <w:pPr>
         <w:pStyle w:val="Heading2"/>
+        <w:rPr>
+          <w:rFonts w:hint="eastAsia"/>
+        </w:rPr>
       </w:pPr>
       <w:r>
         <w:t>Fixed Discount Control</w:t>
@@ -2102,7 +2259,15 @@
           <w:sz w:val="20"/>
           <w:szCs w:val="20"/>
         </w:rPr>
-        <w:t xml:space="preserve">, more customers would assume FEFO behaviour, limiting the profit at some point. </w:t>
+        <w:t xml:space="preserve">, more customers would assume FEFO </w:t>
+      </w:r>
+      <w:r>
+        <w:rPr>
+          <w:sz w:val="20"/>
+          <w:szCs w:val="20"/>
+        </w:rPr>
+        <w:lastRenderedPageBreak/>
+        <w:t xml:space="preserve">behaviour, limiting the profit at some point. </w:t>
       </w:r>
       <w:r>
         <w:rPr>
@@ -2122,6 +2287,9 @@
     <w:p>
       <w:pPr>
         <w:pStyle w:val="Heading2"/>
+        <w:rPr>
+          <w:rFonts w:hint="eastAsia"/>
+        </w:rPr>
       </w:pPr>
       <w:r>
         <w:t>Dynamic Programming</w:t>
@@ -2130,6 +2298,9 @@
     <w:p>
       <w:pPr>
         <w:pStyle w:val="Heading3"/>
+        <w:rPr>
+          <w:rFonts w:hint="eastAsia"/>
+        </w:rPr>
       </w:pPr>
       <w:r>
         <w:t>Iterative Policy Evaluation and Policy Improvement</w:t>
@@ -2477,7 +2648,23 @@
           <w:sz w:val="20"/>
           <w:szCs w:val="20"/>
         </w:rPr>
-        <w:t xml:space="preserve"> beforementioned</w:t>
+        <w:t xml:space="preserve"> before</w:t>
+      </w:r>
+      <w:r>
+        <w:rPr>
+          <w:rFonts w:eastAsiaTheme="minorEastAsia"/>
+          <w:sz w:val="20"/>
+          <w:szCs w:val="20"/>
+        </w:rPr>
+        <w:t xml:space="preserve"> </w:t>
+      </w:r>
+      <w:r>
+        <w:rPr>
+          <w:rFonts w:eastAsiaTheme="minorEastAsia"/>
+          <w:sz w:val="20"/>
+          <w:szCs w:val="20"/>
+        </w:rPr>
+        <w:t>mentioned</w:t>
       </w:r>
       <w:r>
         <w:rPr>
@@ -2787,6 +2974,9 @@
     <w:p>
       <w:pPr>
         <w:pStyle w:val="Heading2"/>
+        <w:rPr>
+          <w:rFonts w:hint="eastAsia"/>
+        </w:rPr>
       </w:pPr>
       <w:r>
         <w:t>Temporal Difference</w:t>
@@ -2864,7 +3054,23 @@
           <w:sz w:val="20"/>
           <w:szCs w:val="20"/>
         </w:rPr>
-        <w:t xml:space="preserve"> learns a </w:t>
+        <w:t xml:space="preserve"> </w:t>
+      </w:r>
+      <w:r>
+        <w:rPr>
+          <w:rFonts w:ascii="Aptos" w:eastAsia="Aptos" w:hAnsi="Aptos" w:cs="Aptos"/>
+          <w:sz w:val="20"/>
+          <w:szCs w:val="20"/>
+        </w:rPr>
+        <w:t>learn</w:t>
+      </w:r>
+      <w:r>
+        <w:rPr>
+          <w:rFonts w:ascii="Aptos" w:eastAsia="Aptos" w:hAnsi="Aptos" w:cs="Aptos"/>
+          <w:sz w:val="20"/>
+          <w:szCs w:val="20"/>
+        </w:rPr>
+        <w:t xml:space="preserve"> a </w:t>
       </w:r>
       <w:r>
         <w:rPr>
@@ -2880,7 +3086,39 @@
           <w:sz w:val="20"/>
           <w:szCs w:val="20"/>
         </w:rPr>
-        <w:t>without ever constructing P or R. This makes RL model-free. It does not require the transition matrix to be known or computed in advance</w:t>
+        <w:t xml:space="preserve">without ever constructing P or R. This makes </w:t>
+      </w:r>
+      <w:r>
+        <w:rPr>
+          <w:rFonts w:ascii="Aptos" w:eastAsia="Aptos" w:hAnsi="Aptos" w:cs="Aptos"/>
+          <w:sz w:val="20"/>
+          <w:szCs w:val="20"/>
+        </w:rPr>
+        <w:t>TD</w:t>
+      </w:r>
+      <w:r>
+        <w:rPr>
+          <w:rFonts w:ascii="Aptos" w:eastAsia="Aptos" w:hAnsi="Aptos" w:cs="Aptos"/>
+          <w:sz w:val="20"/>
+          <w:szCs w:val="20"/>
+        </w:rPr>
+        <w:t xml:space="preserve"> model-free. It does not require the </w:t>
+      </w:r>
+      <w:r>
+        <w:rPr>
+          <w:rFonts w:ascii="Aptos" w:eastAsia="Aptos" w:hAnsi="Aptos" w:cs="Aptos"/>
+          <w:sz w:val="20"/>
+          <w:szCs w:val="20"/>
+        </w:rPr>
+        <w:t xml:space="preserve">full </w:t>
+      </w:r>
+      <w:r>
+        <w:rPr>
+          <w:rFonts w:ascii="Aptos" w:eastAsia="Aptos" w:hAnsi="Aptos" w:cs="Aptos"/>
+          <w:sz w:val="20"/>
+          <w:szCs w:val="20"/>
+        </w:rPr>
+        <w:t>transition matrix to be known or computed in advance</w:t>
       </w:r>
       <w:r>
         <w:rPr>
@@ -3010,7 +3248,15 @@
           <w:sz w:val="20"/>
           <w:szCs w:val="20"/>
         </w:rPr>
-        <w:t xml:space="preserve">: </w:t>
+        <w:t xml:space="preserve"> are</w:t>
+      </w:r>
+      <w:r>
+        <w:rPr>
+          <w:rFonts w:ascii="Aptos" w:eastAsia="Aptos" w:hAnsi="Aptos" w:cs="Aptos"/>
+          <w:sz w:val="20"/>
+          <w:szCs w:val="20"/>
+        </w:rPr>
+        <w:t xml:space="preserve"> </w:t>
       </w:r>
       <w:r>
         <w:rPr>
@@ -3053,7 +3299,15 @@
           <w:sz w:val="20"/>
           <w:szCs w:val="20"/>
         </w:rPr>
-        <w:t xml:space="preserve">Reinforcement learning </w:t>
+        <w:t>TD</w:t>
+      </w:r>
+      <w:r>
+        <w:rPr>
+          <w:rFonts w:ascii="Aptos" w:eastAsia="Aptos" w:hAnsi="Aptos" w:cs="Aptos"/>
+          <w:sz w:val="20"/>
+          <w:szCs w:val="20"/>
+        </w:rPr>
+        <w:t xml:space="preserve"> </w:t>
       </w:r>
       <w:r>
         <w:rPr>
@@ -3147,6 +3401,9 @@
     <w:p>
       <w:pPr>
         <w:pStyle w:val="Heading2"/>
+        <w:rPr>
+          <w:rFonts w:hint="eastAsia"/>
+        </w:rPr>
       </w:pPr>
       <w:r>
         <w:t>Q-learning</w:t>
@@ -3201,22 +3458,48 @@
         </w:rPr>
         <w:t xml:space="preserve">, updating the </w:t>
       </w:r>
-      <w:r>
-        <w:rPr>
-          <w:rFonts w:ascii="Aptos" w:eastAsia="Aptos" w:hAnsi="Aptos" w:cs="Aptos"/>
-          <w:sz w:val="20"/>
-          <w:szCs w:val="20"/>
-        </w:rPr>
-        <w:t>Q(s,a)</w:t>
-      </w:r>
-      <w:r>
-        <w:rPr>
-          <w:rFonts w:ascii="Aptos" w:eastAsia="Aptos" w:hAnsi="Aptos" w:cs="Aptos"/>
-          <w:sz w:val="20"/>
-          <w:szCs w:val="20"/>
-        </w:rPr>
-        <w:t xml:space="preserve"> </w:t>
-      </w:r>
+      <m:oMath>
+        <m:r>
+          <w:rPr>
+            <w:rFonts w:ascii="Cambria Math" w:eastAsia="Aptos" w:hAnsi="Cambria Math" w:cs="Aptos"/>
+            <w:sz w:val="20"/>
+            <w:szCs w:val="20"/>
+          </w:rPr>
+          <m:t>Q(</m:t>
+        </m:r>
+        <m:r>
+          <w:rPr>
+            <w:rFonts w:ascii="Cambria Math" w:eastAsia="Aptos" w:hAnsi="Cambria Math" w:cs="Aptos"/>
+            <w:sz w:val="20"/>
+            <w:szCs w:val="20"/>
+          </w:rPr>
+          <m:t>S</m:t>
+        </m:r>
+        <m:r>
+          <w:rPr>
+            <w:rFonts w:ascii="Cambria Math" w:eastAsia="Aptos" w:hAnsi="Cambria Math" w:cs="Aptos"/>
+            <w:sz w:val="20"/>
+            <w:szCs w:val="20"/>
+          </w:rPr>
+          <m:t>,</m:t>
+        </m:r>
+        <m:r>
+          <w:rPr>
+            <w:rFonts w:ascii="Cambria Math" w:eastAsia="Aptos" w:hAnsi="Cambria Math" w:cs="Aptos"/>
+            <w:sz w:val="20"/>
+            <w:szCs w:val="20"/>
+          </w:rPr>
+          <m:t>A</m:t>
+        </m:r>
+        <m:r>
+          <w:rPr>
+            <w:rFonts w:ascii="Cambria Math" w:eastAsia="Aptos" w:hAnsi="Cambria Math" w:cs="Aptos"/>
+            <w:sz w:val="20"/>
+            <w:szCs w:val="20"/>
+          </w:rPr>
+          <m:t xml:space="preserve">) </m:t>
+        </m:r>
+      </m:oMath>
       <w:r>
         <w:rPr>
           <w:rFonts w:ascii="Aptos" w:eastAsia="Aptos" w:hAnsi="Aptos" w:cs="Aptos"/>
@@ -3365,6 +3648,9 @@
     <w:p>
       <w:pPr>
         <w:pStyle w:val="Heading2"/>
+        <w:rPr>
+          <w:rFonts w:hint="eastAsia"/>
+        </w:rPr>
       </w:pPr>
       <w:r>
         <w:t>SARSA</w:t>
@@ -3427,13 +3713,55 @@
         </w:rPr>
         <w:t xml:space="preserve">, where </w:t>
       </w:r>
-      <w:r>
-        <w:rPr>
-          <w:rFonts w:ascii="Aptos" w:eastAsia="Aptos" w:hAnsi="Aptos" w:cs="Aptos"/>
-          <w:sz w:val="20"/>
-          <w:szCs w:val="20"/>
-        </w:rPr>
-        <w:t xml:space="preserve">Q(s, a) </w:t>
+      <m:oMath>
+        <m:r>
+          <w:rPr>
+            <w:rFonts w:ascii="Cambria Math" w:eastAsia="Aptos" w:hAnsi="Cambria Math" w:cs="Aptos"/>
+            <w:sz w:val="20"/>
+            <w:szCs w:val="20"/>
+          </w:rPr>
+          <m:t>Q(</m:t>
+        </m:r>
+        <m:r>
+          <w:rPr>
+            <w:rFonts w:ascii="Cambria Math" w:eastAsia="Aptos" w:hAnsi="Cambria Math" w:cs="Aptos"/>
+            <w:sz w:val="20"/>
+            <w:szCs w:val="20"/>
+          </w:rPr>
+          <m:t>S</m:t>
+        </m:r>
+        <m:r>
+          <w:rPr>
+            <w:rFonts w:ascii="Cambria Math" w:eastAsia="Aptos" w:hAnsi="Cambria Math" w:cs="Aptos"/>
+            <w:sz w:val="20"/>
+            <w:szCs w:val="20"/>
+          </w:rPr>
+          <m:t>,</m:t>
+        </m:r>
+        <m:r>
+          <w:rPr>
+            <w:rFonts w:ascii="Cambria Math" w:eastAsia="Aptos" w:hAnsi="Cambria Math" w:cs="Aptos"/>
+            <w:sz w:val="20"/>
+            <w:szCs w:val="20"/>
+          </w:rPr>
+          <m:t>A</m:t>
+        </m:r>
+        <m:r>
+          <w:rPr>
+            <w:rFonts w:ascii="Cambria Math" w:eastAsia="Aptos" w:hAnsi="Cambria Math" w:cs="Aptos"/>
+            <w:sz w:val="20"/>
+            <w:szCs w:val="20"/>
+          </w:rPr>
+          <m:t>)</m:t>
+        </m:r>
+      </m:oMath>
+      <w:r>
+        <w:rPr>
+          <w:rFonts w:ascii="Aptos" w:eastAsia="Aptos" w:hAnsi="Aptos" w:cs="Aptos"/>
+          <w:sz w:val="20"/>
+          <w:szCs w:val="20"/>
+        </w:rPr>
+        <w:t xml:space="preserve"> </w:t>
       </w:r>
       <w:r>
         <w:rPr>
@@ -3449,7 +3777,25 @@
           <w:sz w:val="20"/>
           <w:szCs w:val="20"/>
         </w:rPr>
-        <w:t xml:space="preserve">updated using the value of the actual selected action (a’) under the </w:t>
+        <w:t xml:space="preserve">updated using the value of the actual selected action </w:t>
+      </w:r>
+      <m:oMath>
+        <m:r>
+          <w:rPr>
+            <w:rFonts w:ascii="Cambria Math" w:eastAsia="Aptos" w:hAnsi="Cambria Math" w:cs="Aptos"/>
+            <w:sz w:val="20"/>
+            <w:szCs w:val="20"/>
+          </w:rPr>
+          <m:t>(a’)</m:t>
+        </m:r>
+      </m:oMath>
+      <w:r>
+        <w:rPr>
+          <w:rFonts w:ascii="Aptos" w:eastAsia="Aptos" w:hAnsi="Aptos" w:cs="Aptos"/>
+          <w:sz w:val="20"/>
+          <w:szCs w:val="20"/>
+        </w:rPr>
+        <w:t xml:space="preserve"> under the </w:t>
       </w:r>
       <w:r>
         <w:rPr>
@@ -3510,6 +3856,7 @@
               <w:sz w:val="20"/>
               <w:szCs w:val="20"/>
             </w:rPr>
+            <w:lastRenderedPageBreak/>
             <m:t>Q(s,a) ← Q(s,a) + α[r + γ·Q(s',a') - Q(s,a)]</m:t>
           </m:r>
         </m:oMath>
@@ -3530,15 +3877,31 @@
           <w:sz w:val="20"/>
           <w:szCs w:val="20"/>
         </w:rPr>
-        <w:t>Since SARSA’s updating rule includes exploration itself it tends to learn more conservative</w:t>
-      </w:r>
-      <w:r>
-        <w:rPr>
-          <w:rFonts w:eastAsiaTheme="minorEastAsia"/>
-          <w:sz w:val="20"/>
-          <w:szCs w:val="20"/>
-        </w:rPr>
-        <w:t xml:space="preserve"> behaviour near costly states. Actions that lead to poor results under exploration are penalised more directly. Q learning can converge </w:t>
+        <w:t>Since SARSAs updating rule includes exploration itself it tends to learn more conservative</w:t>
+      </w:r>
+      <w:r>
+        <w:rPr>
+          <w:rFonts w:eastAsiaTheme="minorEastAsia"/>
+          <w:sz w:val="20"/>
+          <w:szCs w:val="20"/>
+        </w:rPr>
+        <w:t xml:space="preserve"> behaviour near costly states. Actions that lead to poor results under exploration are penalised more directly. Q</w:t>
+      </w:r>
+      <w:r>
+        <w:rPr>
+          <w:rFonts w:eastAsiaTheme="minorEastAsia"/>
+          <w:sz w:val="20"/>
+          <w:szCs w:val="20"/>
+        </w:rPr>
+        <w:t>-</w:t>
+      </w:r>
+      <w:r>
+        <w:rPr>
+          <w:rFonts w:eastAsiaTheme="minorEastAsia"/>
+          <w:sz w:val="20"/>
+          <w:szCs w:val="20"/>
+        </w:rPr>
+        <w:t xml:space="preserve">learning can converge </w:t>
       </w:r>
       <w:r>
         <w:rPr>
@@ -3560,6 +3923,9 @@
     <w:p>
       <w:pPr>
         <w:pStyle w:val="Heading2"/>
+        <w:rPr>
+          <w:rFonts w:hint="eastAsia"/>
+        </w:rPr>
       </w:pPr>
       <w:r>
         <w:t>The environments</w:t>
@@ -3597,7 +3963,23 @@
           <w:sz w:val="20"/>
           <w:szCs w:val="20"/>
         </w:rPr>
-        <w:t>training run consisted out of episode where one episode simulated 3</w:t>
+        <w:t>training run consisted out of episode</w:t>
+      </w:r>
+      <w:r>
+        <w:rPr>
+          <w:rFonts w:ascii="Aptos" w:eastAsia="Aptos" w:hAnsi="Aptos" w:cs="Aptos"/>
+          <w:sz w:val="20"/>
+          <w:szCs w:val="20"/>
+        </w:rPr>
+        <w:t>s</w:t>
+      </w:r>
+      <w:r>
+        <w:rPr>
+          <w:rFonts w:ascii="Aptos" w:eastAsia="Aptos" w:hAnsi="Aptos" w:cs="Aptos"/>
+          <w:sz w:val="20"/>
+          <w:szCs w:val="20"/>
+        </w:rPr>
+        <w:t xml:space="preserve"> where one episode simulated 3</w:t>
       </w:r>
       <w:r>
         <w:rPr>
@@ -3685,7 +4067,31 @@
           <w:sz w:val="20"/>
           <w:szCs w:val="20"/>
         </w:rPr>
-        <w:t xml:space="preserve"> at 1.0 and decayed by 0.998 towards an </w:t>
+        <w:t xml:space="preserve"> at 1.0 and decayed by 0.99</w:t>
+      </w:r>
+      <w:r>
+        <w:rPr>
+          <w:rFonts w:ascii="Aptos" w:eastAsia="Aptos" w:hAnsi="Aptos" w:cs="Aptos"/>
+          <w:sz w:val="20"/>
+          <w:szCs w:val="20"/>
+        </w:rPr>
+        <w:t>9</w:t>
+      </w:r>
+      <w:r>
+        <w:rPr>
+          <w:rFonts w:ascii="Aptos" w:eastAsia="Aptos" w:hAnsi="Aptos" w:cs="Aptos"/>
+          <w:sz w:val="20"/>
+          <w:szCs w:val="20"/>
+        </w:rPr>
+        <w:t>9</w:t>
+      </w:r>
+      <w:r>
+        <w:rPr>
+          <w:rFonts w:ascii="Aptos" w:eastAsia="Aptos" w:hAnsi="Aptos" w:cs="Aptos"/>
+          <w:sz w:val="20"/>
+          <w:szCs w:val="20"/>
+        </w:rPr>
+        <w:t xml:space="preserve"> towards an </w:t>
       </w:r>
       <w:r>
         <w:rPr>
@@ -3717,32 +4123,50 @@
           <w:sz w:val="20"/>
           <w:szCs w:val="20"/>
         </w:rPr>
-        <w:t xml:space="preserve"> Before every run an empty Q-table was initialised of size (</w:t>
-      </w:r>
-      <w:r>
-        <w:rPr>
-          <w:rFonts w:ascii="Aptos" w:eastAsia="Aptos" w:hAnsi="Aptos" w:cs="Aptos"/>
-          <w:sz w:val="20"/>
-          <w:szCs w:val="20"/>
-        </w:rPr>
-        <w:t>M</w:t>
-      </w:r>
-      <w:r>
-        <w:rPr>
-          <w:rFonts w:ascii="Aptos" w:eastAsia="Aptos" w:hAnsi="Aptos" w:cs="Aptos"/>
-          <w:sz w:val="20"/>
-          <w:szCs w:val="20"/>
-        </w:rPr>
-        <w:t>+1)^</w:t>
-      </w:r>
-      <w:r>
-        <w:rPr>
-          <w:rFonts w:ascii="Aptos" w:eastAsia="Aptos" w:hAnsi="Aptos" w:cs="Aptos"/>
-          <w:sz w:val="20"/>
-          <w:szCs w:val="20"/>
-        </w:rPr>
-        <w:t>BSPlvl</w:t>
-      </w:r>
+        <w:t xml:space="preserve"> Before every run an empty Q-table was initialised of size </w:t>
+      </w:r>
+      <m:oMath>
+        <m:sSup>
+          <m:sSupPr>
+            <m:ctrlPr>
+              <w:rPr>
+                <w:rFonts w:ascii="Cambria Math" w:eastAsia="Aptos" w:hAnsi="Cambria Math" w:cs="Aptos"/>
+                <w:i/>
+                <w:sz w:val="20"/>
+                <w:szCs w:val="20"/>
+              </w:rPr>
+            </m:ctrlPr>
+          </m:sSupPr>
+          <m:e>
+            <m:r>
+              <w:rPr>
+                <w:rFonts w:ascii="Cambria Math" w:eastAsia="Aptos" w:hAnsi="Cambria Math" w:cs="Aptos"/>
+                <w:sz w:val="20"/>
+                <w:szCs w:val="20"/>
+              </w:rPr>
+              <m:t>M</m:t>
+            </m:r>
+          </m:e>
+          <m:sup>
+            <m:r>
+              <w:rPr>
+                <w:rFonts w:ascii="Cambria Math" w:eastAsia="Aptos" w:hAnsi="Cambria Math" w:cs="Aptos"/>
+                <w:sz w:val="20"/>
+                <w:szCs w:val="20"/>
+              </w:rPr>
+              <m:t>BSPlv</m:t>
+            </m:r>
+            <m:r>
+              <w:rPr>
+                <w:rFonts w:ascii="Cambria Math" w:eastAsia="Aptos" w:hAnsi="Cambria Math" w:cs="Aptos"/>
+                <w:sz w:val="20"/>
+                <w:szCs w:val="20"/>
+              </w:rPr>
+              <m:t>l</m:t>
+            </m:r>
+          </m:sup>
+        </m:sSup>
+      </m:oMath>
       <w:r>
         <w:rPr>
           <w:rFonts w:ascii="Aptos" w:eastAsia="Aptos" w:hAnsi="Aptos" w:cs="Aptos"/>
@@ -3755,6 +4179,9 @@
     <w:p>
       <w:pPr>
         <w:pStyle w:val="Heading2"/>
+        <w:rPr>
+          <w:rFonts w:hint="eastAsia"/>
+        </w:rPr>
       </w:pPr>
       <w:r>
         <w:t>Hyperparameter tuning</w:t>
@@ -3832,7 +4259,55 @@
           <w:sz w:val="20"/>
           <w:szCs w:val="20"/>
         </w:rPr>
-        <w:t>(0, 1 and 2)</w:t>
+        <w:t>(</w:t>
+      </w:r>
+      <w:r>
+        <w:rPr>
+          <w:rFonts w:ascii="Aptos" w:eastAsia="Aptos" w:hAnsi="Aptos" w:cs="Aptos"/>
+          <w:sz w:val="20"/>
+          <w:szCs w:val="20"/>
+        </w:rPr>
+        <w:t>1</w:t>
+      </w:r>
+      <w:r>
+        <w:rPr>
+          <w:rFonts w:ascii="Aptos" w:eastAsia="Aptos" w:hAnsi="Aptos" w:cs="Aptos"/>
+          <w:sz w:val="20"/>
+          <w:szCs w:val="20"/>
+        </w:rPr>
+        <w:t xml:space="preserve">, </w:t>
+      </w:r>
+      <w:r>
+        <w:rPr>
+          <w:rFonts w:ascii="Aptos" w:eastAsia="Aptos" w:hAnsi="Aptos" w:cs="Aptos"/>
+          <w:sz w:val="20"/>
+          <w:szCs w:val="20"/>
+        </w:rPr>
+        <w:t>2</w:t>
+      </w:r>
+      <w:r>
+        <w:rPr>
+          <w:rFonts w:ascii="Aptos" w:eastAsia="Aptos" w:hAnsi="Aptos" w:cs="Aptos"/>
+          <w:sz w:val="20"/>
+          <w:szCs w:val="20"/>
+        </w:rPr>
+        <w:t xml:space="preserve"> and </w:t>
+      </w:r>
+      <w:r>
+        <w:rPr>
+          <w:rFonts w:ascii="Aptos" w:eastAsia="Aptos" w:hAnsi="Aptos" w:cs="Aptos"/>
+          <w:sz w:val="20"/>
+          <w:szCs w:val="20"/>
+        </w:rPr>
+        <w:t>3</w:t>
+      </w:r>
+      <w:r>
+        <w:rPr>
+          <w:rFonts w:ascii="Aptos" w:eastAsia="Aptos" w:hAnsi="Aptos" w:cs="Aptos"/>
+          <w:sz w:val="20"/>
+          <w:szCs w:val="20"/>
+        </w:rPr>
+        <w:t>)</w:t>
       </w:r>
       <w:r>
         <w:rPr>
@@ -3857,11 +4332,76 @@
           <w:szCs w:val="20"/>
         </w:rPr>
         <w:t>, the average profit at convergence was recorded and the setting with the highest average profit across seeds was selected as the final configuration for the algorithm.</w:t>
+      </w:r>
+      <w:r>
+        <w:rPr>
+          <w:rFonts w:ascii="Aptos" w:eastAsia="Aptos" w:hAnsi="Aptos" w:cs="Aptos"/>
+          <w:sz w:val="20"/>
+          <w:szCs w:val="20"/>
+        </w:rPr>
+        <w:t xml:space="preserve"> No hyperparameter tuning for the </w:t>
+      </w:r>
+      <w:r>
+        <w:rPr>
+          <w:rFonts w:ascii="Aptos" w:eastAsia="Aptos" w:hAnsi="Aptos" w:cs="Aptos"/>
+          <w:sz w:val="20"/>
+          <w:szCs w:val="20"/>
+        </w:rPr>
+        <w:t xml:space="preserve">ε-decay </w:t>
+      </w:r>
+      <w:r>
+        <w:rPr>
+          <w:rFonts w:ascii="Aptos" w:eastAsia="Aptos" w:hAnsi="Aptos" w:cs="Aptos"/>
+          <w:sz w:val="20"/>
+          <w:szCs w:val="20"/>
+        </w:rPr>
+        <w:t>was applied. This was set at</w:t>
+      </w:r>
+      <w:r>
+        <w:rPr>
+          <w:rFonts w:ascii="Aptos" w:eastAsia="Aptos" w:hAnsi="Aptos" w:cs="Aptos"/>
+          <w:sz w:val="20"/>
+          <w:szCs w:val="20"/>
+        </w:rPr>
+        <w:t xml:space="preserve"> </w:t>
+      </w:r>
+      <w:r>
+        <w:rPr>
+          <w:rFonts w:ascii="Aptos" w:eastAsia="Aptos" w:hAnsi="Aptos" w:cs="Aptos"/>
+          <w:sz w:val="20"/>
+          <w:szCs w:val="20"/>
+        </w:rPr>
+        <w:t>0.9999</w:t>
+      </w:r>
+      <w:r>
+        <w:rPr>
+          <w:rFonts w:ascii="Aptos" w:eastAsia="Aptos" w:hAnsi="Aptos" w:cs="Aptos"/>
+          <w:sz w:val="20"/>
+          <w:szCs w:val="20"/>
+        </w:rPr>
+        <w:t xml:space="preserve">, this was done to reach </w:t>
+      </w:r>
+      <w:r>
+        <w:rPr>
+          <w:rFonts w:ascii="Aptos" w:eastAsia="Aptos" w:hAnsi="Aptos" w:cs="Aptos"/>
+          <w:sz w:val="20"/>
+          <w:szCs w:val="20"/>
+        </w:rPr>
+        <w:t>ε</w:t>
+      </w:r>
+      <w:r>
+        <w:rPr>
+          <w:rFonts w:ascii="Aptos" w:eastAsia="Aptos" w:hAnsi="Aptos" w:cs="Aptos"/>
+          <w:sz w:val="20"/>
+          <w:szCs w:val="20"/>
+        </w:rPr>
+        <w:t>-min (0.05) at approximately 30,000 steps.</w:t>
       </w:r>
     </w:p>
     <w:p>
       <w:pPr>
         <w:spacing w:line="276" w:lineRule="auto"/>
+        <w:jc w:val="both"/>
         <w:rPr>
           <w:rFonts w:ascii="Aptos" w:eastAsia="Aptos" w:hAnsi="Aptos" w:cs="Aptos"/>
           <w:sz w:val="20"/>
@@ -3871,8 +4411,18 @@
     </w:p>
     <w:p>
       <w:pPr>
-        <w:rPr>
-          <w:rFonts w:asciiTheme="majorHAnsi" w:eastAsiaTheme="majorEastAsia" w:hAnsiTheme="majorHAnsi" w:cstheme="majorBidi"/>
+        <w:spacing w:line="276" w:lineRule="auto"/>
+        <w:rPr>
+          <w:rFonts w:ascii="Aptos" w:eastAsia="Aptos" w:hAnsi="Aptos" w:cs="Aptos"/>
+          <w:sz w:val="20"/>
+          <w:szCs w:val="20"/>
+        </w:rPr>
+      </w:pPr>
+    </w:p>
+    <w:p>
+      <w:pPr>
+        <w:rPr>
+          <w:rFonts w:asciiTheme="majorHAnsi" w:eastAsiaTheme="majorEastAsia" w:hAnsiTheme="majorHAnsi" w:cstheme="majorBidi" w:hint="eastAsia"/>
           <w:color w:val="0F4761" w:themeColor="accent1" w:themeShade="BF"/>
           <w:sz w:val="40"/>
           <w:szCs w:val="40"/>
@@ -3885,19 +4435,37 @@
     <w:p>
       <w:pPr>
         <w:pStyle w:val="Heading1"/>
-      </w:pPr>
-      <w:r>
+        <w:rPr>
+          <w:rFonts w:hint="eastAsia"/>
+        </w:rPr>
+      </w:pPr>
+      <w:r>
+        <w:lastRenderedPageBreak/>
         <w:t>Results</w:t>
       </w:r>
     </w:p>
     <w:p>
       <w:pPr>
-        <w:rPr>
-          <w:sz w:val="20"/>
-          <w:szCs w:val="20"/>
-        </w:rPr>
-      </w:pPr>
-      <w:commentRangeStart w:id="0"/>
+        <w:jc w:val="both"/>
+        <w:rPr>
+          <w:sz w:val="20"/>
+          <w:szCs w:val="20"/>
+        </w:rPr>
+      </w:pPr>
+      <w:r>
+        <w:rPr>
+          <w:sz w:val="20"/>
+          <w:szCs w:val="20"/>
+        </w:rPr>
+        <w:t>All runs were performed on a laptop with a 13th Gen Intel Core i7-13700H CPU (2.40 GHz), 64 GB RAM, and an NVIDIA RTX 2000 Ada Generation Laptop GPU, running 64-bit Windows.</w:t>
+      </w:r>
+      <w:r>
+        <w:rPr>
+          <w:sz w:val="20"/>
+          <w:szCs w:val="20"/>
+        </w:rPr>
+        <w:t xml:space="preserve"> </w:t>
+      </w:r>
       <w:r>
         <w:rPr>
           <w:sz w:val="20"/>
@@ -3974,15 +4542,6 @@
           <w:szCs w:val="20"/>
         </w:rPr>
         <w:t xml:space="preserve"> these settings were applied for the TD approaches.</w:t>
-      </w:r>
-      <w:commentRangeEnd w:id="0"/>
-      <w:r>
-        <w:rPr>
-          <w:rStyle w:val="CommentReference"/>
-          <w:sz w:val="20"/>
-          <w:szCs w:val="20"/>
-        </w:rPr>
-        <w:commentReference w:id="0"/>
       </w:r>
     </w:p>
     <w:p>
@@ -4305,7 +4864,7 @@
                           <pic:cNvPicPr/>
                         </pic:nvPicPr>
                         <pic:blipFill>
-                          <a:blip r:embed="rId11" cstate="print">
+                          <a:blip r:embed="rId7" cstate="print">
                             <a:extLst>
                               <a:ext uri="{28A0092B-C50C-407E-A947-70E740481C1C}">
                                 <a14:useLocalDpi xmlns:a14="http://schemas.microsoft.com/office/drawing/2010/main" val="0"/>
@@ -4363,7 +4922,7 @@
                           <pic:cNvPicPr/>
                         </pic:nvPicPr>
                         <pic:blipFill>
-                          <a:blip r:embed="rId12" cstate="print">
+                          <a:blip r:embed="rId8" cstate="print">
                             <a:extLst>
                               <a:ext uri="{28A0092B-C50C-407E-A947-70E740481C1C}">
                                 <a14:useLocalDpi xmlns:a14="http://schemas.microsoft.com/office/drawing/2010/main" val="0"/>
@@ -5189,7 +5748,7 @@
           <w:sz w:val="20"/>
           <w:szCs w:val="20"/>
         </w:rPr>
-        <w:t xml:space="preserve">-value is of lower relevance, and is therefore not looked further into during the analyses. </w:t>
+        <w:t xml:space="preserve">-value is of lower relevance and is therefore not looked further into during the analyses. </w:t>
       </w:r>
       <w:r>
         <w:rPr>
@@ -5432,7 +5991,16 @@
           <w:sz w:val="20"/>
           <w:szCs w:val="20"/>
         </w:rPr>
-        <w:t xml:space="preserve">expand. Overall, the DP models </w:t>
+        <w:t xml:space="preserve">expand. Overall, </w:t>
+      </w:r>
+      <w:r>
+        <w:rPr>
+          <w:rFonts w:eastAsiaTheme="minorEastAsia"/>
+          <w:sz w:val="20"/>
+          <w:szCs w:val="20"/>
+        </w:rPr>
+        <w:lastRenderedPageBreak/>
+        <w:t xml:space="preserve">the DP models </w:t>
       </w:r>
       <w:r>
         <w:rPr>
@@ -5570,7 +6138,7 @@
                           <pic:cNvPicPr/>
                         </pic:nvPicPr>
                         <pic:blipFill rotWithShape="1">
-                          <a:blip r:embed="rId13" cstate="print">
+                          <a:blip r:embed="rId9" cstate="print">
                             <a:extLst>
                               <a:ext uri="{28A0092B-C50C-407E-A947-70E740481C1C}">
                                 <a14:useLocalDpi xmlns:a14="http://schemas.microsoft.com/office/drawing/2010/main" val="0"/>
@@ -5638,7 +6206,7 @@
                           <pic:cNvPicPr/>
                         </pic:nvPicPr>
                         <pic:blipFill rotWithShape="1">
-                          <a:blip r:embed="rId14" cstate="print">
+                          <a:blip r:embed="rId10" cstate="print">
                             <a:extLst>
                               <a:ext uri="{28A0092B-C50C-407E-A947-70E740481C1C}">
                                 <a14:useLocalDpi xmlns:a14="http://schemas.microsoft.com/office/drawing/2010/main" val="0"/>
@@ -5707,7 +6275,7 @@
                           <pic:cNvPicPr/>
                         </pic:nvPicPr>
                         <pic:blipFill>
-                          <a:blip r:embed="rId15" cstate="print">
+                          <a:blip r:embed="rId11" cstate="print">
                             <a:extLst>
                               <a:ext uri="{28A0092B-C50C-407E-A947-70E740481C1C}">
                                 <a14:useLocalDpi xmlns:a14="http://schemas.microsoft.com/office/drawing/2010/main" val="0"/>
@@ -5864,7 +6432,22 @@
           <w:szCs w:val="20"/>
         </w:rPr>
         <w:tab/>
-        <w:t>That is why a Tukey’s</w:t>
+      </w:r>
+      <w:r>
+        <w:rPr>
+          <w:rFonts w:eastAsiaTheme="minorEastAsia"/>
+          <w:sz w:val="20"/>
+          <w:szCs w:val="20"/>
+        </w:rPr>
+        <w:t>Hence,</w:t>
+      </w:r>
+      <w:r>
+        <w:rPr>
+          <w:rFonts w:eastAsiaTheme="minorEastAsia"/>
+          <w:sz w:val="20"/>
+          <w:szCs w:val="20"/>
+        </w:rPr>
+        <w:t xml:space="preserve"> a Tukey’s</w:t>
       </w:r>
       <w:r>
         <w:rPr>
@@ -6082,15 +6665,23 @@
           <w:sz w:val="20"/>
           <w:szCs w:val="20"/>
         </w:rPr>
-        <w:t xml:space="preserve">TD is </w:t>
-      </w:r>
-      <w:r>
-        <w:rPr>
-          <w:rFonts w:eastAsiaTheme="minorEastAsia"/>
-          <w:sz w:val="20"/>
-          <w:szCs w:val="20"/>
-        </w:rPr>
-        <w:t>has a statistical lower waste production than the FDC</w:t>
+        <w:t xml:space="preserve">TD </w:t>
+      </w:r>
+      <w:r>
+        <w:rPr>
+          <w:rFonts w:eastAsiaTheme="minorEastAsia"/>
+          <w:sz w:val="20"/>
+          <w:szCs w:val="20"/>
+        </w:rPr>
+        <w:t>has</w:t>
+      </w:r>
+      <w:r>
+        <w:rPr>
+          <w:rFonts w:eastAsiaTheme="minorEastAsia"/>
+          <w:sz w:val="20"/>
+          <w:szCs w:val="20"/>
+        </w:rPr>
+        <w:t xml:space="preserve"> a statistical lower waste production than the FDC</w:t>
       </w:r>
       <w:r>
         <w:rPr>
@@ -6207,7 +6798,34 @@
           <w:sz w:val="20"/>
           <w:szCs w:val="20"/>
         </w:rPr>
-        <w:t xml:space="preserve"> take a few more seconds to compute than the DP models, in higher state space the TD models underscore the computational needs of DP.</w:t>
+        <w:t xml:space="preserve"> take a few more seconds to compute than the DP models, in higher state space the TD models </w:t>
+      </w:r>
+      <w:commentRangeStart w:id="0"/>
+      <w:r>
+        <w:rPr>
+          <w:rFonts w:eastAsiaTheme="minorEastAsia"/>
+          <w:sz w:val="20"/>
+          <w:szCs w:val="20"/>
+        </w:rPr>
+        <w:t xml:space="preserve">underscore </w:t>
+      </w:r>
+      <w:commentRangeEnd w:id="0"/>
+      <w:r>
+        <w:rPr>
+          <w:rStyle w:val="CommentReference"/>
+          <w:rFonts w:eastAsiaTheme="minorEastAsia"/>
+          <w:sz w:val="20"/>
+          <w:szCs w:val="20"/>
+        </w:rPr>
+        <w:commentReference w:id="0"/>
+      </w:r>
+      <w:r>
+        <w:rPr>
+          <w:rFonts w:eastAsiaTheme="minorEastAsia"/>
+          <w:sz w:val="20"/>
+          <w:szCs w:val="20"/>
+        </w:rPr>
+        <w:t>the computational needs of DP.</w:t>
       </w:r>
       <w:r>
         <w:rPr>
@@ -6262,6 +6880,7 @@
           <w:rFonts w:eastAsiaTheme="minorEastAsia"/>
           <w:noProof/>
         </w:rPr>
+        <w:lastRenderedPageBreak/>
         <w:drawing>
           <wp:inline distT="0" distB="0" distL="0" distR="0" wp14:anchorId="438EF352" wp14:editId="2C3F41AC">
             <wp:extent cx="3686125" cy="3780000"/>
@@ -6464,6 +7083,7 @@
           <w:sz w:val="20"/>
           <w:szCs w:val="20"/>
         </w:rPr>
+        <w:lastRenderedPageBreak/>
         <w:t>Figure 4. Changes in waste during inventory state space expansion.</w:t>
       </w:r>
       <w:r>
@@ -6635,7 +7255,7 @@
     <w:p>
       <w:pPr>
         <w:rPr>
-          <w:rFonts w:asciiTheme="majorHAnsi" w:eastAsiaTheme="majorEastAsia" w:hAnsiTheme="majorHAnsi" w:cstheme="majorBidi"/>
+          <w:rFonts w:asciiTheme="majorHAnsi" w:eastAsiaTheme="majorEastAsia" w:hAnsiTheme="majorHAnsi" w:cstheme="majorBidi" w:hint="eastAsia"/>
           <w:color w:val="0F4761" w:themeColor="accent1" w:themeShade="BF"/>
           <w:sz w:val="40"/>
           <w:szCs w:val="40"/>
@@ -6648,8 +7268,12 @@
     <w:p>
       <w:pPr>
         <w:pStyle w:val="Heading1"/>
-      </w:pPr>
-      <w:r>
+        <w:rPr>
+          <w:rFonts w:hint="eastAsia"/>
+        </w:rPr>
+      </w:pPr>
+      <w:r>
+        <w:lastRenderedPageBreak/>
         <w:t>Discussion</w:t>
       </w:r>
     </w:p>
@@ -6800,14 +7424,21 @@
           <w:sz w:val="20"/>
           <w:szCs w:val="20"/>
         </w:rPr>
-        <w:t>Reinforcement learning (</w:t>
-      </w:r>
-      <w:r>
-        <w:rPr>
-          <w:sz w:val="20"/>
-          <w:szCs w:val="20"/>
-        </w:rPr>
-        <w:t>RL</w:t>
+        <w:t xml:space="preserve">Temporal Difference </w:t>
+      </w:r>
+      <w:r>
+        <w:rPr>
+          <w:sz w:val="20"/>
+          <w:szCs w:val="20"/>
+        </w:rPr>
+        <w:t>(</w:t>
+      </w:r>
+      <w:r>
+        <w:rPr>
+          <w:sz w:val="20"/>
+          <w:szCs w:val="20"/>
+        </w:rPr>
+        <w:t>TD</w:t>
       </w:r>
       <w:r>
         <w:rPr>
@@ -6821,7 +7452,64 @@
           <w:sz w:val="20"/>
           <w:szCs w:val="20"/>
         </w:rPr>
-        <w:t xml:space="preserve"> achieved a significantly lower profit than FDC while only matching waste reduction at small inventory states.</w:t>
+        <w:t xml:space="preserve"> achieved a significantly lower profit than FDC while only waste </w:t>
+      </w:r>
+      <w:r>
+        <w:rPr>
+          <w:sz w:val="20"/>
+          <w:szCs w:val="20"/>
+        </w:rPr>
+        <w:t>performance</w:t>
+      </w:r>
+      <w:r>
+        <w:rPr>
+          <w:sz w:val="20"/>
+          <w:szCs w:val="20"/>
+        </w:rPr>
+        <w:t xml:space="preserve"> depends on demand rate, being better at low </w:t>
+      </w:r>
+      <m:oMath>
+        <m:r>
+          <w:rPr>
+            <w:rFonts w:ascii="Cambria Math" w:hAnsi="Cambria Math"/>
+            <w:sz w:val="20"/>
+            <w:szCs w:val="20"/>
+          </w:rPr>
+          <m:t>mu</m:t>
+        </m:r>
+      </m:oMath>
+      <w:r>
+        <w:rPr>
+          <w:rFonts w:eastAsiaTheme="minorEastAsia"/>
+          <w:sz w:val="20"/>
+          <w:szCs w:val="20"/>
+        </w:rPr>
+        <w:t xml:space="preserve"> and worse at a higher</w:t>
+      </w:r>
+      <w:r>
+        <w:rPr>
+          <w:rFonts w:eastAsiaTheme="minorEastAsia"/>
+          <w:sz w:val="20"/>
+          <w:szCs w:val="20"/>
+        </w:rPr>
+        <w:t xml:space="preserve"> value of </w:t>
+      </w:r>
+      <m:oMath>
+        <m:r>
+          <w:rPr>
+            <w:rFonts w:ascii="Cambria Math" w:eastAsiaTheme="minorEastAsia" w:hAnsi="Cambria Math"/>
+            <w:sz w:val="20"/>
+            <w:szCs w:val="20"/>
+          </w:rPr>
+          <m:t>mu</m:t>
+        </m:r>
+      </m:oMath>
+      <w:r>
+        <w:rPr>
+          <w:sz w:val="20"/>
+          <w:szCs w:val="20"/>
+        </w:rPr>
+        <w:t>.</w:t>
       </w:r>
       <w:r>
         <w:rPr>
@@ -6842,7 +7530,24 @@
           <w:sz w:val="20"/>
           <w:szCs w:val="20"/>
         </w:rPr>
-        <w:t>of Haijema et al.</w:t>
+        <w:t xml:space="preserve">of </w:t>
+      </w:r>
+      <w:commentRangeStart w:id="1"/>
+      <w:r>
+        <w:rPr>
+          <w:sz w:val="20"/>
+          <w:szCs w:val="20"/>
+        </w:rPr>
+        <w:t>Haijema et al.</w:t>
+      </w:r>
+      <w:commentRangeEnd w:id="1"/>
+      <w:r>
+        <w:rPr>
+          <w:rStyle w:val="CommentReference"/>
+          <w:sz w:val="20"/>
+          <w:szCs w:val="20"/>
+        </w:rPr>
+        <w:commentReference w:id="1"/>
       </w:r>
     </w:p>
     <w:p>
@@ -6881,7 +7586,21 @@
           <w:sz w:val="20"/>
           <w:szCs w:val="20"/>
         </w:rPr>
-        <w:t xml:space="preserve"> to Haijema’s D1 policy, which consistently yielded smaller </w:t>
+        <w:t xml:space="preserve"> to </w:t>
+      </w:r>
+      <w:r>
+        <w:rPr>
+          <w:sz w:val="20"/>
+          <w:szCs w:val="20"/>
+        </w:rPr>
+        <w:t>the papers</w:t>
+      </w:r>
+      <w:r>
+        <w:rPr>
+          <w:sz w:val="20"/>
+          <w:szCs w:val="20"/>
+        </w:rPr>
+        <w:t xml:space="preserve"> D1 policy, which consistently yielded smaller </w:t>
       </w:r>
       <w:r>
         <w:rPr>
@@ -6941,7 +7660,45 @@
           <w:sz w:val="20"/>
           <w:szCs w:val="20"/>
         </w:rPr>
-        <w:t>, the amount FEFO buyers is proportional to the amount of discount given. In the paper of Haijema et al. the model instead introduces a sensitivity parameter, governing what fraction of LEFO customers respond to a given discount level. The absence of such parameter in the model provided in the paper, means that discount responsiveness is uniform across all LEFO customers, which is unlikely to hold in practice.</w:t>
+        <w:t>, the amount FEFO buyers is proportional to the amount of discount given. In the paper of</w:t>
+      </w:r>
+      <w:commentRangeStart w:id="2"/>
+      <w:r>
+        <w:rPr>
+          <w:sz w:val="20"/>
+          <w:szCs w:val="20"/>
+        </w:rPr>
+        <w:t xml:space="preserve"> Haijema et al. </w:t>
+      </w:r>
+      <w:commentRangeEnd w:id="2"/>
+      <w:r>
+        <w:rPr>
+          <w:rStyle w:val="CommentReference"/>
+          <w:sz w:val="20"/>
+          <w:szCs w:val="20"/>
+        </w:rPr>
+        <w:commentReference w:id="2"/>
+      </w:r>
+      <w:r>
+        <w:rPr>
+          <w:sz w:val="20"/>
+          <w:szCs w:val="20"/>
+        </w:rPr>
+        <w:t xml:space="preserve">the model instead introduces a sensitivity parameter, governing what fraction of LEFO customers respond to a given discount level. The absence of such parameter in </w:t>
+      </w:r>
+      <w:r>
+        <w:rPr>
+          <w:sz w:val="20"/>
+          <w:szCs w:val="20"/>
+        </w:rPr>
+        <w:t>our</w:t>
+      </w:r>
+      <w:r>
+        <w:rPr>
+          <w:sz w:val="20"/>
+          <w:szCs w:val="20"/>
+        </w:rPr>
+        <w:t xml:space="preserve"> model, means that discount responsiveness is uniform across all LEFO customers, which is unlikely to hold in practice.</w:t>
       </w:r>
     </w:p>
     <w:p>
@@ -7057,14 +7814,21 @@
           <w:sz w:val="20"/>
           <w:szCs w:val="20"/>
         </w:rPr>
-        <w:t>. The absence of a</w:t>
-      </w:r>
-      <w:r>
-        <w:rPr>
-          <w:sz w:val="20"/>
-          <w:szCs w:val="20"/>
-        </w:rPr>
-        <w:t xml:space="preserve">n price-elasticity parameter </w:t>
+        <w:t xml:space="preserve">. The absence of </w:t>
+      </w:r>
+      <w:r>
+        <w:rPr>
+          <w:sz w:val="20"/>
+          <w:szCs w:val="20"/>
+        </w:rPr>
+        <w:t>a</w:t>
+      </w:r>
+      <w:r>
+        <w:rPr>
+          <w:sz w:val="20"/>
+          <w:szCs w:val="20"/>
+        </w:rPr>
+        <w:t xml:space="preserve"> price-elasticity parameter </w:t>
       </w:r>
       <w:r>
         <w:rPr>
@@ -7080,6 +7844,7 @@
         </w:rPr>
         <w:t xml:space="preserve"> as the one in </w:t>
       </w:r>
+      <w:commentRangeStart w:id="3"/>
       <w:r>
         <w:rPr>
           <w:rFonts w:ascii="Aptos" w:eastAsia="Aptos" w:hAnsi="Aptos" w:cs="Aptos"/>
@@ -7094,7 +7859,25 @@
           <w:sz w:val="20"/>
           <w:szCs w:val="20"/>
         </w:rPr>
-        <w:t xml:space="preserve"> imposes a structural ceiling </w:t>
+        <w:t xml:space="preserve"> </w:t>
+      </w:r>
+      <w:commentRangeEnd w:id="3"/>
+      <w:r>
+        <w:rPr>
+          <w:rStyle w:val="CommentReference"/>
+          <w:rFonts w:ascii="Aptos" w:eastAsia="Aptos" w:hAnsi="Aptos" w:cs="Aptos"/>
+          <w:sz w:val="20"/>
+          <w:szCs w:val="20"/>
+        </w:rPr>
+        <w:commentReference w:id="3"/>
+      </w:r>
+      <w:r>
+        <w:rPr>
+          <w:rFonts w:ascii="Aptos" w:eastAsia="Aptos" w:hAnsi="Aptos" w:cs="Aptos"/>
+          <w:sz w:val="20"/>
+          <w:szCs w:val="20"/>
+        </w:rPr>
+        <w:t xml:space="preserve">imposes a structural ceiling </w:t>
       </w:r>
       <w:r>
         <w:rPr>
@@ -7135,198 +7918,6 @@
           <w:szCs w:val="20"/>
         </w:rPr>
         <w:t>.</w:t>
-      </w:r>
-    </w:p>
-    <w:p>
-      <w:pPr>
-        <w:spacing w:after="0"/>
-        <w:jc w:val="both"/>
-        <w:rPr>
-          <w:sz w:val="20"/>
-          <w:szCs w:val="20"/>
-        </w:rPr>
-      </w:pPr>
-      <w:r>
-        <w:rPr>
-          <w:sz w:val="20"/>
-          <w:szCs w:val="20"/>
-        </w:rPr>
-        <w:t xml:space="preserve">TD’s contribution lies in computational efficiency rather than policy </w:t>
-      </w:r>
-      <w:r>
-        <w:rPr>
-          <w:sz w:val="20"/>
-          <w:szCs w:val="20"/>
-        </w:rPr>
-        <w:t xml:space="preserve">quality. </w:t>
-      </w:r>
-      <w:r>
-        <w:rPr>
-          <w:sz w:val="20"/>
-          <w:szCs w:val="20"/>
-        </w:rPr>
-        <w:t>Although</w:t>
-      </w:r>
-      <w:r>
-        <w:rPr>
-          <w:sz w:val="20"/>
-          <w:szCs w:val="20"/>
-        </w:rPr>
-        <w:t xml:space="preserve"> TD did not outperform </w:t>
-      </w:r>
-      <w:r>
-        <w:rPr>
-          <w:sz w:val="20"/>
-          <w:szCs w:val="20"/>
-        </w:rPr>
-        <w:t>FDC</w:t>
-      </w:r>
-      <w:r>
-        <w:rPr>
-          <w:sz w:val="20"/>
-          <w:szCs w:val="20"/>
-        </w:rPr>
-        <w:t xml:space="preserve">, </w:t>
-      </w:r>
-      <w:r>
-        <w:rPr>
-          <w:sz w:val="20"/>
-          <w:szCs w:val="20"/>
-        </w:rPr>
-        <w:t>it appro</w:t>
-      </w:r>
-      <w:r>
-        <w:rPr>
-          <w:sz w:val="20"/>
-          <w:szCs w:val="20"/>
-        </w:rPr>
-        <w:t xml:space="preserve">ached the values closely and could possibly proof </w:t>
-      </w:r>
-      <w:r>
-        <w:rPr>
-          <w:sz w:val="20"/>
-          <w:szCs w:val="20"/>
-        </w:rPr>
-        <w:t>its</w:t>
-      </w:r>
-      <w:r>
-        <w:rPr>
-          <w:sz w:val="20"/>
-          <w:szCs w:val="20"/>
-        </w:rPr>
-        <w:t xml:space="preserve"> usefulness in more challenging environments where DP </w:t>
-      </w:r>
-      <w:r>
-        <w:rPr>
-          <w:sz w:val="20"/>
-          <w:szCs w:val="20"/>
-        </w:rPr>
-        <w:t xml:space="preserve">run times would </w:t>
-      </w:r>
-      <w:r>
-        <w:rPr>
-          <w:sz w:val="20"/>
-          <w:szCs w:val="20"/>
-        </w:rPr>
-        <w:t xml:space="preserve">grow </w:t>
-      </w:r>
-      <w:r>
-        <w:rPr>
-          <w:sz w:val="20"/>
-          <w:szCs w:val="20"/>
-        </w:rPr>
-        <w:t>exponentially</w:t>
-      </w:r>
-      <w:r>
-        <w:rPr>
-          <w:sz w:val="20"/>
-          <w:szCs w:val="20"/>
-        </w:rPr>
-        <w:t xml:space="preserve"> and FDC approaches could potentially be outperformed. These findings are </w:t>
-      </w:r>
-      <w:r>
-        <w:rPr>
-          <w:sz w:val="20"/>
-          <w:szCs w:val="20"/>
-        </w:rPr>
-        <w:t xml:space="preserve">consistent with </w:t>
-      </w:r>
-      <w:r>
-        <w:rPr>
-          <w:sz w:val="20"/>
-          <w:szCs w:val="20"/>
-        </w:rPr>
-        <w:t>Yavuz and Kaya (2024), who reported that Deep Q-learning and Sof</w:t>
-      </w:r>
-      <w:r>
-        <w:rPr>
-          <w:sz w:val="20"/>
-          <w:szCs w:val="20"/>
-        </w:rPr>
-        <w:t xml:space="preserve">t Actor Critic approaches </w:t>
-      </w:r>
-      <w:r>
-        <w:rPr>
-          <w:sz w:val="20"/>
-          <w:szCs w:val="20"/>
-        </w:rPr>
-        <w:t xml:space="preserve">reached </w:t>
-      </w:r>
-      <w:r>
-        <w:rPr>
-          <w:sz w:val="20"/>
-          <w:szCs w:val="20"/>
-        </w:rPr>
-        <w:t xml:space="preserve">~95-97% of DP’s reward while requiring substantially less computation as the state space grows. This </w:t>
-      </w:r>
-      <w:r>
-        <w:rPr>
-          <w:sz w:val="20"/>
-          <w:szCs w:val="20"/>
-        </w:rPr>
-        <w:t xml:space="preserve">indicates that TD is the more practical choice </w:t>
-      </w:r>
-      <w:r>
-        <w:rPr>
-          <w:sz w:val="20"/>
-          <w:szCs w:val="20"/>
-        </w:rPr>
-        <w:t>wit</w:t>
-      </w:r>
-      <w:r>
-        <w:rPr>
-          <w:sz w:val="20"/>
-          <w:szCs w:val="20"/>
-        </w:rPr>
-        <w:t xml:space="preserve">h a policy that was </w:t>
-      </w:r>
-      <w:r>
-        <w:rPr>
-          <w:sz w:val="20"/>
-          <w:szCs w:val="20"/>
-        </w:rPr>
-        <w:t xml:space="preserve">almost as good as DP, but </w:t>
-      </w:r>
-      <w:r>
-        <w:rPr>
-          <w:sz w:val="20"/>
-          <w:szCs w:val="20"/>
-        </w:rPr>
-        <w:t xml:space="preserve">much </w:t>
-      </w:r>
-      <w:r>
-        <w:rPr>
-          <w:sz w:val="20"/>
-          <w:szCs w:val="20"/>
-        </w:rPr>
-        <w:t>faster.</w:t>
-      </w:r>
-      <w:r>
-        <w:rPr>
-          <w:sz w:val="20"/>
-          <w:szCs w:val="20"/>
-        </w:rPr>
-        <w:t xml:space="preserve"> </w:t>
       </w:r>
     </w:p>
     <w:p>
@@ -7344,7 +7935,199 @@
           <w:sz w:val="20"/>
           <w:szCs w:val="20"/>
         </w:rPr>
-        <w:t>The strength of this study is the direct comparison method of an exact DP approach against model free approximated approaches, SARSA and Q-learning, while comparing this to a practical baseline (FDC) under identical environment assumptions, which isolated computation time as the deciding factor between DP and TD once their policy quality is shown to be statistically equivalent. The biggest weakness of this study was the single day discount restriction, the uniform LEFO response assumption and the extra demand mechanism, each of these constrains the profit and waste improvements achievable in any method and could have shown the real strengths of TD performance over the FDC. Another limitation was the manual hyperparameter tuning and the small amounts of seeds that was tested. A more exhaustive or automative search might have narrowed the gap between TD and DP.</w:t>
+        <w:t xml:space="preserve">TD’s contribution lies in computational efficiency rather than policy </w:t>
+      </w:r>
+      <w:r>
+        <w:rPr>
+          <w:sz w:val="20"/>
+          <w:szCs w:val="20"/>
+        </w:rPr>
+        <w:t xml:space="preserve">quality. </w:t>
+      </w:r>
+      <w:r>
+        <w:rPr>
+          <w:sz w:val="20"/>
+          <w:szCs w:val="20"/>
+        </w:rPr>
+        <w:t>Although</w:t>
+      </w:r>
+      <w:r>
+        <w:rPr>
+          <w:sz w:val="20"/>
+          <w:szCs w:val="20"/>
+        </w:rPr>
+        <w:t xml:space="preserve"> TD did not outperform </w:t>
+      </w:r>
+      <w:r>
+        <w:rPr>
+          <w:sz w:val="20"/>
+          <w:szCs w:val="20"/>
+        </w:rPr>
+        <w:t>FDC</w:t>
+      </w:r>
+      <w:r>
+        <w:rPr>
+          <w:sz w:val="20"/>
+          <w:szCs w:val="20"/>
+        </w:rPr>
+        <w:t xml:space="preserve">, </w:t>
+      </w:r>
+      <w:r>
+        <w:rPr>
+          <w:sz w:val="20"/>
+          <w:szCs w:val="20"/>
+        </w:rPr>
+        <w:t>it appro</w:t>
+      </w:r>
+      <w:r>
+        <w:rPr>
+          <w:sz w:val="20"/>
+          <w:szCs w:val="20"/>
+        </w:rPr>
+        <w:t xml:space="preserve">ached the values closely and could possibly proof </w:t>
+      </w:r>
+      <w:r>
+        <w:rPr>
+          <w:sz w:val="20"/>
+          <w:szCs w:val="20"/>
+        </w:rPr>
+        <w:t>its</w:t>
+      </w:r>
+      <w:r>
+        <w:rPr>
+          <w:sz w:val="20"/>
+          <w:szCs w:val="20"/>
+        </w:rPr>
+        <w:t xml:space="preserve"> usefulness in more challenging environments where DP </w:t>
+      </w:r>
+      <w:r>
+        <w:rPr>
+          <w:sz w:val="20"/>
+          <w:szCs w:val="20"/>
+        </w:rPr>
+        <w:t xml:space="preserve">run times would </w:t>
+      </w:r>
+      <w:r>
+        <w:rPr>
+          <w:sz w:val="20"/>
+          <w:szCs w:val="20"/>
+        </w:rPr>
+        <w:t xml:space="preserve">grow </w:t>
+      </w:r>
+      <w:r>
+        <w:rPr>
+          <w:sz w:val="20"/>
+          <w:szCs w:val="20"/>
+        </w:rPr>
+        <w:t>exponentially</w:t>
+      </w:r>
+      <w:r>
+        <w:rPr>
+          <w:sz w:val="20"/>
+          <w:szCs w:val="20"/>
+        </w:rPr>
+        <w:t xml:space="preserve"> and FDC approaches could potentially be outperformed. These findings are </w:t>
+      </w:r>
+      <w:r>
+        <w:rPr>
+          <w:sz w:val="20"/>
+          <w:szCs w:val="20"/>
+        </w:rPr>
+        <w:t xml:space="preserve">consistent with </w:t>
+      </w:r>
+      <w:commentRangeStart w:id="4"/>
+      <w:r>
+        <w:rPr>
+          <w:sz w:val="20"/>
+          <w:szCs w:val="20"/>
+        </w:rPr>
+        <w:t xml:space="preserve">Yavuz and Kaya (2024), </w:t>
+      </w:r>
+      <w:commentRangeEnd w:id="4"/>
+      <w:r>
+        <w:rPr>
+          <w:rStyle w:val="CommentReference"/>
+          <w:sz w:val="20"/>
+          <w:szCs w:val="20"/>
+        </w:rPr>
+        <w:commentReference w:id="4"/>
+      </w:r>
+      <w:r>
+        <w:rPr>
+          <w:sz w:val="20"/>
+          <w:szCs w:val="20"/>
+        </w:rPr>
+        <w:t>who reported that Deep Q-learning and Sof</w:t>
+      </w:r>
+      <w:r>
+        <w:rPr>
+          <w:sz w:val="20"/>
+          <w:szCs w:val="20"/>
+        </w:rPr>
+        <w:t xml:space="preserve">t Actor Critic approaches </w:t>
+      </w:r>
+      <w:r>
+        <w:rPr>
+          <w:sz w:val="20"/>
+          <w:szCs w:val="20"/>
+        </w:rPr>
+        <w:t xml:space="preserve">reached </w:t>
+      </w:r>
+      <w:r>
+        <w:rPr>
+          <w:sz w:val="20"/>
+          <w:szCs w:val="20"/>
+        </w:rPr>
+        <w:t xml:space="preserve">~95% of DP’s reward while requiring substantially less computation as the state space grows. This </w:t>
+      </w:r>
+      <w:r>
+        <w:rPr>
+          <w:sz w:val="20"/>
+          <w:szCs w:val="20"/>
+        </w:rPr>
+        <w:t xml:space="preserve">indicates that TD is the more practical choice </w:t>
+      </w:r>
+      <w:r>
+        <w:rPr>
+          <w:sz w:val="20"/>
+          <w:szCs w:val="20"/>
+        </w:rPr>
+        <w:t>wit</w:t>
+      </w:r>
+      <w:r>
+        <w:rPr>
+          <w:sz w:val="20"/>
+          <w:szCs w:val="20"/>
+        </w:rPr>
+        <w:t xml:space="preserve">h a policy that was </w:t>
+      </w:r>
+      <w:r>
+        <w:rPr>
+          <w:sz w:val="20"/>
+          <w:szCs w:val="20"/>
+        </w:rPr>
+        <w:t xml:space="preserve">almost as good as DP, but </w:t>
+      </w:r>
+      <w:r>
+        <w:rPr>
+          <w:sz w:val="20"/>
+          <w:szCs w:val="20"/>
+        </w:rPr>
+        <w:t xml:space="preserve">much </w:t>
+      </w:r>
+      <w:r>
+        <w:rPr>
+          <w:sz w:val="20"/>
+          <w:szCs w:val="20"/>
+        </w:rPr>
+        <w:t>faster.</w:t>
+      </w:r>
+      <w:r>
+        <w:rPr>
+          <w:sz w:val="20"/>
+          <w:szCs w:val="20"/>
+        </w:rPr>
+        <w:t xml:space="preserve"> </w:t>
       </w:r>
     </w:p>
     <w:p>
@@ -7362,21 +8145,7 @@
           <w:sz w:val="20"/>
           <w:szCs w:val="20"/>
         </w:rPr>
-        <w:t xml:space="preserve">Three extensions follow directly from the limitations above. First, extending the action space to two simultaneous discount levels. Second, introducing a sensitivity parameter governing what fraction </w:t>
-      </w:r>
-      <w:r>
-        <w:rPr>
-          <w:sz w:val="20"/>
-          <w:szCs w:val="20"/>
-        </w:rPr>
-        <w:t>LEFO</w:t>
-      </w:r>
-      <w:r>
-        <w:rPr>
-          <w:sz w:val="20"/>
-          <w:szCs w:val="20"/>
-        </w:rPr>
-        <w:t xml:space="preserve"> customers respond to discount level would test whether the assumption of a uniform discount responsiveness is itself responsible for the limited gains observed here. Third introducing a price-elasticity term that generates demand proportional to the discount level, independent of the regular demand level, would test if absence of new discount-attracted customers is responsible for the limited profit ceiling observed in this study. All three extensions can be implemented in the existing environment without modifying the Environment class, allowing to subsequently study the separate effects.</w:t>
+        <w:t>The strength of this study is the direct comparison method of an exact DP approach against model free approximated approaches, SARSA and Q-learning, while comparing this to a practical baseline (FDC) under identical environment assumptions, which isolated computation time as the deciding factor between DP and TD once their policy quality is shown to be statistically equivalent. The biggest weakness of this study was the single day discount restriction, the uniform LEFO response assumption and the extra demand mechanism, each of these constrains the profit and waste improvements achievable in any method and could have shown the real strengths of TD performance over the FDC. Another limitation was the manual hyperparameter tuning and the small amounts of seeds that was tested. A more exhaustive or automative search might have narrowed the gap between TD and DP.</w:t>
       </w:r>
     </w:p>
     <w:p>
@@ -7389,9 +8158,31 @@
           <w:szCs w:val="20"/>
         </w:rPr>
       </w:pPr>
+      <w:r>
+        <w:rPr>
+          <w:sz w:val="20"/>
+          <w:szCs w:val="20"/>
+        </w:rPr>
+        <w:t xml:space="preserve">Three extensions follow directly from the limitations above. First, extending the action space to two simultaneous discount levels. Second, introducing a sensitivity parameter governing what fraction </w:t>
+      </w:r>
+      <w:r>
+        <w:rPr>
+          <w:sz w:val="20"/>
+          <w:szCs w:val="20"/>
+        </w:rPr>
+        <w:t>LEFO</w:t>
+      </w:r>
+      <w:r>
+        <w:rPr>
+          <w:sz w:val="20"/>
+          <w:szCs w:val="20"/>
+        </w:rPr>
+        <w:t xml:space="preserve"> customers respond to discount level would test whether the assumption of a uniform discount responsiveness is itself responsible for the limited gains observed here. Third introducing a price-elasticity term that generates demand proportional to the discount level, independent of the regular demand level, would test if absence of new discount-attracted customers is responsible for the limited profit ceiling observed in this study. All three extensions can be implemented in the existing environment without modifying the Environment class, allowing to subsequently study the separate effects.</w:t>
+      </w:r>
     </w:p>
     <w:p>
       <w:pPr>
+        <w:spacing w:after="0"/>
         <w:ind w:firstLine="720"/>
         <w:jc w:val="both"/>
         <w:rPr>
@@ -7402,124 +8193,68 @@
     </w:p>
     <w:p>
       <w:pPr>
-        <w:pStyle w:val="Heading1"/>
-      </w:pPr>
-      <w:r>
-        <w:t>Conclusion</w:t>
-      </w:r>
+        <w:ind w:firstLine="720"/>
+        <w:jc w:val="both"/>
+        <w:rPr>
+          <w:sz w:val="20"/>
+          <w:szCs w:val="20"/>
+        </w:rPr>
+      </w:pPr>
     </w:p>
     <w:p>
       <w:pPr>
-        <w:rPr>
-          <w:sz w:val="20"/>
-          <w:szCs w:val="20"/>
-        </w:rPr>
-      </w:pPr>
-      <w:r>
-        <w:rPr>
-          <w:sz w:val="20"/>
-          <w:szCs w:val="20"/>
-        </w:rPr>
-        <w:t>To</w:t>
-      </w:r>
-      <w:r>
-        <w:rPr>
-          <w:sz w:val="20"/>
-          <w:szCs w:val="20"/>
-        </w:rPr>
-        <w:t xml:space="preserve"> answer the main </w:t>
-      </w:r>
-      <w:r>
-        <w:rPr>
-          <w:sz w:val="20"/>
-          <w:szCs w:val="20"/>
-        </w:rPr>
-        <w:t>research</w:t>
-      </w:r>
-      <w:r>
-        <w:rPr>
-          <w:sz w:val="20"/>
-          <w:szCs w:val="20"/>
-        </w:rPr>
-        <w:t xml:space="preserve"> </w:t>
-      </w:r>
-      <w:r>
-        <w:rPr>
-          <w:sz w:val="20"/>
-          <w:szCs w:val="20"/>
-        </w:rPr>
-        <w:t>question</w:t>
-      </w:r>
-      <w:r>
-        <w:rPr>
-          <w:sz w:val="20"/>
-          <w:szCs w:val="20"/>
-        </w:rPr>
-        <w:t>,</w:t>
-      </w:r>
-      <w:r>
-        <w:rPr>
-          <w:sz w:val="20"/>
-          <w:szCs w:val="20"/>
-        </w:rPr>
-        <w:t xml:space="preserve"> </w:t>
-      </w:r>
-      <w:r>
-        <w:rPr>
-          <w:sz w:val="20"/>
-          <w:szCs w:val="20"/>
-        </w:rPr>
-        <w:t>"What are the profit and waste benefits if expiratory products are dynamically priced, compared to a fixed discount?"</w:t>
-      </w:r>
-      <w:r>
-        <w:rPr>
-          <w:sz w:val="20"/>
-          <w:szCs w:val="20"/>
-        </w:rPr>
-        <w:t>, within the scope of this study, there are</w:t>
-      </w:r>
-      <w:r>
-        <w:rPr>
-          <w:sz w:val="20"/>
-          <w:szCs w:val="20"/>
-        </w:rPr>
-        <w:t xml:space="preserve"> n</w:t>
-      </w:r>
-      <w:r>
-        <w:rPr>
-          <w:sz w:val="20"/>
-          <w:szCs w:val="20"/>
-        </w:rPr>
-        <w:t>o</w:t>
-      </w:r>
-      <w:r>
-        <w:rPr>
-          <w:sz w:val="20"/>
-          <w:szCs w:val="20"/>
-        </w:rPr>
-        <w:t xml:space="preserve"> benefits in dynamically pricing products. Neither DP </w:t>
-      </w:r>
-      <w:r>
-        <w:rPr>
-          <w:sz w:val="20"/>
-          <w:szCs w:val="20"/>
-        </w:rPr>
-        <w:t>or TD produced statically practically meaningful improvements over FDC in profit or waste</w:t>
+        <w:pStyle w:val="Heading1"/>
+        <w:rPr>
+          <w:rFonts w:hint="eastAsia"/>
+        </w:rPr>
+      </w:pPr>
+      <w:r>
+        <w:lastRenderedPageBreak/>
+        <w:t>Conclusion</w:t>
       </w:r>
     </w:p>
     <w:p>
       <w:pPr>
-        <w:rPr>
-          <w:sz w:val="20"/>
-          <w:szCs w:val="20"/>
-        </w:rPr>
-      </w:pPr>
-      <w:r>
-        <w:rPr>
-          <w:sz w:val="20"/>
-          <w:szCs w:val="20"/>
-        </w:rPr>
-        <w:t>To answer the first sub question</w:t>
+        <w:jc w:val="both"/>
+        <w:rPr>
+          <w:sz w:val="20"/>
+          <w:szCs w:val="20"/>
+        </w:rPr>
+      </w:pPr>
+      <w:r>
+        <w:rPr>
+          <w:sz w:val="20"/>
+          <w:szCs w:val="20"/>
+        </w:rPr>
+        <w:t>To</w:t>
+      </w:r>
+      <w:r>
+        <w:rPr>
+          <w:sz w:val="20"/>
+          <w:szCs w:val="20"/>
+        </w:rPr>
+        <w:t xml:space="preserve"> answer the main </w:t>
+      </w:r>
+      <w:r>
+        <w:rPr>
+          <w:sz w:val="20"/>
+          <w:szCs w:val="20"/>
+        </w:rPr>
+        <w:t>research</w:t>
+      </w:r>
+      <w:r>
+        <w:rPr>
+          <w:sz w:val="20"/>
+          <w:szCs w:val="20"/>
+        </w:rPr>
+        <w:t xml:space="preserve"> </w:t>
+      </w:r>
+      <w:r>
+        <w:rPr>
+          <w:sz w:val="20"/>
+          <w:szCs w:val="20"/>
+        </w:rPr>
+        <w:t>question</w:t>
       </w:r>
       <w:r>
         <w:rPr>
@@ -7540,35 +8275,56 @@
           <w:sz w:val="20"/>
           <w:szCs w:val="20"/>
         </w:rPr>
-        <w:t>“</w:t>
-      </w:r>
-      <w:r>
-        <w:rPr>
-          <w:sz w:val="20"/>
-          <w:szCs w:val="20"/>
-        </w:rPr>
-        <w:t>Does any model produce a statistically and practically meaningful improvement in profit and waste reduction over FDC?</w:t>
-      </w:r>
-      <w:r>
-        <w:rPr>
-          <w:sz w:val="20"/>
-          <w:szCs w:val="20"/>
-        </w:rPr>
-        <w:t>”</w:t>
-      </w:r>
-      <w:r>
-        <w:rPr>
-          <w:sz w:val="20"/>
-          <w:szCs w:val="20"/>
-        </w:rPr>
-        <w:t xml:space="preserve"> DP showed no statistically </w:t>
-      </w:r>
-      <w:r>
-        <w:rPr>
-          <w:sz w:val="20"/>
-          <w:szCs w:val="20"/>
-        </w:rPr>
-        <w:t>significant improvement</w:t>
+        <w:t>"What are the profit and waste benefits if expiratory products are dynamically priced, compared to a fixed discount?"</w:t>
+      </w:r>
+      <w:r>
+        <w:rPr>
+          <w:sz w:val="20"/>
+          <w:szCs w:val="20"/>
+        </w:rPr>
+        <w:t>, within the scope of this study, there are</w:t>
+      </w:r>
+      <w:r>
+        <w:rPr>
+          <w:sz w:val="20"/>
+          <w:szCs w:val="20"/>
+        </w:rPr>
+        <w:t xml:space="preserve"> n</w:t>
+      </w:r>
+      <w:r>
+        <w:rPr>
+          <w:sz w:val="20"/>
+          <w:szCs w:val="20"/>
+        </w:rPr>
+        <w:t>o</w:t>
+      </w:r>
+      <w:r>
+        <w:rPr>
+          <w:sz w:val="20"/>
+          <w:szCs w:val="20"/>
+        </w:rPr>
+        <w:t xml:space="preserve"> benefits in dynamically pricing products. Neither DP </w:t>
+      </w:r>
+      <w:r>
+        <w:rPr>
+          <w:sz w:val="20"/>
+          <w:szCs w:val="20"/>
+        </w:rPr>
+        <w:t xml:space="preserve">or TD produced statical </w:t>
+      </w:r>
+      <w:r>
+        <w:rPr>
+          <w:sz w:val="20"/>
+          <w:szCs w:val="20"/>
+        </w:rPr>
+        <w:t xml:space="preserve">or </w:t>
+      </w:r>
+      <w:r>
+        <w:rPr>
+          <w:sz w:val="20"/>
+          <w:szCs w:val="20"/>
+        </w:rPr>
+        <w:t>practically</w:t>
       </w:r>
       <w:r>
         <w:rPr>
@@ -7582,36 +8338,86 @@
           <w:sz w:val="20"/>
           <w:szCs w:val="20"/>
         </w:rPr>
-        <w:t>over FDC on either matric</w:t>
-      </w:r>
-      <w:r>
-        <w:rPr>
-          <w:sz w:val="20"/>
-          <w:szCs w:val="20"/>
-        </w:rPr>
-        <w:t xml:space="preserve"> and TD performed significantly worse on profit, with its waste advantahe limited to small inventory state spaces</w:t>
-      </w:r>
-      <w:r>
-        <w:rPr>
-          <w:sz w:val="20"/>
-          <w:szCs w:val="20"/>
-        </w:rPr>
-        <w:t>.</w:t>
+        <w:t>meaningful improvements over FDC in profit or waste</w:t>
       </w:r>
     </w:p>
     <w:p>
       <w:pPr>
-        <w:rPr>
-          <w:sz w:val="20"/>
-          <w:szCs w:val="20"/>
-        </w:rPr>
-      </w:pPr>
-      <w:r>
-        <w:rPr>
-          <w:sz w:val="20"/>
-          <w:szCs w:val="20"/>
-        </w:rPr>
-        <w:t>To answer the second sub-question</w:t>
+        <w:jc w:val="both"/>
+        <w:rPr>
+          <w:sz w:val="20"/>
+          <w:szCs w:val="20"/>
+        </w:rPr>
+      </w:pPr>
+      <w:r>
+        <w:rPr>
+          <w:sz w:val="20"/>
+          <w:szCs w:val="20"/>
+        </w:rPr>
+        <w:t>To answer the first sub question</w:t>
+      </w:r>
+      <w:r>
+        <w:rPr>
+          <w:sz w:val="20"/>
+          <w:szCs w:val="20"/>
+        </w:rPr>
+        <w:t>,</w:t>
+      </w:r>
+      <w:r>
+        <w:rPr>
+          <w:sz w:val="20"/>
+          <w:szCs w:val="20"/>
+        </w:rPr>
+        <w:t xml:space="preserve"> </w:t>
+      </w:r>
+      <w:r>
+        <w:rPr>
+          <w:sz w:val="20"/>
+          <w:szCs w:val="20"/>
+        </w:rPr>
+        <w:t>“</w:t>
+      </w:r>
+      <w:r>
+        <w:rPr>
+          <w:sz w:val="20"/>
+          <w:szCs w:val="20"/>
+        </w:rPr>
+        <w:t>Does any model produce a statistically and practically meaningful improvement in profit and waste reduction over FDC?</w:t>
+      </w:r>
+      <w:r>
+        <w:rPr>
+          <w:sz w:val="20"/>
+          <w:szCs w:val="20"/>
+        </w:rPr>
+        <w:t>”</w:t>
+      </w:r>
+      <w:r>
+        <w:rPr>
+          <w:sz w:val="20"/>
+          <w:szCs w:val="20"/>
+        </w:rPr>
+        <w:t xml:space="preserve"> DP showed no statistically </w:t>
+      </w:r>
+      <w:r>
+        <w:rPr>
+          <w:sz w:val="20"/>
+          <w:szCs w:val="20"/>
+        </w:rPr>
+        <w:t>significant improvement</w:t>
+      </w:r>
+      <w:r>
+        <w:rPr>
+          <w:sz w:val="20"/>
+          <w:szCs w:val="20"/>
+        </w:rPr>
+        <w:t xml:space="preserve"> </w:t>
+      </w:r>
+      <w:r>
+        <w:rPr>
+          <w:sz w:val="20"/>
+          <w:szCs w:val="20"/>
+        </w:rPr>
+        <w:t>over FDC</w:t>
       </w:r>
       <w:r>
         <w:rPr>
@@ -7625,63 +8431,49 @@
           <w:sz w:val="20"/>
           <w:szCs w:val="20"/>
         </w:rPr>
-        <w:t>“</w:t>
-      </w:r>
-      <w:r>
-        <w:rPr>
-          <w:sz w:val="20"/>
-          <w:szCs w:val="20"/>
-        </w:rPr>
-        <w:t>Among models that derive comparable policies, which is preferable once computational time is taken into account</w:t>
-      </w:r>
-      <w:r>
-        <w:rPr>
-          <w:sz w:val="20"/>
-          <w:szCs w:val="20"/>
-        </w:rPr>
-        <w:t xml:space="preserve">?” </w:t>
-      </w:r>
-      <w:r>
-        <w:rPr>
-          <w:sz w:val="20"/>
-          <w:szCs w:val="20"/>
-        </w:rPr>
-        <w:t xml:space="preserve">While </w:t>
-      </w:r>
-      <w:r>
-        <w:rPr>
-          <w:sz w:val="20"/>
-          <w:szCs w:val="20"/>
-        </w:rPr>
-        <w:t xml:space="preserve">underperforming a little, TD </w:t>
-      </w:r>
-      <w:r>
-        <w:rPr>
-          <w:sz w:val="20"/>
-          <w:szCs w:val="20"/>
-        </w:rPr>
-        <w:t xml:space="preserve">proved to </w:t>
-      </w:r>
-      <w:r>
-        <w:rPr>
-          <w:sz w:val="20"/>
-          <w:szCs w:val="20"/>
-        </w:rPr>
-        <w:t>be</w:t>
-      </w:r>
-      <w:r>
-        <w:rPr>
-          <w:sz w:val="20"/>
-          <w:szCs w:val="20"/>
-        </w:rPr>
-        <w:t xml:space="preserve"> </w:t>
-      </w:r>
-      <w:r>
-        <w:rPr>
-          <w:sz w:val="20"/>
-          <w:szCs w:val="20"/>
-        </w:rPr>
-        <w:t>computationally more efficient</w:t>
+        <w:t xml:space="preserve">TD performed significantly worse on profit, with its waste </w:t>
+      </w:r>
+      <w:r>
+        <w:rPr>
+          <w:sz w:val="20"/>
+          <w:szCs w:val="20"/>
+        </w:rPr>
+        <w:t>advantage</w:t>
+      </w:r>
+      <w:r>
+        <w:rPr>
+          <w:sz w:val="20"/>
+          <w:szCs w:val="20"/>
+        </w:rPr>
+        <w:t xml:space="preserve"> reversing from</w:t>
+      </w:r>
+      <w:r>
+        <w:rPr>
+          <w:sz w:val="20"/>
+          <w:szCs w:val="20"/>
+        </w:rPr>
+        <w:t xml:space="preserve"> a significant advantage to a </w:t>
+      </w:r>
+      <w:r>
+        <w:rPr>
+          <w:sz w:val="20"/>
+          <w:szCs w:val="20"/>
+        </w:rPr>
+        <w:t xml:space="preserve">significant disadvantage at </w:t>
+      </w:r>
+      <w:r>
+        <w:rPr>
+          <w:sz w:val="20"/>
+          <w:szCs w:val="20"/>
+        </w:rPr>
+        <w:t xml:space="preserve">large state </w:t>
+      </w:r>
+      <w:r>
+        <w:rPr>
+          <w:sz w:val="20"/>
+          <w:szCs w:val="20"/>
+        </w:rPr>
+        <w:t>spaces</w:t>
       </w:r>
       <w:r>
         <w:rPr>
@@ -7693,10 +8485,123 @@
     </w:p>
     <w:p>
       <w:pPr>
-        <w:pStyle w:val="Heading1"/>
-      </w:pPr>
-      <w:r>
-        <w:t>Statement use of Artificial Intelligence</w:t>
+        <w:jc w:val="both"/>
+        <w:rPr>
+          <w:sz w:val="20"/>
+          <w:szCs w:val="20"/>
+        </w:rPr>
+      </w:pPr>
+      <w:r>
+        <w:rPr>
+          <w:sz w:val="20"/>
+          <w:szCs w:val="20"/>
+        </w:rPr>
+        <w:t>To answer the second sub-question</w:t>
+      </w:r>
+      <w:r>
+        <w:rPr>
+          <w:sz w:val="20"/>
+          <w:szCs w:val="20"/>
+        </w:rPr>
+        <w:t xml:space="preserve">, </w:t>
+      </w:r>
+      <w:r>
+        <w:rPr>
+          <w:sz w:val="20"/>
+          <w:szCs w:val="20"/>
+        </w:rPr>
+        <w:t>“</w:t>
+      </w:r>
+      <w:r>
+        <w:rPr>
+          <w:sz w:val="20"/>
+          <w:szCs w:val="20"/>
+        </w:rPr>
+        <w:t>Among models that derive comparable policies, which is preferable once computational time is taken into account</w:t>
+      </w:r>
+      <w:r>
+        <w:rPr>
+          <w:sz w:val="20"/>
+          <w:szCs w:val="20"/>
+        </w:rPr>
+        <w:t xml:space="preserve">?” </w:t>
+      </w:r>
+      <w:r>
+        <w:rPr>
+          <w:sz w:val="20"/>
+          <w:szCs w:val="20"/>
+        </w:rPr>
+        <w:t xml:space="preserve">While </w:t>
+      </w:r>
+      <w:r>
+        <w:rPr>
+          <w:sz w:val="20"/>
+          <w:szCs w:val="20"/>
+        </w:rPr>
+        <w:t xml:space="preserve">underperforming </w:t>
+      </w:r>
+      <w:r>
+        <w:rPr>
+          <w:sz w:val="20"/>
+          <w:szCs w:val="20"/>
+        </w:rPr>
+        <w:t>slightly</w:t>
+      </w:r>
+      <w:r>
+        <w:rPr>
+          <w:sz w:val="20"/>
+          <w:szCs w:val="20"/>
+        </w:rPr>
+        <w:t xml:space="preserve">, TD </w:t>
+      </w:r>
+      <w:r>
+        <w:rPr>
+          <w:sz w:val="20"/>
+          <w:szCs w:val="20"/>
+        </w:rPr>
+        <w:t xml:space="preserve">proved to </w:t>
+      </w:r>
+      <w:r>
+        <w:rPr>
+          <w:sz w:val="20"/>
+          <w:szCs w:val="20"/>
+        </w:rPr>
+        <w:t>be</w:t>
+      </w:r>
+      <w:r>
+        <w:rPr>
+          <w:sz w:val="20"/>
+          <w:szCs w:val="20"/>
+        </w:rPr>
+        <w:t xml:space="preserve"> </w:t>
+      </w:r>
+      <w:r>
+        <w:rPr>
+          <w:sz w:val="20"/>
+          <w:szCs w:val="20"/>
+        </w:rPr>
+        <w:t>computationally more efficient</w:t>
+      </w:r>
+      <w:r>
+        <w:rPr>
+          <w:sz w:val="20"/>
+          <w:szCs w:val="20"/>
+        </w:rPr>
+        <w:t>.</w:t>
+      </w:r>
+      <w:r>
+        <w:rPr>
+          <w:sz w:val="20"/>
+          <w:szCs w:val="20"/>
+        </w:rPr>
+        <w:t xml:space="preserve"> Making it a </w:t>
+      </w:r>
+      <w:r>
+        <w:rPr>
+          <w:sz w:val="20"/>
+          <w:szCs w:val="20"/>
+        </w:rPr>
+        <w:t>contender for more challenging environments</w:t>
       </w:r>
     </w:p>
     <w:p>
@@ -7704,12 +8609,58 @@
         <w:pStyle w:val="Heading1"/>
       </w:pPr>
       <w:r>
-        <w:t>Data Repository</w:t>
+        <w:t>Statement use of Artificial Intelligence</w:t>
       </w:r>
     </w:p>
     <w:p>
       <w:pPr>
+        <w:jc w:val="both"/>
+      </w:pPr>
+      <w:r>
+        <w:t>Artificial intelligence was used to optimize code, bug fixes</w:t>
+      </w:r>
+      <w:r>
+        <w:t xml:space="preserve"> and</w:t>
+      </w:r>
+      <w:r>
+        <w:t xml:space="preserve"> </w:t>
+      </w:r>
+      <w:r>
+        <w:t>improve text</w:t>
+      </w:r>
+      <w:r>
+        <w:t xml:space="preserve">. No </w:t>
+      </w:r>
+      <w:r>
+        <w:t xml:space="preserve">AI generated </w:t>
+      </w:r>
+      <w:r>
+        <w:t>content was pasted directly in this report.</w:t>
+      </w:r>
+      <w:r>
+        <w:t xml:space="preserve"> </w:t>
+      </w:r>
+      <w:r>
+        <w:t>All AI-assisted output was critically reviewed and checked against literature or gathered results.</w:t>
+      </w:r>
+    </w:p>
+    <w:p>
+      <w:pPr>
         <w:pStyle w:val="Heading1"/>
+        <w:rPr>
+          <w:rFonts w:hint="eastAsia"/>
+        </w:rPr>
+      </w:pPr>
+      <w:r>
+        <w:t>Data Repository</w:t>
+      </w:r>
+    </w:p>
+    <w:p>
+      <w:pPr>
+        <w:pStyle w:val="Heading1"/>
+        <w:rPr>
+          <w:rFonts w:hint="eastAsia"/>
+        </w:rPr>
       </w:pPr>
       <w:r>
         <w:t>References</w:t>
@@ -7728,7 +8679,7 @@
 
 <file path=word/comments.xml><?xml version="1.0" encoding="utf-8"?>
 <w:comments xmlns:wpc="http://schemas.microsoft.com/office/word/2010/wordprocessingCanvas" xmlns:cx="http://schemas.microsoft.com/office/drawing/2014/chartex" xmlns:cx1="http://schemas.microsoft.com/office/drawing/2015/9/8/chartex" xmlns:cx2="http://schemas.microsoft.com/office/drawing/2015/10/21/chartex" xmlns:cx3="http://schemas.microsoft.com/office/drawing/2016/5/9/chartex" xmlns:cx4="http://schemas.microsoft.com/office/drawing/2016/5/10/chartex" xmlns:cx5="http://schemas.microsoft.com/office/drawing/2016/5/11/chartex" xmlns:cx6="http://schemas.microsoft.com/office/drawing/2016/5/12/chartex" xmlns:cx7="http://schemas.microsoft.com/office/drawing/2016/5/13/chartex" xmlns:cx8="http://schemas.microsoft.com/office/drawing/2016/5/14/chartex" xmlns:mc="http://schemas.openxmlformats.org/markup-compatibility/2006" xmlns:aink="http://schemas.microsoft.com/office/drawing/2016/ink" xmlns:am3d="http://schemas.microsoft.com/office/drawing/2017/model3d" xmlns:o="urn:schemas-microsoft-com:office:office" xmlns:oel="http://schemas.microsoft.com/office/2019/extlst" xmlns:r="http://schemas.openxmlformats.org/officeDocument/2006/relationships" xmlns:m="http://schemas.openxmlformats.org/officeDocument/2006/math" xmlns:v="urn:schemas-microsoft-com:vml" xmlns:wp14="http://schemas.microsoft.com/office/word/2010/wordprocessingDrawing" xmlns:wp="http://schemas.openxmlformats.org/drawingml/2006/wordprocessingDrawing" xmlns:w10="urn:schemas-microsoft-com:office:word" xmlns:w="http://schemas.openxmlformats.org/wordprocessingml/2006/main" xmlns:w14="http://schemas.microsoft.com/office/word/2010/wordml" xmlns:w15="http://schemas.microsoft.com/office/word/2012/wordml" xmlns:w16cex="http://schemas.microsoft.com/office/word/2018/wordml/cex" xmlns:w16cid="http://schemas.microsoft.com/office/word/2016/wordml/cid" xmlns:w16="http://schemas.microsoft.com/office/word/2018/wordml" xmlns:w16du="http://schemas.microsoft.com/office/word/2023/wordml/word16du" xmlns:w16sdtdh="http://schemas.microsoft.com/office/word/2020/wordml/sdtdatahash" xmlns:w16sdtfl="http://schemas.microsoft.com/office/word/2024/wordml/sdtformatlock" xmlns:w16se="http://schemas.microsoft.com/office/word/2015/wordml/symex" xmlns:wpg="http://schemas.microsoft.com/office/word/2010/wordprocessingGroup" xmlns:wpi="http://schemas.microsoft.com/office/word/2010/wordprocessingInk" xmlns:wne="http://schemas.microsoft.com/office/word/2006/wordml" xmlns:wps="http://schemas.microsoft.com/office/word/2010/wordprocessingShape" mc:Ignorable="w14 w15 w16se w16cid w16 w16cex w16sdtdh w16sdtfl w16du wp14">
-  <w:comment w:id="0" w:author="Widdershoven, Jochem" w:date="2026-06-24T15:33:00Z" w:initials="JW">
+  <w:comment w:id="0" w:author="Widdershoven, Jochem" w:date="2026-06-25T11:24:00Z" w:initials="JW">
     <w:p>
       <w:pPr>
         <w:pStyle w:val="CommentText"/>
@@ -7740,7 +8691,71 @@
         <w:annotationRef/>
       </w:r>
       <w:r>
-        <w:t>Add machine</w:t>
+        <w:t>Niet het juiste woord denk ik</w:t>
+      </w:r>
+    </w:p>
+  </w:comment>
+  <w:comment w:id="1" w:author="Widdershoven, Jochem" w:date="2026-06-25T10:42:00Z" w:initials="JW">
+    <w:p>
+      <w:pPr>
+        <w:pStyle w:val="CommentText"/>
+      </w:pPr>
+      <w:r>
+        <w:rPr>
+          <w:rStyle w:val="CommentReference"/>
+        </w:rPr>
+        <w:annotationRef/>
+      </w:r>
+      <w:r>
+        <w:t>SOURCE</w:t>
+      </w:r>
+    </w:p>
+  </w:comment>
+  <w:comment w:id="2" w:author="Widdershoven, Jochem" w:date="2026-06-25T10:45:00Z" w:initials="JW">
+    <w:p>
+      <w:pPr>
+        <w:pStyle w:val="CommentText"/>
+      </w:pPr>
+      <w:r>
+        <w:rPr>
+          <w:rStyle w:val="CommentReference"/>
+        </w:rPr>
+        <w:annotationRef/>
+      </w:r>
+      <w:r>
+        <w:t>SOURCE</w:t>
+      </w:r>
+    </w:p>
+  </w:comment>
+  <w:comment w:id="3" w:author="Widdershoven, Jochem" w:date="2026-06-25T11:22:00Z" w:initials="JW">
+    <w:p>
+      <w:pPr>
+        <w:pStyle w:val="CommentText"/>
+      </w:pPr>
+      <w:r>
+        <w:rPr>
+          <w:rStyle w:val="CommentReference"/>
+        </w:rPr>
+        <w:annotationRef/>
+      </w:r>
+      <w:r>
+        <w:t>SOURCE</w:t>
+      </w:r>
+    </w:p>
+  </w:comment>
+  <w:comment w:id="4" w:author="Widdershoven, Jochem" w:date="2026-06-25T10:46:00Z" w:initials="JW">
+    <w:p>
+      <w:pPr>
+        <w:pStyle w:val="CommentText"/>
+      </w:pPr>
+      <w:r>
+        <w:rPr>
+          <w:rStyle w:val="CommentReference"/>
+        </w:rPr>
+        <w:annotationRef/>
+      </w:r>
+      <w:r>
+        <w:t>SOURCE</w:t>
       </w:r>
     </w:p>
   </w:comment>
@@ -7749,19 +8764,31 @@
 
 <file path=word/commentsExtended.xml><?xml version="1.0" encoding="utf-8"?>
 <w15:commentsEx xmlns:wpc="http://schemas.microsoft.com/office/word/2010/wordprocessingCanvas" xmlns:cx="http://schemas.microsoft.com/office/drawing/2014/chartex" xmlns:cx1="http://schemas.microsoft.com/office/drawing/2015/9/8/chartex" xmlns:cx2="http://schemas.microsoft.com/office/drawing/2015/10/21/chartex" xmlns:cx3="http://schemas.microsoft.com/office/drawing/2016/5/9/chartex" xmlns:cx4="http://schemas.microsoft.com/office/drawing/2016/5/10/chartex" xmlns:cx5="http://schemas.microsoft.com/office/drawing/2016/5/11/chartex" xmlns:cx6="http://schemas.microsoft.com/office/drawing/2016/5/12/chartex" xmlns:cx7="http://schemas.microsoft.com/office/drawing/2016/5/13/chartex" xmlns:cx8="http://schemas.microsoft.com/office/drawing/2016/5/14/chartex" xmlns:mc="http://schemas.openxmlformats.org/markup-compatibility/2006" xmlns:aink="http://schemas.microsoft.com/office/drawing/2016/ink" xmlns:am3d="http://schemas.microsoft.com/office/drawing/2017/model3d" xmlns:o="urn:schemas-microsoft-com:office:office" xmlns:oel="http://schemas.microsoft.com/office/2019/extlst" xmlns:r="http://schemas.openxmlformats.org/officeDocument/2006/relationships" xmlns:m="http://schemas.openxmlformats.org/officeDocument/2006/math" xmlns:v="urn:schemas-microsoft-com:vml" xmlns:wp14="http://schemas.microsoft.com/office/word/2010/wordprocessingDrawing" xmlns:wp="http://schemas.openxmlformats.org/drawingml/2006/wordprocessingDrawing" xmlns:w10="urn:schemas-microsoft-com:office:word" xmlns:w="http://schemas.openxmlformats.org/wordprocessingml/2006/main" xmlns:w14="http://schemas.microsoft.com/office/word/2010/wordml" xmlns:w15="http://schemas.microsoft.com/office/word/2012/wordml" xmlns:w16cex="http://schemas.microsoft.com/office/word/2018/wordml/cex" xmlns:w16cid="http://schemas.microsoft.com/office/word/2016/wordml/cid" xmlns:w16="http://schemas.microsoft.com/office/word/2018/wordml" xmlns:w16du="http://schemas.microsoft.com/office/word/2023/wordml/word16du" xmlns:w16sdtdh="http://schemas.microsoft.com/office/word/2020/wordml/sdtdatahash" xmlns:w16sdtfl="http://schemas.microsoft.com/office/word/2024/wordml/sdtformatlock" xmlns:w16se="http://schemas.microsoft.com/office/word/2015/wordml/symex" xmlns:wpg="http://schemas.microsoft.com/office/word/2010/wordprocessingGroup" xmlns:wpi="http://schemas.microsoft.com/office/word/2010/wordprocessingInk" xmlns:wne="http://schemas.microsoft.com/office/word/2006/wordml" xmlns:wps="http://schemas.microsoft.com/office/word/2010/wordprocessingShape" mc:Ignorable="w14 w15 w16se w16cid w16 w16cex w16sdtdh w16sdtfl w16du wp14">
-  <w15:commentEx w15:paraId="1F736A50" w15:done="0"/>
+  <w15:commentEx w15:paraId="11CA036A" w15:done="0"/>
+  <w15:commentEx w15:paraId="32CBDBE2" w15:done="0"/>
+  <w15:commentEx w15:paraId="11B1F1B7" w15:done="0"/>
+  <w15:commentEx w15:paraId="1C2B75D1" w15:done="0"/>
+  <w15:commentEx w15:paraId="7AC621E0" w15:done="0"/>
 </w15:commentsEx>
 </file>
 
 <file path=word/commentsExtensible.xml><?xml version="1.0" encoding="utf-8"?>
 <w16cex:commentsExtensible xmlns:wpc="http://schemas.microsoft.com/office/word/2010/wordprocessingCanvas" xmlns:cx="http://schemas.microsoft.com/office/drawing/2014/chartex" xmlns:cx1="http://schemas.microsoft.com/office/drawing/2015/9/8/chartex" xmlns:cx2="http://schemas.microsoft.com/office/drawing/2015/10/21/chartex" xmlns:cx3="http://schemas.microsoft.com/office/drawing/2016/5/9/chartex" xmlns:cx4="http://schemas.microsoft.com/office/drawing/2016/5/10/chartex" xmlns:cx5="http://schemas.microsoft.com/office/drawing/2016/5/11/chartex" xmlns:cx6="http://schemas.microsoft.com/office/drawing/2016/5/12/chartex" xmlns:cx7="http://schemas.microsoft.com/office/drawing/2016/5/13/chartex" xmlns:cx8="http://schemas.microsoft.com/office/drawing/2016/5/14/chartex" xmlns:cr="http://schemas.microsoft.com/office/comments/2020/reactions" xmlns:mc="http://schemas.openxmlformats.org/markup-compatibility/2006" xmlns:aink="http://schemas.microsoft.com/office/drawing/2016/ink" xmlns:am3d="http://schemas.microsoft.com/office/drawing/2017/model3d" xmlns:o="urn:schemas-microsoft-com:office:office" xmlns:oel="http://schemas.microsoft.com/office/2019/extlst" xmlns:r="http://schemas.openxmlformats.org/officeDocument/2006/relationships" xmlns:m="http://schemas.openxmlformats.org/officeDocument/2006/math" xmlns:v="urn:schemas-microsoft-com:vml" xmlns:wp14="http://schemas.microsoft.com/office/word/2010/wordprocessingDrawing" xmlns:wp="http://schemas.openxmlformats.org/drawingml/2006/wordprocessingDrawing" xmlns:w10="urn:schemas-microsoft-com:office:word" xmlns:w="http://schemas.openxmlformats.org/wordprocessingml/2006/main" xmlns:w14="http://schemas.microsoft.com/office/word/2010/wordml" xmlns:w15="http://schemas.microsoft.com/office/word/2012/wordml" xmlns:w16cex="http://schemas.microsoft.com/office/word/2018/wordml/cex" xmlns:w16cid="http://schemas.microsoft.com/office/word/2016/wordml/cid" xmlns:w16="http://schemas.microsoft.com/office/word/2018/wordml" xmlns:w16du="http://schemas.microsoft.com/office/word/2023/wordml/word16du" xmlns:w16sdtdh="http://schemas.microsoft.com/office/word/2020/wordml/sdtdatahash" xmlns:w16sdtfl="http://schemas.microsoft.com/office/word/2024/wordml/sdtformatlock" xmlns:w16se="http://schemas.microsoft.com/office/word/2015/wordml/symex" xmlns:wpg="http://schemas.microsoft.com/office/word/2010/wordprocessingGroup" xmlns:wpi="http://schemas.microsoft.com/office/word/2010/wordprocessingInk" xmlns:wne="http://schemas.microsoft.com/office/word/2006/wordml" xmlns:wps="http://schemas.microsoft.com/office/word/2010/wordprocessingShape" mc:Ignorable="w14 w15 w16se w16cid w16 w16cex w16sdtdh w16sdtfl cr w16du wp14">
-  <w16cex:commentExtensible w16cex:durableId="6CA7BEDA" w16cex:dateUtc="2026-06-24T13:33:00Z"/>
+  <w16cex:commentExtensible w16cex:durableId="22DF4850" w16cex:dateUtc="2026-06-25T09:24:00Z"/>
+  <w16cex:commentExtensible w16cex:durableId="3592D299" w16cex:dateUtc="2026-06-25T08:42:00Z"/>
+  <w16cex:commentExtensible w16cex:durableId="6CCDEF31" w16cex:dateUtc="2026-06-25T08:45:00Z"/>
+  <w16cex:commentExtensible w16cex:durableId="46E14130" w16cex:dateUtc="2026-06-25T09:22:00Z"/>
+  <w16cex:commentExtensible w16cex:durableId="614A9331" w16cex:dateUtc="2026-06-25T08:46:00Z"/>
 </w16cex:commentsExtensible>
 </file>
 
 <file path=word/commentsIds.xml><?xml version="1.0" encoding="utf-8"?>
 <w16cid:commentsIds xmlns:wpc="http://schemas.microsoft.com/office/word/2010/wordprocessingCanvas" xmlns:cx="http://schemas.microsoft.com/office/drawing/2014/chartex" xmlns:cx1="http://schemas.microsoft.com/office/drawing/2015/9/8/chartex" xmlns:cx2="http://schemas.microsoft.com/office/drawing/2015/10/21/chartex" xmlns:cx3="http://schemas.microsoft.com/office/drawing/2016/5/9/chartex" xmlns:cx4="http://schemas.microsoft.com/office/drawing/2016/5/10/chartex" xmlns:cx5="http://schemas.microsoft.com/office/drawing/2016/5/11/chartex" xmlns:cx6="http://schemas.microsoft.com/office/drawing/2016/5/12/chartex" xmlns:cx7="http://schemas.microsoft.com/office/drawing/2016/5/13/chartex" xmlns:cx8="http://schemas.microsoft.com/office/drawing/2016/5/14/chartex" xmlns:mc="http://schemas.openxmlformats.org/markup-compatibility/2006" xmlns:aink="http://schemas.microsoft.com/office/drawing/2016/ink" xmlns:am3d="http://schemas.microsoft.com/office/drawing/2017/model3d" xmlns:o="urn:schemas-microsoft-com:office:office" xmlns:oel="http://schemas.microsoft.com/office/2019/extlst" xmlns:r="http://schemas.openxmlformats.org/officeDocument/2006/relationships" xmlns:m="http://schemas.openxmlformats.org/officeDocument/2006/math" xmlns:v="urn:schemas-microsoft-com:vml" xmlns:wp14="http://schemas.microsoft.com/office/word/2010/wordprocessingDrawing" xmlns:wp="http://schemas.openxmlformats.org/drawingml/2006/wordprocessingDrawing" xmlns:w10="urn:schemas-microsoft-com:office:word" xmlns:w="http://schemas.openxmlformats.org/wordprocessingml/2006/main" xmlns:w14="http://schemas.microsoft.com/office/word/2010/wordml" xmlns:w15="http://schemas.microsoft.com/office/word/2012/wordml" xmlns:w16cex="http://schemas.microsoft.com/office/word/2018/wordml/cex" xmlns:w16cid="http://schemas.microsoft.com/office/word/2016/wordml/cid" xmlns:w16="http://schemas.microsoft.com/office/word/2018/wordml" xmlns:w16du="http://schemas.microsoft.com/office/word/2023/wordml/word16du" xmlns:w16sdtdh="http://schemas.microsoft.com/office/word/2020/wordml/sdtdatahash" xmlns:w16sdtfl="http://schemas.microsoft.com/office/word/2024/wordml/sdtformatlock" xmlns:w16se="http://schemas.microsoft.com/office/word/2015/wordml/symex" xmlns:wpg="http://schemas.microsoft.com/office/word/2010/wordprocessingGroup" xmlns:wpi="http://schemas.microsoft.com/office/word/2010/wordprocessingInk" xmlns:wne="http://schemas.microsoft.com/office/word/2006/wordml" xmlns:wps="http://schemas.microsoft.com/office/word/2010/wordprocessingShape" mc:Ignorable="w14 w15 w16se w16cid w16 w16cex w16sdtdh w16sdtfl w16du wp14">
-  <w16cid:commentId w16cid:paraId="1F736A50" w16cid:durableId="6CA7BEDA"/>
+  <w16cid:commentId w16cid:paraId="11CA036A" w16cid:durableId="22DF4850"/>
+  <w16cid:commentId w16cid:paraId="32CBDBE2" w16cid:durableId="3592D299"/>
+  <w16cid:commentId w16cid:paraId="11B1F1B7" w16cid:durableId="6CCDEF31"/>
+  <w16cid:commentId w16cid:paraId="1C2B75D1" w16cid:durableId="46E14130"/>
+  <w16cid:commentId w16cid:paraId="7AC621E0" w16cid:durableId="614A9331"/>
 </w16cid:commentsIds>
 </file>
 

</xml_diff>